<commit_message>
EHIS-3009 All ALR template changes
</commit_message>
<xml_diff>
--- a/ALR-DocgenTemplates/Application Fee Receipt Template.docx
+++ b/ALR-DocgenTemplates/Application Fee Receipt Template.docx
@@ -1,6 +1,6 @@
 
 <file path=word/document.xml><?xml version="1.0" encoding="utf-8"?>
-<w:document xmlns:wpc="http://schemas.microsoft.com/office/word/2010/wordprocessingCanvas" xmlns:cx="http://schemas.microsoft.com/office/drawing/2014/chartex" xmlns:cx1="http://schemas.microsoft.com/office/drawing/2015/9/8/chartex" xmlns:cx2="http://schemas.microsoft.com/office/drawing/2015/10/21/chartex" xmlns:cx3="http://schemas.microsoft.com/office/drawing/2016/5/9/chartex" xmlns:cx4="http://schemas.microsoft.com/office/drawing/2016/5/10/chartex" xmlns:cx5="http://schemas.microsoft.com/office/drawing/2016/5/11/chartex" xmlns:cx6="http://schemas.microsoft.com/office/drawing/2016/5/12/chartex" xmlns:cx7="http://schemas.microsoft.com/office/drawing/2016/5/13/chartex" xmlns:cx8="http://schemas.microsoft.com/office/drawing/2016/5/14/chartex" xmlns:mc="http://schemas.openxmlformats.org/markup-compatibility/2006" xmlns:aink="http://schemas.microsoft.com/office/drawing/2016/ink" xmlns:am3d="http://schemas.microsoft.com/office/drawing/2017/model3d" xmlns:o="urn:schemas-microsoft-com:office:office" xmlns:oel="http://schemas.microsoft.com/office/2019/extlst" xmlns:r="http://schemas.openxmlformats.org/officeDocument/2006/relationships" xmlns:m="http://schemas.openxmlformats.org/officeDocument/2006/math" xmlns:v="urn:schemas-microsoft-com:vml" xmlns:wp14="http://schemas.microsoft.com/office/word/2010/wordprocessingDrawing" xmlns:wp="http://schemas.openxmlformats.org/drawingml/2006/wordprocessingDrawing" xmlns:w10="urn:schemas-microsoft-com:office:word" xmlns:w="http://schemas.openxmlformats.org/wordprocessingml/2006/main" xmlns:w14="http://schemas.microsoft.com/office/word/2010/wordml" xmlns:w15="http://schemas.microsoft.com/office/word/2012/wordml" xmlns:w16cex="http://schemas.microsoft.com/office/word/2018/wordml/cex" xmlns:w16cid="http://schemas.microsoft.com/office/word/2016/wordml/cid" xmlns:w16="http://schemas.microsoft.com/office/word/2018/wordml" xmlns:w16sdtdh="http://schemas.microsoft.com/office/word/2020/wordml/sdtdatahash" xmlns:w16se="http://schemas.microsoft.com/office/word/2015/wordml/symex" xmlns:wpg="http://schemas.microsoft.com/office/word/2010/wordprocessingGroup" xmlns:wpi="http://schemas.microsoft.com/office/word/2010/wordprocessingInk" xmlns:wne="http://schemas.microsoft.com/office/word/2006/wordml" xmlns:wps="http://schemas.microsoft.com/office/word/2010/wordprocessingShape" mc:Ignorable="w14 w15 w16se w16cid w16 w16cex w16sdtdh wp14">
+<w:document xmlns:wpc="http://schemas.microsoft.com/office/word/2010/wordprocessingCanvas" xmlns:cx="http://schemas.microsoft.com/office/drawing/2014/chartex" xmlns:cx1="http://schemas.microsoft.com/office/drawing/2015/9/8/chartex" xmlns:cx2="http://schemas.microsoft.com/office/drawing/2015/10/21/chartex" xmlns:cx3="http://schemas.microsoft.com/office/drawing/2016/5/9/chartex" xmlns:cx4="http://schemas.microsoft.com/office/drawing/2016/5/10/chartex" xmlns:cx5="http://schemas.microsoft.com/office/drawing/2016/5/11/chartex" xmlns:cx6="http://schemas.microsoft.com/office/drawing/2016/5/12/chartex" xmlns:cx7="http://schemas.microsoft.com/office/drawing/2016/5/13/chartex" xmlns:cx8="http://schemas.microsoft.com/office/drawing/2016/5/14/chartex" xmlns:mc="http://schemas.openxmlformats.org/markup-compatibility/2006" xmlns:aink="http://schemas.microsoft.com/office/drawing/2016/ink" xmlns:am3d="http://schemas.microsoft.com/office/drawing/2017/model3d" xmlns:o="urn:schemas-microsoft-com:office:office" xmlns:oel="http://schemas.microsoft.com/office/2019/extlst" xmlns:r="http://schemas.openxmlformats.org/officeDocument/2006/relationships" xmlns:m="http://schemas.openxmlformats.org/officeDocument/2006/math" xmlns:v="urn:schemas-microsoft-com:vml" xmlns:wp14="http://schemas.microsoft.com/office/word/2010/wordprocessingDrawing" xmlns:wp="http://schemas.openxmlformats.org/drawingml/2006/wordprocessingDrawing" xmlns:w10="urn:schemas-microsoft-com:office:word" xmlns:w="http://schemas.openxmlformats.org/wordprocessingml/2006/main" xmlns:w14="http://schemas.microsoft.com/office/word/2010/wordml" xmlns:w15="http://schemas.microsoft.com/office/word/2012/wordml" xmlns:w16cex="http://schemas.microsoft.com/office/word/2018/wordml/cex" xmlns:w16cid="http://schemas.microsoft.com/office/word/2016/wordml/cid" xmlns:w16="http://schemas.microsoft.com/office/word/2018/wordml" xmlns:w16du="http://schemas.microsoft.com/office/word/2023/wordml/word16du" xmlns:w16sdtdh="http://schemas.microsoft.com/office/word/2020/wordml/sdtdatahash" xmlns:w16sdtfl="http://schemas.microsoft.com/office/word/2024/wordml/sdtformatlock" xmlns:w16se="http://schemas.microsoft.com/office/word/2015/wordml/symex" xmlns:wpg="http://schemas.microsoft.com/office/word/2010/wordprocessingGroup" xmlns:wpi="http://schemas.microsoft.com/office/word/2010/wordprocessingInk" xmlns:wne="http://schemas.microsoft.com/office/word/2006/wordml" xmlns:wps="http://schemas.microsoft.com/office/word/2010/wordprocessingShape" mc:Ignorable="w14 w15 w16se w16cid w16 w16cex w16sdtdh w16sdtfl w16du wp14">
   <w:body>
     <w:p>
       <w:pPr>
@@ -672,27 +672,16 @@
                 <w:sz w:val="22"/>
                 <w14:ligatures w14:val="none"/>
               </w:rPr>
-              <w:t>{/</w:t>
-            </w:r>
-            <w:proofErr w:type="spellStart"/>
+              <w:t>{/I</w:t>
+            </w:r>
             <w:r>
               <w:rPr>
                 <w:rStyle w:val="ui-provider"/>
                 <w:kern w:val="0"/>
-                <w:sz w:val="22"/>
-                <w14:ligatures w14:val="none"/>
-              </w:rPr>
-              <w:t>I</w:t>
-            </w:r>
-            <w:r>
-              <w:rPr>
-                <w:rStyle w:val="ui-provider"/>
-                <w:kern w:val="0"/>
                 <w14:ligatures w14:val="none"/>
               </w:rPr>
               <w:t>nvoiceItem</w:t>
             </w:r>
-            <w:proofErr w:type="spellEnd"/>
             <w:r>
               <w:rPr>
                 <w:rStyle w:val="ui-provider"/>
@@ -1039,6 +1028,7 @@
               <w:t xml:space="preserve">     </w:t>
             </w:r>
             <w:bookmarkStart w:id="3" w:name="OLE_LINK6"/>
+            <w:proofErr w:type="gramStart"/>
             <w:r>
               <w:rPr>
                 <w:b/>
@@ -1049,34 +1039,33 @@
               </w:rPr>
               <w:t xml:space="preserve">Registration: </w:t>
             </w:r>
-            <w:bookmarkStart w:id="4" w:name="OLE_LINK9"/>
-            <w:r>
-              <w:rPr>
-                <w:color w:val="000000" w:themeColor="text1"/>
-                <w:sz w:val="24"/>
-                <w:szCs w:val="24"/>
+            <w:r>
+              <w:rPr>
+                <w:color w:val="000000" w:themeColor="text1"/>
+                <w:sz w:val="19"/>
+                <w:szCs w:val="19"/>
               </w:rPr>
               <w:t>{{</w:t>
             </w:r>
             <w:proofErr w:type="spellStart"/>
-            <w:r>
-              <w:rPr>
-                <w:color w:val="000000" w:themeColor="text1"/>
-                <w:sz w:val="24"/>
-                <w:szCs w:val="24"/>
-              </w:rPr>
-              <w:t>CertificateId</w:t>
+            <w:proofErr w:type="gramEnd"/>
+            <w:r>
+              <w:rPr>
+                <w:color w:val="000000" w:themeColor="text1"/>
+                <w:sz w:val="19"/>
+                <w:szCs w:val="19"/>
+              </w:rPr>
+              <w:t>IF_isCertificateIdNotPresent</w:t>
             </w:r>
             <w:proofErr w:type="spellEnd"/>
             <w:r>
               <w:rPr>
                 <w:color w:val="000000" w:themeColor="text1"/>
-                <w:sz w:val="24"/>
-                <w:szCs w:val="24"/>
+                <w:sz w:val="19"/>
+                <w:szCs w:val="19"/>
               </w:rPr>
               <w:t>}}</w:t>
             </w:r>
-            <w:bookmarkEnd w:id="4"/>
           </w:p>
         </w:tc>
         <w:tc>
@@ -1136,7 +1125,7 @@
                 <w:sz w:val="22"/>
               </w:rPr>
             </w:pPr>
-            <w:bookmarkStart w:id="5" w:name="OLE_LINK14"/>
+            <w:bookmarkStart w:id="4" w:name="OLE_LINK14"/>
             <w:r>
               <w:rPr>
                 <w:color w:val="000000" w:themeColor="text1"/>
@@ -1169,7 +1158,7 @@
               </w:rPr>
               <w:t>}}</w:t>
             </w:r>
-            <w:bookmarkEnd w:id="5"/>
+            <w:bookmarkEnd w:id="4"/>
           </w:p>
         </w:tc>
       </w:tr>
@@ -1214,7 +1203,6 @@
               </w:rPr>
               <w:t>{{</w:t>
             </w:r>
-            <w:proofErr w:type="spellStart"/>
             <w:r>
               <w:rPr>
                 <w:kern w:val="0"/>
@@ -1230,18 +1218,7 @@
                 <w:szCs w:val="24"/>
                 <w14:ligatures w14:val="none"/>
               </w:rPr>
-              <w:t>nvoicePaymentDate</w:t>
-            </w:r>
-            <w:proofErr w:type="spellEnd"/>
-            <w:r>
-              <w:rPr>
-                <w:color w:val="000000" w:themeColor="text1"/>
-                <w:kern w:val="0"/>
-                <w:sz w:val="24"/>
-                <w:szCs w:val="24"/>
-                <w14:ligatures w14:val="none"/>
-              </w:rPr>
-              <w:t>}}</w:t>
+              <w:t>nvoicePaymentDate}}</w:t>
             </w:r>
           </w:p>
         </w:tc>
@@ -1512,7 +1489,7 @@
 </file>
 
 <file path=word/endnotes.xml><?xml version="1.0" encoding="utf-8"?>
-<w:endnotes xmlns:wpc="http://schemas.microsoft.com/office/word/2010/wordprocessingCanvas" xmlns:cx="http://schemas.microsoft.com/office/drawing/2014/chartex" xmlns:cx1="http://schemas.microsoft.com/office/drawing/2015/9/8/chartex" xmlns:cx2="http://schemas.microsoft.com/office/drawing/2015/10/21/chartex" xmlns:cx3="http://schemas.microsoft.com/office/drawing/2016/5/9/chartex" xmlns:cx4="http://schemas.microsoft.com/office/drawing/2016/5/10/chartex" xmlns:cx5="http://schemas.microsoft.com/office/drawing/2016/5/11/chartex" xmlns:cx6="http://schemas.microsoft.com/office/drawing/2016/5/12/chartex" xmlns:cx7="http://schemas.microsoft.com/office/drawing/2016/5/13/chartex" xmlns:cx8="http://schemas.microsoft.com/office/drawing/2016/5/14/chartex" xmlns:mc="http://schemas.openxmlformats.org/markup-compatibility/2006" xmlns:aink="http://schemas.microsoft.com/office/drawing/2016/ink" xmlns:am3d="http://schemas.microsoft.com/office/drawing/2017/model3d" xmlns:o="urn:schemas-microsoft-com:office:office" xmlns:oel="http://schemas.microsoft.com/office/2019/extlst" xmlns:r="http://schemas.openxmlformats.org/officeDocument/2006/relationships" xmlns:m="http://schemas.openxmlformats.org/officeDocument/2006/math" xmlns:v="urn:schemas-microsoft-com:vml" xmlns:wp14="http://schemas.microsoft.com/office/word/2010/wordprocessingDrawing" xmlns:wp="http://schemas.openxmlformats.org/drawingml/2006/wordprocessingDrawing" xmlns:w10="urn:schemas-microsoft-com:office:word" xmlns:w="http://schemas.openxmlformats.org/wordprocessingml/2006/main" xmlns:w14="http://schemas.microsoft.com/office/word/2010/wordml" xmlns:w15="http://schemas.microsoft.com/office/word/2012/wordml" xmlns:w16cex="http://schemas.microsoft.com/office/word/2018/wordml/cex" xmlns:w16cid="http://schemas.microsoft.com/office/word/2016/wordml/cid" xmlns:w16="http://schemas.microsoft.com/office/word/2018/wordml" xmlns:w16sdtdh="http://schemas.microsoft.com/office/word/2020/wordml/sdtdatahash" xmlns:w16se="http://schemas.microsoft.com/office/word/2015/wordml/symex" xmlns:wpg="http://schemas.microsoft.com/office/word/2010/wordprocessingGroup" xmlns:wpi="http://schemas.microsoft.com/office/word/2010/wordprocessingInk" xmlns:wne="http://schemas.microsoft.com/office/word/2006/wordml" xmlns:wps="http://schemas.microsoft.com/office/word/2010/wordprocessingShape" mc:Ignorable="w14 w15 w16se w16cid w16 w16cex w16sdtdh wp14">
+<w:endnotes xmlns:wpc="http://schemas.microsoft.com/office/word/2010/wordprocessingCanvas" xmlns:cx="http://schemas.microsoft.com/office/drawing/2014/chartex" xmlns:cx1="http://schemas.microsoft.com/office/drawing/2015/9/8/chartex" xmlns:cx2="http://schemas.microsoft.com/office/drawing/2015/10/21/chartex" xmlns:cx3="http://schemas.microsoft.com/office/drawing/2016/5/9/chartex" xmlns:cx4="http://schemas.microsoft.com/office/drawing/2016/5/10/chartex" xmlns:cx5="http://schemas.microsoft.com/office/drawing/2016/5/11/chartex" xmlns:cx6="http://schemas.microsoft.com/office/drawing/2016/5/12/chartex" xmlns:cx7="http://schemas.microsoft.com/office/drawing/2016/5/13/chartex" xmlns:cx8="http://schemas.microsoft.com/office/drawing/2016/5/14/chartex" xmlns:mc="http://schemas.openxmlformats.org/markup-compatibility/2006" xmlns:aink="http://schemas.microsoft.com/office/drawing/2016/ink" xmlns:am3d="http://schemas.microsoft.com/office/drawing/2017/model3d" xmlns:o="urn:schemas-microsoft-com:office:office" xmlns:oel="http://schemas.microsoft.com/office/2019/extlst" xmlns:r="http://schemas.openxmlformats.org/officeDocument/2006/relationships" xmlns:m="http://schemas.openxmlformats.org/officeDocument/2006/math" xmlns:v="urn:schemas-microsoft-com:vml" xmlns:wp14="http://schemas.microsoft.com/office/word/2010/wordprocessingDrawing" xmlns:wp="http://schemas.openxmlformats.org/drawingml/2006/wordprocessingDrawing" xmlns:w10="urn:schemas-microsoft-com:office:word" xmlns:w="http://schemas.openxmlformats.org/wordprocessingml/2006/main" xmlns:w14="http://schemas.microsoft.com/office/word/2010/wordml" xmlns:w15="http://schemas.microsoft.com/office/word/2012/wordml" xmlns:w16cex="http://schemas.microsoft.com/office/word/2018/wordml/cex" xmlns:w16cid="http://schemas.microsoft.com/office/word/2016/wordml/cid" xmlns:w16="http://schemas.microsoft.com/office/word/2018/wordml" xmlns:w16du="http://schemas.microsoft.com/office/word/2023/wordml/word16du" xmlns:w16sdtdh="http://schemas.microsoft.com/office/word/2020/wordml/sdtdatahash" xmlns:w16sdtfl="http://schemas.microsoft.com/office/word/2024/wordml/sdtformatlock" xmlns:w16se="http://schemas.microsoft.com/office/word/2015/wordml/symex" xmlns:wpg="http://schemas.microsoft.com/office/word/2010/wordprocessingGroup" xmlns:wpi="http://schemas.microsoft.com/office/word/2010/wordprocessingInk" xmlns:wne="http://schemas.microsoft.com/office/word/2006/wordml" xmlns:wps="http://schemas.microsoft.com/office/word/2010/wordprocessingShape" mc:Ignorable="w14 w15 w16se w16cid w16 w16cex w16sdtdh w16sdtfl w16du wp14">
   <w:endnote w:type="separator" w:id="-1">
     <w:p>
       <w:pPr>
@@ -1537,7 +1514,7 @@
 </file>
 
 <file path=word/footer1.xml><?xml version="1.0" encoding="utf-8"?>
-<w:ftr xmlns:wpc="http://schemas.microsoft.com/office/word/2010/wordprocessingCanvas" xmlns:cx="http://schemas.microsoft.com/office/drawing/2014/chartex" xmlns:cx1="http://schemas.microsoft.com/office/drawing/2015/9/8/chartex" xmlns:cx2="http://schemas.microsoft.com/office/drawing/2015/10/21/chartex" xmlns:cx3="http://schemas.microsoft.com/office/drawing/2016/5/9/chartex" xmlns:cx4="http://schemas.microsoft.com/office/drawing/2016/5/10/chartex" xmlns:cx5="http://schemas.microsoft.com/office/drawing/2016/5/11/chartex" xmlns:cx6="http://schemas.microsoft.com/office/drawing/2016/5/12/chartex" xmlns:cx7="http://schemas.microsoft.com/office/drawing/2016/5/13/chartex" xmlns:cx8="http://schemas.microsoft.com/office/drawing/2016/5/14/chartex" xmlns:mc="http://schemas.openxmlformats.org/markup-compatibility/2006" xmlns:aink="http://schemas.microsoft.com/office/drawing/2016/ink" xmlns:am3d="http://schemas.microsoft.com/office/drawing/2017/model3d" xmlns:o="urn:schemas-microsoft-com:office:office" xmlns:oel="http://schemas.microsoft.com/office/2019/extlst" xmlns:r="http://schemas.openxmlformats.org/officeDocument/2006/relationships" xmlns:m="http://schemas.openxmlformats.org/officeDocument/2006/math" xmlns:v="urn:schemas-microsoft-com:vml" xmlns:wp14="http://schemas.microsoft.com/office/word/2010/wordprocessingDrawing" xmlns:wp="http://schemas.openxmlformats.org/drawingml/2006/wordprocessingDrawing" xmlns:w10="urn:schemas-microsoft-com:office:word" xmlns:w="http://schemas.openxmlformats.org/wordprocessingml/2006/main" xmlns:w14="http://schemas.microsoft.com/office/word/2010/wordml" xmlns:w15="http://schemas.microsoft.com/office/word/2012/wordml" xmlns:w16cex="http://schemas.microsoft.com/office/word/2018/wordml/cex" xmlns:w16cid="http://schemas.microsoft.com/office/word/2016/wordml/cid" xmlns:w16="http://schemas.microsoft.com/office/word/2018/wordml" xmlns:w16sdtdh="http://schemas.microsoft.com/office/word/2020/wordml/sdtdatahash" xmlns:w16se="http://schemas.microsoft.com/office/word/2015/wordml/symex" xmlns:wpg="http://schemas.microsoft.com/office/word/2010/wordprocessingGroup" xmlns:wpi="http://schemas.microsoft.com/office/word/2010/wordprocessingInk" xmlns:wne="http://schemas.microsoft.com/office/word/2006/wordml" xmlns:wps="http://schemas.microsoft.com/office/word/2010/wordprocessingShape" mc:Ignorable="w14 w15 w16se w16cid w16 w16cex w16sdtdh wp14">
+<w:ftr xmlns:wpc="http://schemas.microsoft.com/office/word/2010/wordprocessingCanvas" xmlns:cx="http://schemas.microsoft.com/office/drawing/2014/chartex" xmlns:cx1="http://schemas.microsoft.com/office/drawing/2015/9/8/chartex" xmlns:cx2="http://schemas.microsoft.com/office/drawing/2015/10/21/chartex" xmlns:cx3="http://schemas.microsoft.com/office/drawing/2016/5/9/chartex" xmlns:cx4="http://schemas.microsoft.com/office/drawing/2016/5/10/chartex" xmlns:cx5="http://schemas.microsoft.com/office/drawing/2016/5/11/chartex" xmlns:cx6="http://schemas.microsoft.com/office/drawing/2016/5/12/chartex" xmlns:cx7="http://schemas.microsoft.com/office/drawing/2016/5/13/chartex" xmlns:cx8="http://schemas.microsoft.com/office/drawing/2016/5/14/chartex" xmlns:mc="http://schemas.openxmlformats.org/markup-compatibility/2006" xmlns:aink="http://schemas.microsoft.com/office/drawing/2016/ink" xmlns:am3d="http://schemas.microsoft.com/office/drawing/2017/model3d" xmlns:o="urn:schemas-microsoft-com:office:office" xmlns:oel="http://schemas.microsoft.com/office/2019/extlst" xmlns:r="http://schemas.openxmlformats.org/officeDocument/2006/relationships" xmlns:m="http://schemas.openxmlformats.org/officeDocument/2006/math" xmlns:v="urn:schemas-microsoft-com:vml" xmlns:wp14="http://schemas.microsoft.com/office/word/2010/wordprocessingDrawing" xmlns:wp="http://schemas.openxmlformats.org/drawingml/2006/wordprocessingDrawing" xmlns:w10="urn:schemas-microsoft-com:office:word" xmlns:w="http://schemas.openxmlformats.org/wordprocessingml/2006/main" xmlns:w14="http://schemas.microsoft.com/office/word/2010/wordml" xmlns:w15="http://schemas.microsoft.com/office/word/2012/wordml" xmlns:w16cex="http://schemas.microsoft.com/office/word/2018/wordml/cex" xmlns:w16cid="http://schemas.microsoft.com/office/word/2016/wordml/cid" xmlns:w16="http://schemas.microsoft.com/office/word/2018/wordml" xmlns:w16du="http://schemas.microsoft.com/office/word/2023/wordml/word16du" xmlns:w16sdtdh="http://schemas.microsoft.com/office/word/2020/wordml/sdtdatahash" xmlns:w16sdtfl="http://schemas.microsoft.com/office/word/2024/wordml/sdtformatlock" xmlns:w16se="http://schemas.microsoft.com/office/word/2015/wordml/symex" xmlns:wpg="http://schemas.microsoft.com/office/word/2010/wordprocessingGroup" xmlns:wpi="http://schemas.microsoft.com/office/word/2010/wordprocessingInk" xmlns:wne="http://schemas.microsoft.com/office/word/2006/wordml" xmlns:wps="http://schemas.microsoft.com/office/word/2010/wordprocessingShape" mc:Ignorable="w14 w15 w16se w16cid w16 w16cex w16sdtdh w16sdtfl w16du wp14">
   <w:p>
     <w:pPr>
       <w:jc w:val="right"/>
@@ -1649,7 +1626,7 @@
 </file>
 
 <file path=word/footnotes.xml><?xml version="1.0" encoding="utf-8"?>
-<w:footnotes xmlns:wpc="http://schemas.microsoft.com/office/word/2010/wordprocessingCanvas" xmlns:cx="http://schemas.microsoft.com/office/drawing/2014/chartex" xmlns:cx1="http://schemas.microsoft.com/office/drawing/2015/9/8/chartex" xmlns:cx2="http://schemas.microsoft.com/office/drawing/2015/10/21/chartex" xmlns:cx3="http://schemas.microsoft.com/office/drawing/2016/5/9/chartex" xmlns:cx4="http://schemas.microsoft.com/office/drawing/2016/5/10/chartex" xmlns:cx5="http://schemas.microsoft.com/office/drawing/2016/5/11/chartex" xmlns:cx6="http://schemas.microsoft.com/office/drawing/2016/5/12/chartex" xmlns:cx7="http://schemas.microsoft.com/office/drawing/2016/5/13/chartex" xmlns:cx8="http://schemas.microsoft.com/office/drawing/2016/5/14/chartex" xmlns:mc="http://schemas.openxmlformats.org/markup-compatibility/2006" xmlns:aink="http://schemas.microsoft.com/office/drawing/2016/ink" xmlns:am3d="http://schemas.microsoft.com/office/drawing/2017/model3d" xmlns:o="urn:schemas-microsoft-com:office:office" xmlns:oel="http://schemas.microsoft.com/office/2019/extlst" xmlns:r="http://schemas.openxmlformats.org/officeDocument/2006/relationships" xmlns:m="http://schemas.openxmlformats.org/officeDocument/2006/math" xmlns:v="urn:schemas-microsoft-com:vml" xmlns:wp14="http://schemas.microsoft.com/office/word/2010/wordprocessingDrawing" xmlns:wp="http://schemas.openxmlformats.org/drawingml/2006/wordprocessingDrawing" xmlns:w10="urn:schemas-microsoft-com:office:word" xmlns:w="http://schemas.openxmlformats.org/wordprocessingml/2006/main" xmlns:w14="http://schemas.microsoft.com/office/word/2010/wordml" xmlns:w15="http://schemas.microsoft.com/office/word/2012/wordml" xmlns:w16cex="http://schemas.microsoft.com/office/word/2018/wordml/cex" xmlns:w16cid="http://schemas.microsoft.com/office/word/2016/wordml/cid" xmlns:w16="http://schemas.microsoft.com/office/word/2018/wordml" xmlns:w16sdtdh="http://schemas.microsoft.com/office/word/2020/wordml/sdtdatahash" xmlns:w16se="http://schemas.microsoft.com/office/word/2015/wordml/symex" xmlns:wpg="http://schemas.microsoft.com/office/word/2010/wordprocessingGroup" xmlns:wpi="http://schemas.microsoft.com/office/word/2010/wordprocessingInk" xmlns:wne="http://schemas.microsoft.com/office/word/2006/wordml" xmlns:wps="http://schemas.microsoft.com/office/word/2010/wordprocessingShape" mc:Ignorable="w14 w15 w16se w16cid w16 w16cex w16sdtdh wp14">
+<w:footnotes xmlns:wpc="http://schemas.microsoft.com/office/word/2010/wordprocessingCanvas" xmlns:cx="http://schemas.microsoft.com/office/drawing/2014/chartex" xmlns:cx1="http://schemas.microsoft.com/office/drawing/2015/9/8/chartex" xmlns:cx2="http://schemas.microsoft.com/office/drawing/2015/10/21/chartex" xmlns:cx3="http://schemas.microsoft.com/office/drawing/2016/5/9/chartex" xmlns:cx4="http://schemas.microsoft.com/office/drawing/2016/5/10/chartex" xmlns:cx5="http://schemas.microsoft.com/office/drawing/2016/5/11/chartex" xmlns:cx6="http://schemas.microsoft.com/office/drawing/2016/5/12/chartex" xmlns:cx7="http://schemas.microsoft.com/office/drawing/2016/5/13/chartex" xmlns:cx8="http://schemas.microsoft.com/office/drawing/2016/5/14/chartex" xmlns:mc="http://schemas.openxmlformats.org/markup-compatibility/2006" xmlns:aink="http://schemas.microsoft.com/office/drawing/2016/ink" xmlns:am3d="http://schemas.microsoft.com/office/drawing/2017/model3d" xmlns:o="urn:schemas-microsoft-com:office:office" xmlns:oel="http://schemas.microsoft.com/office/2019/extlst" xmlns:r="http://schemas.openxmlformats.org/officeDocument/2006/relationships" xmlns:m="http://schemas.openxmlformats.org/officeDocument/2006/math" xmlns:v="urn:schemas-microsoft-com:vml" xmlns:wp14="http://schemas.microsoft.com/office/word/2010/wordprocessingDrawing" xmlns:wp="http://schemas.openxmlformats.org/drawingml/2006/wordprocessingDrawing" xmlns:w10="urn:schemas-microsoft-com:office:word" xmlns:w="http://schemas.openxmlformats.org/wordprocessingml/2006/main" xmlns:w14="http://schemas.microsoft.com/office/word/2010/wordml" xmlns:w15="http://schemas.microsoft.com/office/word/2012/wordml" xmlns:w16cex="http://schemas.microsoft.com/office/word/2018/wordml/cex" xmlns:w16cid="http://schemas.microsoft.com/office/word/2016/wordml/cid" xmlns:w16="http://schemas.microsoft.com/office/word/2018/wordml" xmlns:w16du="http://schemas.microsoft.com/office/word/2023/wordml/word16du" xmlns:w16sdtdh="http://schemas.microsoft.com/office/word/2020/wordml/sdtdatahash" xmlns:w16sdtfl="http://schemas.microsoft.com/office/word/2024/wordml/sdtformatlock" xmlns:w16se="http://schemas.microsoft.com/office/word/2015/wordml/symex" xmlns:wpg="http://schemas.microsoft.com/office/word/2010/wordprocessingGroup" xmlns:wpi="http://schemas.microsoft.com/office/word/2010/wordprocessingInk" xmlns:wne="http://schemas.microsoft.com/office/word/2006/wordml" xmlns:wps="http://schemas.microsoft.com/office/word/2010/wordprocessingShape" mc:Ignorable="w14 w15 w16se w16cid w16 w16cex w16sdtdh w16sdtfl w16du wp14">
   <w:footnote w:type="separator" w:id="-1">
     <w:p>
       <w:pPr>
@@ -1674,7 +1651,7 @@
 </file>
 
 <file path=word/header1.xml><?xml version="1.0" encoding="utf-8"?>
-<w:hdr xmlns:wpc="http://schemas.microsoft.com/office/word/2010/wordprocessingCanvas" xmlns:cx="http://schemas.microsoft.com/office/drawing/2014/chartex" xmlns:cx1="http://schemas.microsoft.com/office/drawing/2015/9/8/chartex" xmlns:cx2="http://schemas.microsoft.com/office/drawing/2015/10/21/chartex" xmlns:cx3="http://schemas.microsoft.com/office/drawing/2016/5/9/chartex" xmlns:cx4="http://schemas.microsoft.com/office/drawing/2016/5/10/chartex" xmlns:cx5="http://schemas.microsoft.com/office/drawing/2016/5/11/chartex" xmlns:cx6="http://schemas.microsoft.com/office/drawing/2016/5/12/chartex" xmlns:cx7="http://schemas.microsoft.com/office/drawing/2016/5/13/chartex" xmlns:cx8="http://schemas.microsoft.com/office/drawing/2016/5/14/chartex" xmlns:mc="http://schemas.openxmlformats.org/markup-compatibility/2006" xmlns:aink="http://schemas.microsoft.com/office/drawing/2016/ink" xmlns:am3d="http://schemas.microsoft.com/office/drawing/2017/model3d" xmlns:o="urn:schemas-microsoft-com:office:office" xmlns:oel="http://schemas.microsoft.com/office/2019/extlst" xmlns:r="http://schemas.openxmlformats.org/officeDocument/2006/relationships" xmlns:m="http://schemas.openxmlformats.org/officeDocument/2006/math" xmlns:v="urn:schemas-microsoft-com:vml" xmlns:wp14="http://schemas.microsoft.com/office/word/2010/wordprocessingDrawing" xmlns:wp="http://schemas.openxmlformats.org/drawingml/2006/wordprocessingDrawing" xmlns:w10="urn:schemas-microsoft-com:office:word" xmlns:w="http://schemas.openxmlformats.org/wordprocessingml/2006/main" xmlns:w14="http://schemas.microsoft.com/office/word/2010/wordml" xmlns:w15="http://schemas.microsoft.com/office/word/2012/wordml" xmlns:w16cex="http://schemas.microsoft.com/office/word/2018/wordml/cex" xmlns:w16cid="http://schemas.microsoft.com/office/word/2016/wordml/cid" xmlns:w16="http://schemas.microsoft.com/office/word/2018/wordml" xmlns:w16sdtdh="http://schemas.microsoft.com/office/word/2020/wordml/sdtdatahash" xmlns:w16se="http://schemas.microsoft.com/office/word/2015/wordml/symex" xmlns:wpg="http://schemas.microsoft.com/office/word/2010/wordprocessingGroup" xmlns:wpi="http://schemas.microsoft.com/office/word/2010/wordprocessingInk" xmlns:wne="http://schemas.microsoft.com/office/word/2006/wordml" xmlns:wps="http://schemas.microsoft.com/office/word/2010/wordprocessingShape" mc:Ignorable="w14 w15 w16se w16cid w16 w16cex w16sdtdh wp14">
+<w:hdr xmlns:wpc="http://schemas.microsoft.com/office/word/2010/wordprocessingCanvas" xmlns:cx="http://schemas.microsoft.com/office/drawing/2014/chartex" xmlns:cx1="http://schemas.microsoft.com/office/drawing/2015/9/8/chartex" xmlns:cx2="http://schemas.microsoft.com/office/drawing/2015/10/21/chartex" xmlns:cx3="http://schemas.microsoft.com/office/drawing/2016/5/9/chartex" xmlns:cx4="http://schemas.microsoft.com/office/drawing/2016/5/10/chartex" xmlns:cx5="http://schemas.microsoft.com/office/drawing/2016/5/11/chartex" xmlns:cx6="http://schemas.microsoft.com/office/drawing/2016/5/12/chartex" xmlns:cx7="http://schemas.microsoft.com/office/drawing/2016/5/13/chartex" xmlns:cx8="http://schemas.microsoft.com/office/drawing/2016/5/14/chartex" xmlns:mc="http://schemas.openxmlformats.org/markup-compatibility/2006" xmlns:aink="http://schemas.microsoft.com/office/drawing/2016/ink" xmlns:am3d="http://schemas.microsoft.com/office/drawing/2017/model3d" xmlns:o="urn:schemas-microsoft-com:office:office" xmlns:oel="http://schemas.microsoft.com/office/2019/extlst" xmlns:r="http://schemas.openxmlformats.org/officeDocument/2006/relationships" xmlns:m="http://schemas.openxmlformats.org/officeDocument/2006/math" xmlns:v="urn:schemas-microsoft-com:vml" xmlns:wp14="http://schemas.microsoft.com/office/word/2010/wordprocessingDrawing" xmlns:wp="http://schemas.openxmlformats.org/drawingml/2006/wordprocessingDrawing" xmlns:w10="urn:schemas-microsoft-com:office:word" xmlns:w="http://schemas.openxmlformats.org/wordprocessingml/2006/main" xmlns:w14="http://schemas.microsoft.com/office/word/2010/wordml" xmlns:w15="http://schemas.microsoft.com/office/word/2012/wordml" xmlns:w16cex="http://schemas.microsoft.com/office/word/2018/wordml/cex" xmlns:w16cid="http://schemas.microsoft.com/office/word/2016/wordml/cid" xmlns:w16="http://schemas.microsoft.com/office/word/2018/wordml" xmlns:w16du="http://schemas.microsoft.com/office/word/2023/wordml/word16du" xmlns:w16sdtdh="http://schemas.microsoft.com/office/word/2020/wordml/sdtdatahash" xmlns:w16sdtfl="http://schemas.microsoft.com/office/word/2024/wordml/sdtformatlock" xmlns:w16se="http://schemas.microsoft.com/office/word/2015/wordml/symex" xmlns:wpg="http://schemas.microsoft.com/office/word/2010/wordprocessingGroup" xmlns:wpi="http://schemas.microsoft.com/office/word/2010/wordprocessingInk" xmlns:wne="http://schemas.microsoft.com/office/word/2006/wordml" xmlns:wps="http://schemas.microsoft.com/office/word/2010/wordprocessingShape" mc:Ignorable="w14 w15 w16se w16cid w16 w16cex w16sdtdh w16sdtfl w16du wp14">
   <w:p>
     <w:pPr>
       <w:rPr>
@@ -2039,7 +2016,7 @@
 </file>
 
 <file path=word/styles.xml><?xml version="1.0" encoding="utf-8"?>
-<w:styles xmlns:mc="http://schemas.openxmlformats.org/markup-compatibility/2006" xmlns:r="http://schemas.openxmlformats.org/officeDocument/2006/relationships" xmlns:w="http://schemas.openxmlformats.org/wordprocessingml/2006/main" xmlns:w14="http://schemas.microsoft.com/office/word/2010/wordml" xmlns:w15="http://schemas.microsoft.com/office/word/2012/wordml" xmlns:w16cex="http://schemas.microsoft.com/office/word/2018/wordml/cex" xmlns:w16cid="http://schemas.microsoft.com/office/word/2016/wordml/cid" xmlns:w16="http://schemas.microsoft.com/office/word/2018/wordml" xmlns:w16sdtdh="http://schemas.microsoft.com/office/word/2020/wordml/sdtdatahash" xmlns:w16se="http://schemas.microsoft.com/office/word/2015/wordml/symex" mc:Ignorable="w14 w15 w16se w16cid w16 w16cex w16sdtdh">
+<w:styles xmlns:mc="http://schemas.openxmlformats.org/markup-compatibility/2006" xmlns:r="http://schemas.openxmlformats.org/officeDocument/2006/relationships" xmlns:w="http://schemas.openxmlformats.org/wordprocessingml/2006/main" xmlns:w14="http://schemas.microsoft.com/office/word/2010/wordml" xmlns:w15="http://schemas.microsoft.com/office/word/2012/wordml" xmlns:w16cex="http://schemas.microsoft.com/office/word/2018/wordml/cex" xmlns:w16cid="http://schemas.microsoft.com/office/word/2016/wordml/cid" xmlns:w16="http://schemas.microsoft.com/office/word/2018/wordml" xmlns:w16du="http://schemas.microsoft.com/office/word/2023/wordml/word16du" xmlns:w16sdtdh="http://schemas.microsoft.com/office/word/2020/wordml/sdtdatahash" xmlns:w16sdtfl="http://schemas.microsoft.com/office/word/2024/wordml/sdtformatlock" xmlns:w16se="http://schemas.microsoft.com/office/word/2015/wordml/symex" mc:Ignorable="w14 w15 w16se w16cid w16 w16cex w16sdtdh w16sdtfl w16du">
   <w:docDefaults>
     <w:rPrDefault>
       <w:rPr>

</xml_diff>

<commit_message>
back promotion PRs 2163, 2215, 2240, 2229, 2233, 2249, 2274, 2294
</commit_message>
<xml_diff>
--- a/ALR-DocgenTemplates/Application Fee Receipt Template.docx
+++ b/ALR-DocgenTemplates/Application Fee Receipt Template.docx
@@ -12,8 +12,12 @@
           <w:szCs w:val="34"/>
         </w:rPr>
         <w:sectPr>
-          <w:headerReference w:type="default" r:id="rId6"/>
-          <w:footerReference w:type="default" r:id="rId7"/>
+          <w:headerReference w:type="even" r:id="rId6"/>
+          <w:headerReference w:type="default" r:id="rId7"/>
+          <w:footerReference w:type="even" r:id="rId8"/>
+          <w:footerReference w:type="default" r:id="rId9"/>
+          <w:headerReference w:type="first" r:id="rId10"/>
+          <w:footerReference w:type="first" r:id="rId11"/>
           <w:pgSz w:w="12240" w:h="15840"/>
           <w:pgMar w:top="720" w:right="720" w:bottom="720" w:left="720" w:header="708" w:footer="708" w:gutter="0"/>
           <w:cols w:space="708"/>
@@ -132,29 +136,7 @@
                 <w:szCs w:val="24"/>
                 <w14:ligatures w14:val="none"/>
               </w:rPr>
-              <w:t>{{</w:t>
-            </w:r>
-            <w:proofErr w:type="spellStart"/>
-            <w:r>
-              <w:rPr>
-                <w:color w:val="000000" w:themeColor="text1"/>
-                <w:kern w:val="0"/>
-                <w:sz w:val="24"/>
-                <w:szCs w:val="24"/>
-                <w14:ligatures w14:val="none"/>
-              </w:rPr>
-              <w:t>RegistrantName</w:t>
-            </w:r>
-            <w:proofErr w:type="spellEnd"/>
-            <w:r>
-              <w:rPr>
-                <w:color w:val="000000" w:themeColor="text1"/>
-                <w:kern w:val="0"/>
-                <w:sz w:val="24"/>
-                <w:szCs w:val="24"/>
-                <w14:ligatures w14:val="none"/>
-              </w:rPr>
-              <w:t>}}</w:t>
+              <w:t>{{RegistrantName}}</w:t>
             </w:r>
           </w:p>
         </w:tc>
@@ -179,29 +161,7 @@
                 <w:szCs w:val="24"/>
                 <w14:ligatures w14:val="none"/>
               </w:rPr>
-              <w:t>{{</w:t>
-            </w:r>
-            <w:proofErr w:type="spellStart"/>
-            <w:r>
-              <w:rPr>
-                <w:color w:val="000000" w:themeColor="text1"/>
-                <w:kern w:val="0"/>
-                <w:sz w:val="24"/>
-                <w:szCs w:val="24"/>
-                <w14:ligatures w14:val="none"/>
-              </w:rPr>
-              <w:t>ResidenceName</w:t>
-            </w:r>
-            <w:proofErr w:type="spellEnd"/>
-            <w:r>
-              <w:rPr>
-                <w:color w:val="000000" w:themeColor="text1"/>
-                <w:kern w:val="0"/>
-                <w:sz w:val="24"/>
-                <w:szCs w:val="24"/>
-                <w14:ligatures w14:val="none"/>
-              </w:rPr>
-              <w:t>}}</w:t>
+              <w:t>{{ResidenceName}}</w:t>
             </w:r>
           </w:p>
         </w:tc>
@@ -231,29 +191,7 @@
                 <w:szCs w:val="24"/>
                 <w14:ligatures w14:val="none"/>
               </w:rPr>
-              <w:t>{{</w:t>
-            </w:r>
-            <w:proofErr w:type="spellStart"/>
-            <w:r>
-              <w:rPr>
-                <w:color w:val="000000" w:themeColor="text1"/>
-                <w:kern w:val="0"/>
-                <w:sz w:val="24"/>
-                <w:szCs w:val="24"/>
-                <w14:ligatures w14:val="none"/>
-              </w:rPr>
-              <w:t>RegistrantAddress</w:t>
-            </w:r>
-            <w:proofErr w:type="spellEnd"/>
-            <w:r>
-              <w:rPr>
-                <w:color w:val="000000" w:themeColor="text1"/>
-                <w:kern w:val="0"/>
-                <w:sz w:val="24"/>
-                <w:szCs w:val="24"/>
-                <w14:ligatures w14:val="none"/>
-              </w:rPr>
-              <w:t>}}</w:t>
+              <w:t>{{RegistrantAddress}}</w:t>
             </w:r>
           </w:p>
         </w:tc>
@@ -356,25 +294,7 @@
                 <w:sz w:val="24"/>
                 <w:szCs w:val="24"/>
               </w:rPr>
-              <w:t>{{</w:t>
-            </w:r>
-            <w:proofErr w:type="spellStart"/>
-            <w:r>
-              <w:rPr>
-                <w:color w:val="000000" w:themeColor="text1"/>
-                <w:sz w:val="24"/>
-                <w:szCs w:val="24"/>
-              </w:rPr>
-              <w:t>ResidenceAddress</w:t>
-            </w:r>
-            <w:proofErr w:type="spellEnd"/>
-            <w:r>
-              <w:rPr>
-                <w:color w:val="000000" w:themeColor="text1"/>
-                <w:sz w:val="24"/>
-                <w:szCs w:val="24"/>
-              </w:rPr>
-              <w:t>}}</w:t>
+              <w:t>{{ResidenceAddress}}</w:t>
             </w:r>
             <w:bookmarkEnd w:id="1"/>
           </w:p>
@@ -537,25 +457,7 @@
                 <w:sz w:val="22"/>
                 <w14:ligatures w14:val="none"/>
               </w:rPr>
-              <w:t>{{#InvoiceItem</w:t>
-            </w:r>
-            <w:proofErr w:type="gramStart"/>
-            <w:r>
-              <w:rPr>
-                <w:kern w:val="0"/>
-                <w:sz w:val="22"/>
-                <w14:ligatures w14:val="none"/>
-              </w:rPr>
-              <w:t>}}{</w:t>
-            </w:r>
-            <w:proofErr w:type="gramEnd"/>
-            <w:r>
-              <w:rPr>
-                <w:kern w:val="0"/>
-                <w:sz w:val="22"/>
-                <w14:ligatures w14:val="none"/>
-              </w:rPr>
-              <w:t>{Name}}</w:t>
+              <w:t>{{#InvoiceItem}}{{Name}}</w:t>
             </w:r>
           </w:p>
         </w:tc>
@@ -652,27 +554,7 @@
                 <w:sz w:val="22"/>
                 <w14:ligatures w14:val="none"/>
               </w:rPr>
-              <w:t>{{Fees</w:t>
-            </w:r>
-            <w:proofErr w:type="gramStart"/>
-            <w:r>
-              <w:rPr>
-                <w:rStyle w:val="ui-provider"/>
-                <w:kern w:val="0"/>
-                <w:sz w:val="22"/>
-                <w14:ligatures w14:val="none"/>
-              </w:rPr>
-              <w:t>}}{</w:t>
-            </w:r>
-            <w:proofErr w:type="gramEnd"/>
-            <w:r>
-              <w:rPr>
-                <w:rStyle w:val="ui-provider"/>
-                <w:kern w:val="0"/>
-                <w:sz w:val="22"/>
-                <w14:ligatures w14:val="none"/>
-              </w:rPr>
-              <w:t>{/I</w:t>
+              <w:t>{{Fees}}{{/I</w:t>
             </w:r>
             <w:r>
               <w:rPr>
@@ -1028,7 +910,6 @@
               <w:t xml:space="preserve">     </w:t>
             </w:r>
             <w:bookmarkStart w:id="3" w:name="OLE_LINK6"/>
-            <w:proofErr w:type="gramStart"/>
             <w:r>
               <w:rPr>
                 <w:b/>
@@ -1039,33 +920,16 @@
               </w:rPr>
               <w:t xml:space="preserve">Registration: </w:t>
             </w:r>
+            <w:bookmarkStart w:id="4" w:name="OLE_LINK9"/>
             <w:r>
               <w:rPr>
                 <w:color w:val="000000" w:themeColor="text1"/>
-                <w:sz w:val="19"/>
-                <w:szCs w:val="19"/>
-              </w:rPr>
-              <w:t>{{</w:t>
-            </w:r>
-            <w:proofErr w:type="spellStart"/>
-            <w:proofErr w:type="gramEnd"/>
-            <w:r>
-              <w:rPr>
-                <w:color w:val="000000" w:themeColor="text1"/>
-                <w:sz w:val="19"/>
-                <w:szCs w:val="19"/>
-              </w:rPr>
-              <w:t>IF_isCertificateIdNotPresent</w:t>
-            </w:r>
-            <w:proofErr w:type="spellEnd"/>
-            <w:r>
-              <w:rPr>
-                <w:color w:val="000000" w:themeColor="text1"/>
-                <w:sz w:val="19"/>
-                <w:szCs w:val="19"/>
-              </w:rPr>
-              <w:t>}}</w:t>
-            </w:r>
+                <w:sz w:val="24"/>
+                <w:szCs w:val="24"/>
+              </w:rPr>
+              <w:t>{{CertificateId}}</w:t>
+            </w:r>
+            <w:bookmarkEnd w:id="4"/>
           </w:p>
         </w:tc>
         <w:tc>
@@ -1125,7 +989,7 @@
                 <w:sz w:val="22"/>
               </w:rPr>
             </w:pPr>
-            <w:bookmarkStart w:id="4" w:name="OLE_LINK14"/>
+            <w:bookmarkStart w:id="5" w:name="OLE_LINK14"/>
             <w:r>
               <w:rPr>
                 <w:color w:val="000000" w:themeColor="text1"/>
@@ -1134,31 +998,9 @@
                 <w:szCs w:val="24"/>
                 <w14:ligatures w14:val="none"/>
               </w:rPr>
-              <w:t>{{</w:t>
-            </w:r>
-            <w:proofErr w:type="spellStart"/>
-            <w:r>
-              <w:rPr>
-                <w:color w:val="000000" w:themeColor="text1"/>
-                <w:kern w:val="0"/>
-                <w:sz w:val="24"/>
-                <w:szCs w:val="24"/>
-                <w14:ligatures w14:val="none"/>
-              </w:rPr>
-              <w:t>TotalFeeAmount</w:t>
-            </w:r>
-            <w:proofErr w:type="spellEnd"/>
-            <w:r>
-              <w:rPr>
-                <w:color w:val="000000" w:themeColor="text1"/>
-                <w:kern w:val="0"/>
-                <w:sz w:val="24"/>
-                <w:szCs w:val="24"/>
-                <w14:ligatures w14:val="none"/>
-              </w:rPr>
-              <w:t>}}</w:t>
-            </w:r>
-            <w:bookmarkEnd w:id="4"/>
+              <w:t>{{TotalFeeAmount}}</w:t>
+            </w:r>
+            <w:bookmarkEnd w:id="5"/>
           </w:p>
         </w:tc>
       </w:tr>
@@ -1320,29 +1162,7 @@
                 <w:szCs w:val="24"/>
                 <w14:ligatures w14:val="none"/>
               </w:rPr>
-              <w:t>{{</w:t>
-            </w:r>
-            <w:proofErr w:type="spellStart"/>
-            <w:r>
-              <w:rPr>
-                <w:color w:val="000000" w:themeColor="text1"/>
-                <w:kern w:val="0"/>
-                <w:sz w:val="24"/>
-                <w:szCs w:val="24"/>
-                <w14:ligatures w14:val="none"/>
-              </w:rPr>
-              <w:t>TotalFeeAmount</w:t>
-            </w:r>
-            <w:proofErr w:type="spellEnd"/>
-            <w:r>
-              <w:rPr>
-                <w:color w:val="000000" w:themeColor="text1"/>
-                <w:kern w:val="0"/>
-                <w:sz w:val="24"/>
-                <w:szCs w:val="24"/>
-                <w14:ligatures w14:val="none"/>
-              </w:rPr>
-              <w:t>}}</w:t>
+              <w:t>{{TotalFeeAmount}}</w:t>
             </w:r>
           </w:p>
         </w:tc>
@@ -1517,6 +1337,143 @@
 <w:ftr xmlns:wpc="http://schemas.microsoft.com/office/word/2010/wordprocessingCanvas" xmlns:cx="http://schemas.microsoft.com/office/drawing/2014/chartex" xmlns:cx1="http://schemas.microsoft.com/office/drawing/2015/9/8/chartex" xmlns:cx2="http://schemas.microsoft.com/office/drawing/2015/10/21/chartex" xmlns:cx3="http://schemas.microsoft.com/office/drawing/2016/5/9/chartex" xmlns:cx4="http://schemas.microsoft.com/office/drawing/2016/5/10/chartex" xmlns:cx5="http://schemas.microsoft.com/office/drawing/2016/5/11/chartex" xmlns:cx6="http://schemas.microsoft.com/office/drawing/2016/5/12/chartex" xmlns:cx7="http://schemas.microsoft.com/office/drawing/2016/5/13/chartex" xmlns:cx8="http://schemas.microsoft.com/office/drawing/2016/5/14/chartex" xmlns:mc="http://schemas.openxmlformats.org/markup-compatibility/2006" xmlns:aink="http://schemas.microsoft.com/office/drawing/2016/ink" xmlns:am3d="http://schemas.microsoft.com/office/drawing/2017/model3d" xmlns:o="urn:schemas-microsoft-com:office:office" xmlns:oel="http://schemas.microsoft.com/office/2019/extlst" xmlns:r="http://schemas.openxmlformats.org/officeDocument/2006/relationships" xmlns:m="http://schemas.openxmlformats.org/officeDocument/2006/math" xmlns:v="urn:schemas-microsoft-com:vml" xmlns:wp14="http://schemas.microsoft.com/office/word/2010/wordprocessingDrawing" xmlns:wp="http://schemas.openxmlformats.org/drawingml/2006/wordprocessingDrawing" xmlns:w10="urn:schemas-microsoft-com:office:word" xmlns:w="http://schemas.openxmlformats.org/wordprocessingml/2006/main" xmlns:w14="http://schemas.microsoft.com/office/word/2010/wordml" xmlns:w15="http://schemas.microsoft.com/office/word/2012/wordml" xmlns:w16cex="http://schemas.microsoft.com/office/word/2018/wordml/cex" xmlns:w16cid="http://schemas.microsoft.com/office/word/2016/wordml/cid" xmlns:w16="http://schemas.microsoft.com/office/word/2018/wordml" xmlns:w16du="http://schemas.microsoft.com/office/word/2023/wordml/word16du" xmlns:w16sdtdh="http://schemas.microsoft.com/office/word/2020/wordml/sdtdatahash" xmlns:w16sdtfl="http://schemas.microsoft.com/office/word/2024/wordml/sdtformatlock" xmlns:w16se="http://schemas.microsoft.com/office/word/2015/wordml/symex" xmlns:wpg="http://schemas.microsoft.com/office/word/2010/wordprocessingGroup" xmlns:wpi="http://schemas.microsoft.com/office/word/2010/wordprocessingInk" xmlns:wne="http://schemas.microsoft.com/office/word/2006/wordml" xmlns:wps="http://schemas.microsoft.com/office/word/2010/wordprocessingShape" mc:Ignorable="w14 w15 w16se w16cid w16 w16cex w16sdtdh w16sdtfl w16du wp14">
   <w:p>
     <w:pPr>
+      <w:pStyle w:val="Footer"/>
+    </w:pPr>
+    <w:r>
+      <w:rPr>
+        <w:noProof/>
+      </w:rPr>
+      <mc:AlternateContent>
+        <mc:Choice Requires="wps">
+          <w:drawing>
+            <wp:anchor distT="0" distB="0" distL="0" distR="0" simplePos="0" relativeHeight="251661312" behindDoc="0" locked="0" layoutInCell="1" allowOverlap="1" wp14:anchorId="7C0F6340" wp14:editId="36776CBA">
+              <wp:simplePos x="635" y="635"/>
+              <wp:positionH relativeFrom="page">
+                <wp:align>center</wp:align>
+              </wp:positionH>
+              <wp:positionV relativeFrom="page">
+                <wp:align>bottom</wp:align>
+              </wp:positionV>
+              <wp:extent cx="603885" cy="664845"/>
+              <wp:effectExtent l="0" t="0" r="5715" b="0"/>
+              <wp:wrapNone/>
+              <wp:docPr id="322540754" name="Text Box 5" descr="Confidential">
+                <a:extLst xmlns:a="http://schemas.openxmlformats.org/drawingml/2006/main">
+                  <a:ext uri="{5AE41FA2-C0FF-4470-9BD4-5FADCA87CBE2}">
+                    <aclsh:classification xmlns:aclsh="http://schemas.microsoft.com/office/drawing/2020/classificationShape" classificationOutcomeType="ftr"/>
+                  </a:ext>
+                </a:extLst>
+              </wp:docPr>
+              <wp:cNvGraphicFramePr/>
+              <a:graphic xmlns:a="http://schemas.openxmlformats.org/drawingml/2006/main">
+                <a:graphicData uri="http://schemas.microsoft.com/office/word/2010/wordprocessingShape">
+                  <wps:wsp>
+                    <wps:cNvSpPr txBox="1"/>
+                    <wps:spPr>
+                      <a:xfrm>
+                        <a:off x="0" y="0"/>
+                        <a:ext cx="603885" cy="664845"/>
+                      </a:xfrm>
+                      <a:prstGeom prst="rect">
+                        <a:avLst/>
+                      </a:prstGeom>
+                      <a:noFill/>
+                      <a:ln>
+                        <a:noFill/>
+                      </a:ln>
+                    </wps:spPr>
+                    <wps:txbx>
+                      <w:txbxContent>
+                        <w:p>
+                          <w:pPr>
+                            <w:spacing w:after="0"/>
+                            <w:rPr>
+                              <w:rFonts w:ascii="Arial" w:eastAsia="Arial" w:hAnsi="Arial" w:cs="Arial"/>
+                              <w:noProof/>
+                              <w:color w:val="000000"/>
+                              <w:sz w:val="18"/>
+                              <w:szCs w:val="18"/>
+                            </w:rPr>
+                          </w:pPr>
+                          <w:r>
+                            <w:rPr>
+                              <w:rFonts w:ascii="Arial" w:eastAsia="Arial" w:hAnsi="Arial" w:cs="Arial"/>
+                              <w:noProof/>
+                              <w:color w:val="000000"/>
+                              <w:sz w:val="18"/>
+                              <w:szCs w:val="18"/>
+                            </w:rPr>
+                            <w:t>Confidential</w:t>
+                          </w:r>
+                        </w:p>
+                      </w:txbxContent>
+                    </wps:txbx>
+                    <wps:bodyPr rot="0" spcFirstLastPara="0" vertOverflow="overflow" horzOverflow="overflow" vert="horz" wrap="none" lIns="0" tIns="0" rIns="0" bIns="355600" numCol="1" spcCol="0" rtlCol="0" fromWordArt="0" anchor="b" anchorCtr="0" forceAA="0" compatLnSpc="1">
+                      <a:prstTxWarp prst="textNoShape">
+                        <a:avLst/>
+                      </a:prstTxWarp>
+                      <a:spAutoFit/>
+                    </wps:bodyPr>
+                  </wps:wsp>
+                </a:graphicData>
+              </a:graphic>
+              <wp14:sizeRelH relativeFrom="margin">
+                <wp14:pctWidth>0</wp14:pctWidth>
+              </wp14:sizeRelH>
+              <wp14:sizeRelV relativeFrom="margin">
+                <wp14:pctHeight>0</wp14:pctHeight>
+              </wp14:sizeRelV>
+            </wp:anchor>
+          </w:drawing>
+        </mc:Choice>
+        <mc:Fallback>
+          <w:pict>
+            <v:shapetype w14:anchorId="7C0F6340" id="_x0000_t202" coordsize="21600,21600" o:spt="202" path="m,l,21600r21600,l21600,xe">
+              <v:stroke joinstyle="miter"/>
+              <v:path gradientshapeok="t" o:connecttype="rect"/>
+            </v:shapetype>
+            <v:shape id="Text Box 5" o:spid="_x0000_s1026" type="#_x0000_t202" alt="Confidential" style="position:absolute;margin-left:0;margin-top:0;width:47.55pt;height:52.35pt;z-index:251661312;visibility:visible;mso-wrap-style:none;mso-width-percent:0;mso-height-percent:0;mso-wrap-distance-left:0;mso-wrap-distance-top:0;mso-wrap-distance-right:0;mso-wrap-distance-bottom:0;mso-position-horizontal:center;mso-position-horizontal-relative:page;mso-position-vertical:bottom;mso-position-vertical-relative:page;mso-width-percent:0;mso-height-percent:0;mso-width-relative:margin;mso-height-relative:margin;v-text-anchor:bottom" o:gfxdata="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" filled="f" stroked="f">
+              <v:fill o:detectmouseclick="t"/>
+              <v:textbox style="mso-fit-shape-to-text:t" inset="0,0,0,28pt">
+                <w:txbxContent>
+                  <w:p>
+                    <w:pPr>
+                      <w:spacing w:after="0"/>
+                      <w:rPr>
+                        <w:rFonts w:ascii="Arial" w:eastAsia="Arial" w:hAnsi="Arial" w:cs="Arial"/>
+                        <w:noProof/>
+                        <w:color w:val="000000"/>
+                        <w:sz w:val="18"/>
+                        <w:szCs w:val="18"/>
+                      </w:rPr>
+                    </w:pPr>
+                    <w:r>
+                      <w:rPr>
+                        <w:rFonts w:ascii="Arial" w:eastAsia="Arial" w:hAnsi="Arial" w:cs="Arial"/>
+                        <w:noProof/>
+                        <w:color w:val="000000"/>
+                        <w:sz w:val="18"/>
+                        <w:szCs w:val="18"/>
+                      </w:rPr>
+                      <w:t>Confidential</w:t>
+                    </w:r>
+                  </w:p>
+                </w:txbxContent>
+              </v:textbox>
+              <w10:wrap anchorx="page" anchory="page"/>
+            </v:shape>
+          </w:pict>
+        </mc:Fallback>
+      </mc:AlternateContent>
+    </w:r>
+  </w:p>
+</w:ftr>
+</file>
+
+<file path=word/footer2.xml><?xml version="1.0" encoding="utf-8"?>
+<w:ftr xmlns:wpc="http://schemas.microsoft.com/office/word/2010/wordprocessingCanvas" xmlns:cx="http://schemas.microsoft.com/office/drawing/2014/chartex" xmlns:cx1="http://schemas.microsoft.com/office/drawing/2015/9/8/chartex" xmlns:cx2="http://schemas.microsoft.com/office/drawing/2015/10/21/chartex" xmlns:cx3="http://schemas.microsoft.com/office/drawing/2016/5/9/chartex" xmlns:cx4="http://schemas.microsoft.com/office/drawing/2016/5/10/chartex" xmlns:cx5="http://schemas.microsoft.com/office/drawing/2016/5/11/chartex" xmlns:cx6="http://schemas.microsoft.com/office/drawing/2016/5/12/chartex" xmlns:cx7="http://schemas.microsoft.com/office/drawing/2016/5/13/chartex" xmlns:cx8="http://schemas.microsoft.com/office/drawing/2016/5/14/chartex" xmlns:mc="http://schemas.openxmlformats.org/markup-compatibility/2006" xmlns:aink="http://schemas.microsoft.com/office/drawing/2016/ink" xmlns:am3d="http://schemas.microsoft.com/office/drawing/2017/model3d" xmlns:o="urn:schemas-microsoft-com:office:office" xmlns:oel="http://schemas.microsoft.com/office/2019/extlst" xmlns:r="http://schemas.openxmlformats.org/officeDocument/2006/relationships" xmlns:m="http://schemas.openxmlformats.org/officeDocument/2006/math" xmlns:v="urn:schemas-microsoft-com:vml" xmlns:wp14="http://schemas.microsoft.com/office/word/2010/wordprocessingDrawing" xmlns:wp="http://schemas.openxmlformats.org/drawingml/2006/wordprocessingDrawing" xmlns:w10="urn:schemas-microsoft-com:office:word" xmlns:w="http://schemas.openxmlformats.org/wordprocessingml/2006/main" xmlns:w14="http://schemas.microsoft.com/office/word/2010/wordml" xmlns:w15="http://schemas.microsoft.com/office/word/2012/wordml" xmlns:w16cex="http://schemas.microsoft.com/office/word/2018/wordml/cex" xmlns:w16cid="http://schemas.microsoft.com/office/word/2016/wordml/cid" xmlns:w16="http://schemas.microsoft.com/office/word/2018/wordml" xmlns:w16du="http://schemas.microsoft.com/office/word/2023/wordml/word16du" xmlns:w16sdtdh="http://schemas.microsoft.com/office/word/2020/wordml/sdtdatahash" xmlns:w16sdtfl="http://schemas.microsoft.com/office/word/2024/wordml/sdtformatlock" xmlns:w16se="http://schemas.microsoft.com/office/word/2015/wordml/symex" xmlns:wpg="http://schemas.microsoft.com/office/word/2010/wordprocessingGroup" xmlns:wpi="http://schemas.microsoft.com/office/word/2010/wordprocessingInk" xmlns:wne="http://schemas.microsoft.com/office/word/2006/wordml" xmlns:wps="http://schemas.microsoft.com/office/word/2010/wordprocessingShape" mc:Ignorable="w14 w15 w16se w16cid w16 w16cex w16sdtdh w16sdtfl w16du wp14">
+  <w:p>
+    <w:pPr>
       <w:jc w:val="right"/>
       <w:rPr>
         <w:noProof/>
@@ -1524,6 +1481,138 @@
         <w:szCs w:val="18"/>
       </w:rPr>
     </w:pPr>
+    <w:r>
+      <w:rPr>
+        <w:b/>
+        <w:bCs/>
+        <w:i/>
+        <w:iCs/>
+        <w:noProof/>
+        <w:sz w:val="22"/>
+      </w:rPr>
+      <mc:AlternateContent>
+        <mc:Choice Requires="wps">
+          <w:drawing>
+            <wp:anchor distT="0" distB="0" distL="0" distR="0" simplePos="0" relativeHeight="251662336" behindDoc="0" locked="0" layoutInCell="1" allowOverlap="1" wp14:anchorId="715368EE" wp14:editId="78567F17">
+              <wp:simplePos x="457200" y="8572500"/>
+              <wp:positionH relativeFrom="page">
+                <wp:align>center</wp:align>
+              </wp:positionH>
+              <wp:positionV relativeFrom="page">
+                <wp:align>bottom</wp:align>
+              </wp:positionV>
+              <wp:extent cx="603885" cy="664845"/>
+              <wp:effectExtent l="0" t="0" r="5715" b="0"/>
+              <wp:wrapNone/>
+              <wp:docPr id="929451806" name="Text Box 6" descr="Confidential">
+                <a:extLst xmlns:a="http://schemas.openxmlformats.org/drawingml/2006/main">
+                  <a:ext uri="{5AE41FA2-C0FF-4470-9BD4-5FADCA87CBE2}">
+                    <aclsh:classification xmlns:aclsh="http://schemas.microsoft.com/office/drawing/2020/classificationShape" classificationOutcomeType="ftr"/>
+                  </a:ext>
+                </a:extLst>
+              </wp:docPr>
+              <wp:cNvGraphicFramePr/>
+              <a:graphic xmlns:a="http://schemas.openxmlformats.org/drawingml/2006/main">
+                <a:graphicData uri="http://schemas.microsoft.com/office/word/2010/wordprocessingShape">
+                  <wps:wsp>
+                    <wps:cNvSpPr txBox="1"/>
+                    <wps:spPr>
+                      <a:xfrm>
+                        <a:off x="0" y="0"/>
+                        <a:ext cx="603885" cy="664845"/>
+                      </a:xfrm>
+                      <a:prstGeom prst="rect">
+                        <a:avLst/>
+                      </a:prstGeom>
+                      <a:noFill/>
+                      <a:ln>
+                        <a:noFill/>
+                      </a:ln>
+                    </wps:spPr>
+                    <wps:txbx>
+                      <w:txbxContent>
+                        <w:p>
+                          <w:pPr>
+                            <w:spacing w:after="0"/>
+                            <w:rPr>
+                              <w:rFonts w:ascii="Arial" w:eastAsia="Arial" w:hAnsi="Arial" w:cs="Arial"/>
+                              <w:noProof/>
+                              <w:color w:val="000000"/>
+                              <w:sz w:val="18"/>
+                              <w:szCs w:val="18"/>
+                            </w:rPr>
+                          </w:pPr>
+                          <w:r>
+                            <w:rPr>
+                              <w:rFonts w:ascii="Arial" w:eastAsia="Arial" w:hAnsi="Arial" w:cs="Arial"/>
+                              <w:noProof/>
+                              <w:color w:val="000000"/>
+                              <w:sz w:val="18"/>
+                              <w:szCs w:val="18"/>
+                            </w:rPr>
+                            <w:t>Confidential</w:t>
+                          </w:r>
+                        </w:p>
+                      </w:txbxContent>
+                    </wps:txbx>
+                    <wps:bodyPr rot="0" spcFirstLastPara="0" vertOverflow="overflow" horzOverflow="overflow" vert="horz" wrap="none" lIns="0" tIns="0" rIns="0" bIns="355600" numCol="1" spcCol="0" rtlCol="0" fromWordArt="0" anchor="b" anchorCtr="0" forceAA="0" compatLnSpc="1">
+                      <a:prstTxWarp prst="textNoShape">
+                        <a:avLst/>
+                      </a:prstTxWarp>
+                      <a:spAutoFit/>
+                    </wps:bodyPr>
+                  </wps:wsp>
+                </a:graphicData>
+              </a:graphic>
+              <wp14:sizeRelH relativeFrom="margin">
+                <wp14:pctWidth>0</wp14:pctWidth>
+              </wp14:sizeRelH>
+              <wp14:sizeRelV relativeFrom="margin">
+                <wp14:pctHeight>0</wp14:pctHeight>
+              </wp14:sizeRelV>
+            </wp:anchor>
+          </w:drawing>
+        </mc:Choice>
+        <mc:Fallback>
+          <w:pict>
+            <v:shapetype w14:anchorId="715368EE" id="_x0000_t202" coordsize="21600,21600" o:spt="202" path="m,l,21600r21600,l21600,xe">
+              <v:stroke joinstyle="miter"/>
+              <v:path gradientshapeok="t" o:connecttype="rect"/>
+            </v:shapetype>
+            <v:shape id="Text Box 6" o:spid="_x0000_s1027" type="#_x0000_t202" alt="Confidential" style="position:absolute;left:0;text-align:left;margin-left:0;margin-top:0;width:47.55pt;height:52.35pt;z-index:251662336;visibility:visible;mso-wrap-style:none;mso-width-percent:0;mso-height-percent:0;mso-wrap-distance-left:0;mso-wrap-distance-top:0;mso-wrap-distance-right:0;mso-wrap-distance-bottom:0;mso-position-horizontal:center;mso-position-horizontal-relative:page;mso-position-vertical:bottom;mso-position-vertical-relative:page;mso-width-percent:0;mso-height-percent:0;mso-width-relative:margin;mso-height-relative:margin;v-text-anchor:bottom" o:gfxdata="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" filled="f" stroked="f">
+              <v:fill o:detectmouseclick="t"/>
+              <v:textbox style="mso-fit-shape-to-text:t" inset="0,0,0,28pt">
+                <w:txbxContent>
+                  <w:p>
+                    <w:pPr>
+                      <w:spacing w:after="0"/>
+                      <w:rPr>
+                        <w:rFonts w:ascii="Arial" w:eastAsia="Arial" w:hAnsi="Arial" w:cs="Arial"/>
+                        <w:noProof/>
+                        <w:color w:val="000000"/>
+                        <w:sz w:val="18"/>
+                        <w:szCs w:val="18"/>
+                      </w:rPr>
+                    </w:pPr>
+                    <w:r>
+                      <w:rPr>
+                        <w:rFonts w:ascii="Arial" w:eastAsia="Arial" w:hAnsi="Arial" w:cs="Arial"/>
+                        <w:noProof/>
+                        <w:color w:val="000000"/>
+                        <w:sz w:val="18"/>
+                        <w:szCs w:val="18"/>
+                      </w:rPr>
+                      <w:t>Confidential</w:t>
+                    </w:r>
+                  </w:p>
+                </w:txbxContent>
+              </v:textbox>
+              <w10:wrap anchorx="page" anchory="page"/>
+            </v:shape>
+          </w:pict>
+        </mc:Fallback>
+      </mc:AlternateContent>
+    </w:r>
     <w:r>
       <w:rPr>
         <w:b/>
@@ -1620,6 +1709,143 @@
         <w:szCs w:val="20"/>
       </w:rPr>
       <w:t xml:space="preserve"> (250) 953-0496</w:t>
+    </w:r>
+  </w:p>
+</w:ftr>
+</file>
+
+<file path=word/footer3.xml><?xml version="1.0" encoding="utf-8"?>
+<w:ftr xmlns:wpc="http://schemas.microsoft.com/office/word/2010/wordprocessingCanvas" xmlns:cx="http://schemas.microsoft.com/office/drawing/2014/chartex" xmlns:cx1="http://schemas.microsoft.com/office/drawing/2015/9/8/chartex" xmlns:cx2="http://schemas.microsoft.com/office/drawing/2015/10/21/chartex" xmlns:cx3="http://schemas.microsoft.com/office/drawing/2016/5/9/chartex" xmlns:cx4="http://schemas.microsoft.com/office/drawing/2016/5/10/chartex" xmlns:cx5="http://schemas.microsoft.com/office/drawing/2016/5/11/chartex" xmlns:cx6="http://schemas.microsoft.com/office/drawing/2016/5/12/chartex" xmlns:cx7="http://schemas.microsoft.com/office/drawing/2016/5/13/chartex" xmlns:cx8="http://schemas.microsoft.com/office/drawing/2016/5/14/chartex" xmlns:mc="http://schemas.openxmlformats.org/markup-compatibility/2006" xmlns:aink="http://schemas.microsoft.com/office/drawing/2016/ink" xmlns:am3d="http://schemas.microsoft.com/office/drawing/2017/model3d" xmlns:o="urn:schemas-microsoft-com:office:office" xmlns:oel="http://schemas.microsoft.com/office/2019/extlst" xmlns:r="http://schemas.openxmlformats.org/officeDocument/2006/relationships" xmlns:m="http://schemas.openxmlformats.org/officeDocument/2006/math" xmlns:v="urn:schemas-microsoft-com:vml" xmlns:wp14="http://schemas.microsoft.com/office/word/2010/wordprocessingDrawing" xmlns:wp="http://schemas.openxmlformats.org/drawingml/2006/wordprocessingDrawing" xmlns:w10="urn:schemas-microsoft-com:office:word" xmlns:w="http://schemas.openxmlformats.org/wordprocessingml/2006/main" xmlns:w14="http://schemas.microsoft.com/office/word/2010/wordml" xmlns:w15="http://schemas.microsoft.com/office/word/2012/wordml" xmlns:w16cex="http://schemas.microsoft.com/office/word/2018/wordml/cex" xmlns:w16cid="http://schemas.microsoft.com/office/word/2016/wordml/cid" xmlns:w16="http://schemas.microsoft.com/office/word/2018/wordml" xmlns:w16du="http://schemas.microsoft.com/office/word/2023/wordml/word16du" xmlns:w16sdtdh="http://schemas.microsoft.com/office/word/2020/wordml/sdtdatahash" xmlns:w16sdtfl="http://schemas.microsoft.com/office/word/2024/wordml/sdtformatlock" xmlns:w16se="http://schemas.microsoft.com/office/word/2015/wordml/symex" xmlns:wpg="http://schemas.microsoft.com/office/word/2010/wordprocessingGroup" xmlns:wpi="http://schemas.microsoft.com/office/word/2010/wordprocessingInk" xmlns:wne="http://schemas.microsoft.com/office/word/2006/wordml" xmlns:wps="http://schemas.microsoft.com/office/word/2010/wordprocessingShape" mc:Ignorable="w14 w15 w16se w16cid w16 w16cex w16sdtdh w16sdtfl w16du wp14">
+  <w:p>
+    <w:pPr>
+      <w:pStyle w:val="Footer"/>
+    </w:pPr>
+    <w:r>
+      <w:rPr>
+        <w:noProof/>
+      </w:rPr>
+      <mc:AlternateContent>
+        <mc:Choice Requires="wps">
+          <w:drawing>
+            <wp:anchor distT="0" distB="0" distL="0" distR="0" simplePos="0" relativeHeight="251660288" behindDoc="0" locked="0" layoutInCell="1" allowOverlap="1" wp14:anchorId="3D6C3D18" wp14:editId="78B21E2C">
+              <wp:simplePos x="635" y="635"/>
+              <wp:positionH relativeFrom="page">
+                <wp:align>center</wp:align>
+              </wp:positionH>
+              <wp:positionV relativeFrom="page">
+                <wp:align>bottom</wp:align>
+              </wp:positionV>
+              <wp:extent cx="603885" cy="664845"/>
+              <wp:effectExtent l="0" t="0" r="5715" b="0"/>
+              <wp:wrapNone/>
+              <wp:docPr id="821590418" name="Text Box 4" descr="Confidential">
+                <a:extLst xmlns:a="http://schemas.openxmlformats.org/drawingml/2006/main">
+                  <a:ext uri="{5AE41FA2-C0FF-4470-9BD4-5FADCA87CBE2}">
+                    <aclsh:classification xmlns:aclsh="http://schemas.microsoft.com/office/drawing/2020/classificationShape" classificationOutcomeType="ftr"/>
+                  </a:ext>
+                </a:extLst>
+              </wp:docPr>
+              <wp:cNvGraphicFramePr/>
+              <a:graphic xmlns:a="http://schemas.openxmlformats.org/drawingml/2006/main">
+                <a:graphicData uri="http://schemas.microsoft.com/office/word/2010/wordprocessingShape">
+                  <wps:wsp>
+                    <wps:cNvSpPr txBox="1"/>
+                    <wps:spPr>
+                      <a:xfrm>
+                        <a:off x="0" y="0"/>
+                        <a:ext cx="603885" cy="664845"/>
+                      </a:xfrm>
+                      <a:prstGeom prst="rect">
+                        <a:avLst/>
+                      </a:prstGeom>
+                      <a:noFill/>
+                      <a:ln>
+                        <a:noFill/>
+                      </a:ln>
+                    </wps:spPr>
+                    <wps:txbx>
+                      <w:txbxContent>
+                        <w:p>
+                          <w:pPr>
+                            <w:spacing w:after="0"/>
+                            <w:rPr>
+                              <w:rFonts w:ascii="Arial" w:eastAsia="Arial" w:hAnsi="Arial" w:cs="Arial"/>
+                              <w:noProof/>
+                              <w:color w:val="000000"/>
+                              <w:sz w:val="18"/>
+                              <w:szCs w:val="18"/>
+                            </w:rPr>
+                          </w:pPr>
+                          <w:r>
+                            <w:rPr>
+                              <w:rFonts w:ascii="Arial" w:eastAsia="Arial" w:hAnsi="Arial" w:cs="Arial"/>
+                              <w:noProof/>
+                              <w:color w:val="000000"/>
+                              <w:sz w:val="18"/>
+                              <w:szCs w:val="18"/>
+                            </w:rPr>
+                            <w:t>Confidential</w:t>
+                          </w:r>
+                        </w:p>
+                      </w:txbxContent>
+                    </wps:txbx>
+                    <wps:bodyPr rot="0" spcFirstLastPara="0" vertOverflow="overflow" horzOverflow="overflow" vert="horz" wrap="none" lIns="0" tIns="0" rIns="0" bIns="355600" numCol="1" spcCol="0" rtlCol="0" fromWordArt="0" anchor="b" anchorCtr="0" forceAA="0" compatLnSpc="1">
+                      <a:prstTxWarp prst="textNoShape">
+                        <a:avLst/>
+                      </a:prstTxWarp>
+                      <a:spAutoFit/>
+                    </wps:bodyPr>
+                  </wps:wsp>
+                </a:graphicData>
+              </a:graphic>
+              <wp14:sizeRelH relativeFrom="margin">
+                <wp14:pctWidth>0</wp14:pctWidth>
+              </wp14:sizeRelH>
+              <wp14:sizeRelV relativeFrom="margin">
+                <wp14:pctHeight>0</wp14:pctHeight>
+              </wp14:sizeRelV>
+            </wp:anchor>
+          </w:drawing>
+        </mc:Choice>
+        <mc:Fallback>
+          <w:pict>
+            <v:shapetype w14:anchorId="3D6C3D18" id="_x0000_t202" coordsize="21600,21600" o:spt="202" path="m,l,21600r21600,l21600,xe">
+              <v:stroke joinstyle="miter"/>
+              <v:path gradientshapeok="t" o:connecttype="rect"/>
+            </v:shapetype>
+            <v:shape id="Text Box 4" o:spid="_x0000_s1028" type="#_x0000_t202" alt="Confidential" style="position:absolute;margin-left:0;margin-top:0;width:47.55pt;height:52.35pt;z-index:251660288;visibility:visible;mso-wrap-style:none;mso-width-percent:0;mso-height-percent:0;mso-wrap-distance-left:0;mso-wrap-distance-top:0;mso-wrap-distance-right:0;mso-wrap-distance-bottom:0;mso-position-horizontal:center;mso-position-horizontal-relative:page;mso-position-vertical:bottom;mso-position-vertical-relative:page;mso-width-percent:0;mso-height-percent:0;mso-width-relative:margin;mso-height-relative:margin;v-text-anchor:bottom" o:gfxdata="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" filled="f" stroked="f">
+              <v:fill o:detectmouseclick="t"/>
+              <v:textbox style="mso-fit-shape-to-text:t" inset="0,0,0,28pt">
+                <w:txbxContent>
+                  <w:p>
+                    <w:pPr>
+                      <w:spacing w:after="0"/>
+                      <w:rPr>
+                        <w:rFonts w:ascii="Arial" w:eastAsia="Arial" w:hAnsi="Arial" w:cs="Arial"/>
+                        <w:noProof/>
+                        <w:color w:val="000000"/>
+                        <w:sz w:val="18"/>
+                        <w:szCs w:val="18"/>
+                      </w:rPr>
+                    </w:pPr>
+                    <w:r>
+                      <w:rPr>
+                        <w:rFonts w:ascii="Arial" w:eastAsia="Arial" w:hAnsi="Arial" w:cs="Arial"/>
+                        <w:noProof/>
+                        <w:color w:val="000000"/>
+                        <w:sz w:val="18"/>
+                        <w:szCs w:val="18"/>
+                      </w:rPr>
+                      <w:t>Confidential</w:t>
+                    </w:r>
+                  </w:p>
+                </w:txbxContent>
+              </v:textbox>
+              <w10:wrap anchorx="page" anchory="page"/>
+            </v:shape>
+          </w:pict>
+        </mc:Fallback>
+      </mc:AlternateContent>
     </w:r>
   </w:p>
 </w:ftr>
@@ -1651,6 +1877,16 @@
 </file>
 
 <file path=word/header1.xml><?xml version="1.0" encoding="utf-8"?>
+<w:hdr xmlns:wpc="http://schemas.microsoft.com/office/word/2010/wordprocessingCanvas" xmlns:cx="http://schemas.microsoft.com/office/drawing/2014/chartex" xmlns:cx1="http://schemas.microsoft.com/office/drawing/2015/9/8/chartex" xmlns:cx2="http://schemas.microsoft.com/office/drawing/2015/10/21/chartex" xmlns:cx3="http://schemas.microsoft.com/office/drawing/2016/5/9/chartex" xmlns:cx4="http://schemas.microsoft.com/office/drawing/2016/5/10/chartex" xmlns:cx5="http://schemas.microsoft.com/office/drawing/2016/5/11/chartex" xmlns:cx6="http://schemas.microsoft.com/office/drawing/2016/5/12/chartex" xmlns:cx7="http://schemas.microsoft.com/office/drawing/2016/5/13/chartex" xmlns:cx8="http://schemas.microsoft.com/office/drawing/2016/5/14/chartex" xmlns:mc="http://schemas.openxmlformats.org/markup-compatibility/2006" xmlns:aink="http://schemas.microsoft.com/office/drawing/2016/ink" xmlns:am3d="http://schemas.microsoft.com/office/drawing/2017/model3d" xmlns:o="urn:schemas-microsoft-com:office:office" xmlns:oel="http://schemas.microsoft.com/office/2019/extlst" xmlns:r="http://schemas.openxmlformats.org/officeDocument/2006/relationships" xmlns:m="http://schemas.openxmlformats.org/officeDocument/2006/math" xmlns:v="urn:schemas-microsoft-com:vml" xmlns:wp14="http://schemas.microsoft.com/office/word/2010/wordprocessingDrawing" xmlns:wp="http://schemas.openxmlformats.org/drawingml/2006/wordprocessingDrawing" xmlns:w10="urn:schemas-microsoft-com:office:word" xmlns:w="http://schemas.openxmlformats.org/wordprocessingml/2006/main" xmlns:w14="http://schemas.microsoft.com/office/word/2010/wordml" xmlns:w15="http://schemas.microsoft.com/office/word/2012/wordml" xmlns:w16cex="http://schemas.microsoft.com/office/word/2018/wordml/cex" xmlns:w16cid="http://schemas.microsoft.com/office/word/2016/wordml/cid" xmlns:w16="http://schemas.microsoft.com/office/word/2018/wordml" xmlns:w16du="http://schemas.microsoft.com/office/word/2023/wordml/word16du" xmlns:w16sdtdh="http://schemas.microsoft.com/office/word/2020/wordml/sdtdatahash" xmlns:w16sdtfl="http://schemas.microsoft.com/office/word/2024/wordml/sdtformatlock" xmlns:w16se="http://schemas.microsoft.com/office/word/2015/wordml/symex" xmlns:wpg="http://schemas.microsoft.com/office/word/2010/wordprocessingGroup" xmlns:wpi="http://schemas.microsoft.com/office/word/2010/wordprocessingInk" xmlns:wne="http://schemas.microsoft.com/office/word/2006/wordml" xmlns:wps="http://schemas.microsoft.com/office/word/2010/wordprocessingShape" mc:Ignorable="w14 w15 w16se w16cid w16 w16cex w16sdtdh w16sdtfl w16du wp14">
+  <w:p>
+    <w:pPr>
+      <w:pStyle w:val="Header"/>
+    </w:pPr>
+  </w:p>
+</w:hdr>
+</file>
+
+<file path=word/header2.xml><?xml version="1.0" encoding="utf-8"?>
 <w:hdr xmlns:wpc="http://schemas.microsoft.com/office/word/2010/wordprocessingCanvas" xmlns:cx="http://schemas.microsoft.com/office/drawing/2014/chartex" xmlns:cx1="http://schemas.microsoft.com/office/drawing/2015/9/8/chartex" xmlns:cx2="http://schemas.microsoft.com/office/drawing/2015/10/21/chartex" xmlns:cx3="http://schemas.microsoft.com/office/drawing/2016/5/9/chartex" xmlns:cx4="http://schemas.microsoft.com/office/drawing/2016/5/10/chartex" xmlns:cx5="http://schemas.microsoft.com/office/drawing/2016/5/11/chartex" xmlns:cx6="http://schemas.microsoft.com/office/drawing/2016/5/12/chartex" xmlns:cx7="http://schemas.microsoft.com/office/drawing/2016/5/13/chartex" xmlns:cx8="http://schemas.microsoft.com/office/drawing/2016/5/14/chartex" xmlns:mc="http://schemas.openxmlformats.org/markup-compatibility/2006" xmlns:aink="http://schemas.microsoft.com/office/drawing/2016/ink" xmlns:am3d="http://schemas.microsoft.com/office/drawing/2017/model3d" xmlns:o="urn:schemas-microsoft-com:office:office" xmlns:oel="http://schemas.microsoft.com/office/2019/extlst" xmlns:r="http://schemas.openxmlformats.org/officeDocument/2006/relationships" xmlns:m="http://schemas.openxmlformats.org/officeDocument/2006/math" xmlns:v="urn:schemas-microsoft-com:vml" xmlns:wp14="http://schemas.microsoft.com/office/word/2010/wordprocessingDrawing" xmlns:wp="http://schemas.openxmlformats.org/drawingml/2006/wordprocessingDrawing" xmlns:w10="urn:schemas-microsoft-com:office:word" xmlns:w="http://schemas.openxmlformats.org/wordprocessingml/2006/main" xmlns:w14="http://schemas.microsoft.com/office/word/2010/wordml" xmlns:w15="http://schemas.microsoft.com/office/word/2012/wordml" xmlns:w16cex="http://schemas.microsoft.com/office/word/2018/wordml/cex" xmlns:w16cid="http://schemas.microsoft.com/office/word/2016/wordml/cid" xmlns:w16="http://schemas.microsoft.com/office/word/2018/wordml" xmlns:w16du="http://schemas.microsoft.com/office/word/2023/wordml/word16du" xmlns:w16sdtdh="http://schemas.microsoft.com/office/word/2020/wordml/sdtdatahash" xmlns:w16sdtfl="http://schemas.microsoft.com/office/word/2024/wordml/sdtformatlock" xmlns:w16se="http://schemas.microsoft.com/office/word/2015/wordml/symex" xmlns:wpg="http://schemas.microsoft.com/office/word/2010/wordprocessingGroup" xmlns:wpi="http://schemas.microsoft.com/office/word/2010/wordprocessingInk" xmlns:wne="http://schemas.microsoft.com/office/word/2006/wordml" xmlns:wps="http://schemas.microsoft.com/office/word/2010/wordprocessingShape" mc:Ignorable="w14 w15 w16se w16cid w16 w16cex w16sdtdh w16sdtfl w16du wp14">
   <w:p>
     <w:pPr>
@@ -1829,27 +2065,7 @@
         <w:sz w:val="30"/>
         <w:szCs w:val="30"/>
       </w:rPr>
-      <w:t>{{</w:t>
-    </w:r>
-    <w:proofErr w:type="spellStart"/>
-    <w:r>
-      <w:rPr>
-        <w:b/>
-        <w:bCs/>
-        <w:sz w:val="30"/>
-        <w:szCs w:val="30"/>
-      </w:rPr>
-      <w:t>InvoiceId</w:t>
-    </w:r>
-    <w:proofErr w:type="spellEnd"/>
-    <w:r>
-      <w:rPr>
-        <w:b/>
-        <w:bCs/>
-        <w:sz w:val="30"/>
-        <w:szCs w:val="30"/>
-      </w:rPr>
-      <w:t>}}</w:t>
+      <w:t>{{InvoiceId}}</w:t>
     </w:r>
     <w:r>
       <w:rPr>
@@ -1942,25 +2158,7 @@
         <w:szCs w:val="20"/>
         <w14:ligatures w14:val="none"/>
       </w:rPr>
-      <w:t>{{</w:t>
-    </w:r>
-    <w:proofErr w:type="spellStart"/>
-    <w:r>
-      <w:rPr>
-        <w:kern w:val="0"/>
-        <w:szCs w:val="20"/>
-        <w14:ligatures w14:val="none"/>
-      </w:rPr>
-      <w:t>InvoiceCreatedDate</w:t>
-    </w:r>
-    <w:proofErr w:type="spellEnd"/>
-    <w:r>
-      <w:rPr>
-        <w:kern w:val="0"/>
-        <w:szCs w:val="20"/>
-        <w14:ligatures w14:val="none"/>
-      </w:rPr>
-      <w:t>}}</w:t>
+      <w:t>{{InvoiceCreatedDate}}</w:t>
     </w:r>
     <w:r>
       <w:rPr>
@@ -1993,7 +2191,21 @@
         <w:noProof/>
         <w:szCs w:val="20"/>
       </w:rPr>
-      <w:t>PO Box 9601 STN Prov Gov</w:t>
+      <w:t>PO Box 960</w:t>
+    </w:r>
+    <w:r>
+      <w:rPr>
+        <w:noProof/>
+        <w:szCs w:val="20"/>
+      </w:rPr>
+      <w:t>4</w:t>
+    </w:r>
+    <w:r>
+      <w:rPr>
+        <w:noProof/>
+        <w:szCs w:val="20"/>
+      </w:rPr>
+      <w:t xml:space="preserve"> STN Prov Gov</w:t>
     </w:r>
     <w:r>
       <w:rPr>
@@ -2010,6 +2222,16 @@
         <w:noProof/>
         <w:sz w:val="22"/>
       </w:rPr>
+    </w:pPr>
+  </w:p>
+</w:hdr>
+</file>
+
+<file path=word/header3.xml><?xml version="1.0" encoding="utf-8"?>
+<w:hdr xmlns:wpc="http://schemas.microsoft.com/office/word/2010/wordprocessingCanvas" xmlns:cx="http://schemas.microsoft.com/office/drawing/2014/chartex" xmlns:cx1="http://schemas.microsoft.com/office/drawing/2015/9/8/chartex" xmlns:cx2="http://schemas.microsoft.com/office/drawing/2015/10/21/chartex" xmlns:cx3="http://schemas.microsoft.com/office/drawing/2016/5/9/chartex" xmlns:cx4="http://schemas.microsoft.com/office/drawing/2016/5/10/chartex" xmlns:cx5="http://schemas.microsoft.com/office/drawing/2016/5/11/chartex" xmlns:cx6="http://schemas.microsoft.com/office/drawing/2016/5/12/chartex" xmlns:cx7="http://schemas.microsoft.com/office/drawing/2016/5/13/chartex" xmlns:cx8="http://schemas.microsoft.com/office/drawing/2016/5/14/chartex" xmlns:mc="http://schemas.openxmlformats.org/markup-compatibility/2006" xmlns:aink="http://schemas.microsoft.com/office/drawing/2016/ink" xmlns:am3d="http://schemas.microsoft.com/office/drawing/2017/model3d" xmlns:o="urn:schemas-microsoft-com:office:office" xmlns:oel="http://schemas.microsoft.com/office/2019/extlst" xmlns:r="http://schemas.openxmlformats.org/officeDocument/2006/relationships" xmlns:m="http://schemas.openxmlformats.org/officeDocument/2006/math" xmlns:v="urn:schemas-microsoft-com:vml" xmlns:wp14="http://schemas.microsoft.com/office/word/2010/wordprocessingDrawing" xmlns:wp="http://schemas.openxmlformats.org/drawingml/2006/wordprocessingDrawing" xmlns:w10="urn:schemas-microsoft-com:office:word" xmlns:w="http://schemas.openxmlformats.org/wordprocessingml/2006/main" xmlns:w14="http://schemas.microsoft.com/office/word/2010/wordml" xmlns:w15="http://schemas.microsoft.com/office/word/2012/wordml" xmlns:w16cex="http://schemas.microsoft.com/office/word/2018/wordml/cex" xmlns:w16cid="http://schemas.microsoft.com/office/word/2016/wordml/cid" xmlns:w16="http://schemas.microsoft.com/office/word/2018/wordml" xmlns:w16du="http://schemas.microsoft.com/office/word/2023/wordml/word16du" xmlns:w16sdtdh="http://schemas.microsoft.com/office/word/2020/wordml/sdtdatahash" xmlns:w16sdtfl="http://schemas.microsoft.com/office/word/2024/wordml/sdtformatlock" xmlns:w16se="http://schemas.microsoft.com/office/word/2015/wordml/symex" xmlns:wpg="http://schemas.microsoft.com/office/word/2010/wordprocessingGroup" xmlns:wpi="http://schemas.microsoft.com/office/word/2010/wordprocessingInk" xmlns:wne="http://schemas.microsoft.com/office/word/2006/wordml" xmlns:wps="http://schemas.microsoft.com/office/word/2010/wordprocessingShape" mc:Ignorable="w14 w15 w16se w16cid w16 w16cex w16sdtdh w16sdtfl w16du wp14">
+  <w:p>
+    <w:pPr>
+      <w:pStyle w:val="Header"/>
     </w:pPr>
   </w:p>
 </w:hdr>
@@ -2851,6 +3073,7 @@
 
 <file path=docMetadata/LabelInfo.xml><?xml version="1.0" encoding="utf-8"?>
 <clbl:labelList xmlns:clbl="http://schemas.microsoft.com/office/2020/mipLabelMetadata">
+  <clbl:label id="{820d33d7-bbe4-47b8-a5ad-6a3992657a09}" enabled="1" method="Privileged" siteId="{b9fec68c-c92d-461e-9a97-3d03a0f18b82}" contentBits="3" removed="0"/>
   <clbl:label id="{e0793d39-0939-496d-b129-198edd916feb}" enabled="0" method="" siteId="{e0793d39-0939-496d-b129-198edd916feb}" removed="1"/>
 </clbl:labelList>
 </file>
</xml_diff>

<commit_message>
BCMOHAM-31884 || Updated the PBOX number
</commit_message>
<xml_diff>
--- a/ALR-DocgenTemplates/Application Fee Receipt Template.docx
+++ b/ALR-DocgenTemplates/Application Fee Receipt Template.docx
@@ -12,8 +12,12 @@
           <w:szCs w:val="34"/>
         </w:rPr>
         <w:sectPr>
-          <w:headerReference w:type="default" r:id="rId6"/>
-          <w:footerReference w:type="default" r:id="rId7"/>
+          <w:headerReference w:type="even" r:id="rId6"/>
+          <w:headerReference w:type="default" r:id="rId7"/>
+          <w:footerReference w:type="even" r:id="rId8"/>
+          <w:footerReference w:type="default" r:id="rId9"/>
+          <w:headerReference w:type="first" r:id="rId10"/>
+          <w:footerReference w:type="first" r:id="rId11"/>
           <w:pgSz w:w="12240" w:h="15840"/>
           <w:pgMar w:top="720" w:right="720" w:bottom="720" w:left="720" w:header="708" w:footer="708" w:gutter="0"/>
           <w:cols w:space="708"/>
@@ -132,29 +136,7 @@
                 <w:szCs w:val="24"/>
                 <w14:ligatures w14:val="none"/>
               </w:rPr>
-              <w:t>{{</w:t>
-            </w:r>
-            <w:proofErr w:type="spellStart"/>
-            <w:r>
-              <w:rPr>
-                <w:color w:val="000000" w:themeColor="text1"/>
-                <w:kern w:val="0"/>
-                <w:sz w:val="24"/>
-                <w:szCs w:val="24"/>
-                <w14:ligatures w14:val="none"/>
-              </w:rPr>
-              <w:t>RegistrantName</w:t>
-            </w:r>
-            <w:proofErr w:type="spellEnd"/>
-            <w:r>
-              <w:rPr>
-                <w:color w:val="000000" w:themeColor="text1"/>
-                <w:kern w:val="0"/>
-                <w:sz w:val="24"/>
-                <w:szCs w:val="24"/>
-                <w14:ligatures w14:val="none"/>
-              </w:rPr>
-              <w:t>}}</w:t>
+              <w:t>{{RegistrantName}}</w:t>
             </w:r>
           </w:p>
         </w:tc>
@@ -179,29 +161,7 @@
                 <w:szCs w:val="24"/>
                 <w14:ligatures w14:val="none"/>
               </w:rPr>
-              <w:t>{{</w:t>
-            </w:r>
-            <w:proofErr w:type="spellStart"/>
-            <w:r>
-              <w:rPr>
-                <w:color w:val="000000" w:themeColor="text1"/>
-                <w:kern w:val="0"/>
-                <w:sz w:val="24"/>
-                <w:szCs w:val="24"/>
-                <w14:ligatures w14:val="none"/>
-              </w:rPr>
-              <w:t>ResidenceName</w:t>
-            </w:r>
-            <w:proofErr w:type="spellEnd"/>
-            <w:r>
-              <w:rPr>
-                <w:color w:val="000000" w:themeColor="text1"/>
-                <w:kern w:val="0"/>
-                <w:sz w:val="24"/>
-                <w:szCs w:val="24"/>
-                <w14:ligatures w14:val="none"/>
-              </w:rPr>
-              <w:t>}}</w:t>
+              <w:t>{{ResidenceName}}</w:t>
             </w:r>
           </w:p>
         </w:tc>
@@ -231,29 +191,7 @@
                 <w:szCs w:val="24"/>
                 <w14:ligatures w14:val="none"/>
               </w:rPr>
-              <w:t>{{</w:t>
-            </w:r>
-            <w:proofErr w:type="spellStart"/>
-            <w:r>
-              <w:rPr>
-                <w:color w:val="000000" w:themeColor="text1"/>
-                <w:kern w:val="0"/>
-                <w:sz w:val="24"/>
-                <w:szCs w:val="24"/>
-                <w14:ligatures w14:val="none"/>
-              </w:rPr>
-              <w:t>RegistrantAddress</w:t>
-            </w:r>
-            <w:proofErr w:type="spellEnd"/>
-            <w:r>
-              <w:rPr>
-                <w:color w:val="000000" w:themeColor="text1"/>
-                <w:kern w:val="0"/>
-                <w:sz w:val="24"/>
-                <w:szCs w:val="24"/>
-                <w14:ligatures w14:val="none"/>
-              </w:rPr>
-              <w:t>}}</w:t>
+              <w:t>{{RegistrantAddress}}</w:t>
             </w:r>
           </w:p>
         </w:tc>
@@ -356,25 +294,7 @@
                 <w:sz w:val="24"/>
                 <w:szCs w:val="24"/>
               </w:rPr>
-              <w:t>{{</w:t>
-            </w:r>
-            <w:proofErr w:type="spellStart"/>
-            <w:r>
-              <w:rPr>
-                <w:color w:val="000000" w:themeColor="text1"/>
-                <w:sz w:val="24"/>
-                <w:szCs w:val="24"/>
-              </w:rPr>
-              <w:t>ResidenceAddress</w:t>
-            </w:r>
-            <w:proofErr w:type="spellEnd"/>
-            <w:r>
-              <w:rPr>
-                <w:color w:val="000000" w:themeColor="text1"/>
-                <w:sz w:val="24"/>
-                <w:szCs w:val="24"/>
-              </w:rPr>
-              <w:t>}}</w:t>
+              <w:t>{{ResidenceAddress}}</w:t>
             </w:r>
             <w:bookmarkEnd w:id="1"/>
           </w:p>
@@ -537,25 +457,7 @@
                 <w:sz w:val="22"/>
                 <w14:ligatures w14:val="none"/>
               </w:rPr>
-              <w:t>{{#InvoiceItem</w:t>
-            </w:r>
-            <w:proofErr w:type="gramStart"/>
-            <w:r>
-              <w:rPr>
-                <w:kern w:val="0"/>
-                <w:sz w:val="22"/>
-                <w14:ligatures w14:val="none"/>
-              </w:rPr>
-              <w:t>}}{</w:t>
-            </w:r>
-            <w:proofErr w:type="gramEnd"/>
-            <w:r>
-              <w:rPr>
-                <w:kern w:val="0"/>
-                <w:sz w:val="22"/>
-                <w14:ligatures w14:val="none"/>
-              </w:rPr>
-              <w:t>{Name}}</w:t>
+              <w:t>{{#InvoiceItem}}{{Name}}</w:t>
             </w:r>
           </w:p>
         </w:tc>
@@ -652,27 +554,7 @@
                 <w:sz w:val="22"/>
                 <w14:ligatures w14:val="none"/>
               </w:rPr>
-              <w:t>{{Fees</w:t>
-            </w:r>
-            <w:proofErr w:type="gramStart"/>
-            <w:r>
-              <w:rPr>
-                <w:rStyle w:val="ui-provider"/>
-                <w:kern w:val="0"/>
-                <w:sz w:val="22"/>
-                <w14:ligatures w14:val="none"/>
-              </w:rPr>
-              <w:t>}}{</w:t>
-            </w:r>
-            <w:proofErr w:type="gramEnd"/>
-            <w:r>
-              <w:rPr>
-                <w:rStyle w:val="ui-provider"/>
-                <w:kern w:val="0"/>
-                <w:sz w:val="22"/>
-                <w14:ligatures w14:val="none"/>
-              </w:rPr>
-              <w:t>{/I</w:t>
+              <w:t>{{Fees}}{{/I</w:t>
             </w:r>
             <w:r>
               <w:rPr>
@@ -1028,7 +910,6 @@
               <w:t xml:space="preserve">     </w:t>
             </w:r>
             <w:bookmarkStart w:id="3" w:name="OLE_LINK6"/>
-            <w:proofErr w:type="gramStart"/>
             <w:r>
               <w:rPr>
                 <w:b/>
@@ -1045,26 +926,7 @@
                 <w:sz w:val="19"/>
                 <w:szCs w:val="19"/>
               </w:rPr>
-              <w:t>{{</w:t>
-            </w:r>
-            <w:proofErr w:type="spellStart"/>
-            <w:proofErr w:type="gramEnd"/>
-            <w:r>
-              <w:rPr>
-                <w:color w:val="000000" w:themeColor="text1"/>
-                <w:sz w:val="19"/>
-                <w:szCs w:val="19"/>
-              </w:rPr>
-              <w:t>IF_isCertificateIdNotPresent</w:t>
-            </w:r>
-            <w:proofErr w:type="spellEnd"/>
-            <w:r>
-              <w:rPr>
-                <w:color w:val="000000" w:themeColor="text1"/>
-                <w:sz w:val="19"/>
-                <w:szCs w:val="19"/>
-              </w:rPr>
-              <w:t>}}</w:t>
+              <w:t>{{IF_isCertificateIdNotPresent}}</w:t>
             </w:r>
           </w:p>
         </w:tc>
@@ -1134,29 +996,7 @@
                 <w:szCs w:val="24"/>
                 <w14:ligatures w14:val="none"/>
               </w:rPr>
-              <w:t>{{</w:t>
-            </w:r>
-            <w:proofErr w:type="spellStart"/>
-            <w:r>
-              <w:rPr>
-                <w:color w:val="000000" w:themeColor="text1"/>
-                <w:kern w:val="0"/>
-                <w:sz w:val="24"/>
-                <w:szCs w:val="24"/>
-                <w14:ligatures w14:val="none"/>
-              </w:rPr>
-              <w:t>TotalFeeAmount</w:t>
-            </w:r>
-            <w:proofErr w:type="spellEnd"/>
-            <w:r>
-              <w:rPr>
-                <w:color w:val="000000" w:themeColor="text1"/>
-                <w:kern w:val="0"/>
-                <w:sz w:val="24"/>
-                <w:szCs w:val="24"/>
-                <w14:ligatures w14:val="none"/>
-              </w:rPr>
-              <w:t>}}</w:t>
+              <w:t>{{TotalFeeAmount}}</w:t>
             </w:r>
             <w:bookmarkEnd w:id="4"/>
           </w:p>
@@ -1320,29 +1160,7 @@
                 <w:szCs w:val="24"/>
                 <w14:ligatures w14:val="none"/>
               </w:rPr>
-              <w:t>{{</w:t>
-            </w:r>
-            <w:proofErr w:type="spellStart"/>
-            <w:r>
-              <w:rPr>
-                <w:color w:val="000000" w:themeColor="text1"/>
-                <w:kern w:val="0"/>
-                <w:sz w:val="24"/>
-                <w:szCs w:val="24"/>
-                <w14:ligatures w14:val="none"/>
-              </w:rPr>
-              <w:t>TotalFeeAmount</w:t>
-            </w:r>
-            <w:proofErr w:type="spellEnd"/>
-            <w:r>
-              <w:rPr>
-                <w:color w:val="000000" w:themeColor="text1"/>
-                <w:kern w:val="0"/>
-                <w:sz w:val="24"/>
-                <w:szCs w:val="24"/>
-                <w14:ligatures w14:val="none"/>
-              </w:rPr>
-              <w:t>}}</w:t>
+              <w:t>{{TotalFeeAmount}}</w:t>
             </w:r>
           </w:p>
         </w:tc>
@@ -1517,6 +1335,143 @@
 <w:ftr xmlns:wpc="http://schemas.microsoft.com/office/word/2010/wordprocessingCanvas" xmlns:cx="http://schemas.microsoft.com/office/drawing/2014/chartex" xmlns:cx1="http://schemas.microsoft.com/office/drawing/2015/9/8/chartex" xmlns:cx2="http://schemas.microsoft.com/office/drawing/2015/10/21/chartex" xmlns:cx3="http://schemas.microsoft.com/office/drawing/2016/5/9/chartex" xmlns:cx4="http://schemas.microsoft.com/office/drawing/2016/5/10/chartex" xmlns:cx5="http://schemas.microsoft.com/office/drawing/2016/5/11/chartex" xmlns:cx6="http://schemas.microsoft.com/office/drawing/2016/5/12/chartex" xmlns:cx7="http://schemas.microsoft.com/office/drawing/2016/5/13/chartex" xmlns:cx8="http://schemas.microsoft.com/office/drawing/2016/5/14/chartex" xmlns:mc="http://schemas.openxmlformats.org/markup-compatibility/2006" xmlns:aink="http://schemas.microsoft.com/office/drawing/2016/ink" xmlns:am3d="http://schemas.microsoft.com/office/drawing/2017/model3d" xmlns:o="urn:schemas-microsoft-com:office:office" xmlns:oel="http://schemas.microsoft.com/office/2019/extlst" xmlns:r="http://schemas.openxmlformats.org/officeDocument/2006/relationships" xmlns:m="http://schemas.openxmlformats.org/officeDocument/2006/math" xmlns:v="urn:schemas-microsoft-com:vml" xmlns:wp14="http://schemas.microsoft.com/office/word/2010/wordprocessingDrawing" xmlns:wp="http://schemas.openxmlformats.org/drawingml/2006/wordprocessingDrawing" xmlns:w10="urn:schemas-microsoft-com:office:word" xmlns:w="http://schemas.openxmlformats.org/wordprocessingml/2006/main" xmlns:w14="http://schemas.microsoft.com/office/word/2010/wordml" xmlns:w15="http://schemas.microsoft.com/office/word/2012/wordml" xmlns:w16cex="http://schemas.microsoft.com/office/word/2018/wordml/cex" xmlns:w16cid="http://schemas.microsoft.com/office/word/2016/wordml/cid" xmlns:w16="http://schemas.microsoft.com/office/word/2018/wordml" xmlns:w16du="http://schemas.microsoft.com/office/word/2023/wordml/word16du" xmlns:w16sdtdh="http://schemas.microsoft.com/office/word/2020/wordml/sdtdatahash" xmlns:w16sdtfl="http://schemas.microsoft.com/office/word/2024/wordml/sdtformatlock" xmlns:w16se="http://schemas.microsoft.com/office/word/2015/wordml/symex" xmlns:wpg="http://schemas.microsoft.com/office/word/2010/wordprocessingGroup" xmlns:wpi="http://schemas.microsoft.com/office/word/2010/wordprocessingInk" xmlns:wne="http://schemas.microsoft.com/office/word/2006/wordml" xmlns:wps="http://schemas.microsoft.com/office/word/2010/wordprocessingShape" mc:Ignorable="w14 w15 w16se w16cid w16 w16cex w16sdtdh w16sdtfl w16du wp14">
   <w:p>
     <w:pPr>
+      <w:pStyle w:val="Footer"/>
+    </w:pPr>
+    <w:r>
+      <w:rPr>
+        <w:noProof/>
+      </w:rPr>
+      <mc:AlternateContent>
+        <mc:Choice Requires="wps">
+          <w:drawing>
+            <wp:anchor distT="0" distB="0" distL="0" distR="0" simplePos="0" relativeHeight="251661312" behindDoc="0" locked="0" layoutInCell="1" allowOverlap="1" wp14:anchorId="2D66912B" wp14:editId="7B09FFF4">
+              <wp:simplePos x="635" y="635"/>
+              <wp:positionH relativeFrom="page">
+                <wp:align>center</wp:align>
+              </wp:positionH>
+              <wp:positionV relativeFrom="page">
+                <wp:align>bottom</wp:align>
+              </wp:positionV>
+              <wp:extent cx="381635" cy="664845"/>
+              <wp:effectExtent l="0" t="0" r="18415" b="0"/>
+              <wp:wrapNone/>
+              <wp:docPr id="1920128537" name="Text Box 2" descr="Internal">
+                <a:extLst xmlns:a="http://schemas.openxmlformats.org/drawingml/2006/main">
+                  <a:ext uri="{5AE41FA2-C0FF-4470-9BD4-5FADCA87CBE2}">
+                    <aclsh:classification xmlns:aclsh="http://schemas.microsoft.com/office/drawing/2020/classificationShape" classificationOutcomeType="ftr"/>
+                  </a:ext>
+                </a:extLst>
+              </wp:docPr>
+              <wp:cNvGraphicFramePr/>
+              <a:graphic xmlns:a="http://schemas.openxmlformats.org/drawingml/2006/main">
+                <a:graphicData uri="http://schemas.microsoft.com/office/word/2010/wordprocessingShape">
+                  <wps:wsp>
+                    <wps:cNvSpPr txBox="1"/>
+                    <wps:spPr>
+                      <a:xfrm>
+                        <a:off x="0" y="0"/>
+                        <a:ext cx="381635" cy="664845"/>
+                      </a:xfrm>
+                      <a:prstGeom prst="rect">
+                        <a:avLst/>
+                      </a:prstGeom>
+                      <a:noFill/>
+                      <a:ln>
+                        <a:noFill/>
+                      </a:ln>
+                    </wps:spPr>
+                    <wps:txbx>
+                      <w:txbxContent>
+                        <w:p>
+                          <w:pPr>
+                            <w:spacing w:after="0"/>
+                            <w:rPr>
+                              <w:rFonts w:ascii="Arial" w:eastAsia="Arial" w:hAnsi="Arial" w:cs="Arial"/>
+                              <w:noProof/>
+                              <w:color w:val="000000"/>
+                              <w:sz w:val="18"/>
+                              <w:szCs w:val="18"/>
+                            </w:rPr>
+                          </w:pPr>
+                          <w:r>
+                            <w:rPr>
+                              <w:rFonts w:ascii="Arial" w:eastAsia="Arial" w:hAnsi="Arial" w:cs="Arial"/>
+                              <w:noProof/>
+                              <w:color w:val="000000"/>
+                              <w:sz w:val="18"/>
+                              <w:szCs w:val="18"/>
+                            </w:rPr>
+                            <w:t>Internal</w:t>
+                          </w:r>
+                        </w:p>
+                      </w:txbxContent>
+                    </wps:txbx>
+                    <wps:bodyPr rot="0" spcFirstLastPara="0" vertOverflow="overflow" horzOverflow="overflow" vert="horz" wrap="none" lIns="0" tIns="0" rIns="0" bIns="355600" numCol="1" spcCol="0" rtlCol="0" fromWordArt="0" anchor="b" anchorCtr="0" forceAA="0" compatLnSpc="1">
+                      <a:prstTxWarp prst="textNoShape">
+                        <a:avLst/>
+                      </a:prstTxWarp>
+                      <a:spAutoFit/>
+                    </wps:bodyPr>
+                  </wps:wsp>
+                </a:graphicData>
+              </a:graphic>
+              <wp14:sizeRelH relativeFrom="margin">
+                <wp14:pctWidth>0</wp14:pctWidth>
+              </wp14:sizeRelH>
+              <wp14:sizeRelV relativeFrom="margin">
+                <wp14:pctHeight>0</wp14:pctHeight>
+              </wp14:sizeRelV>
+            </wp:anchor>
+          </w:drawing>
+        </mc:Choice>
+        <mc:Fallback>
+          <w:pict>
+            <v:shapetype w14:anchorId="2D66912B" id="_x0000_t202" coordsize="21600,21600" o:spt="202" path="m,l,21600r21600,l21600,xe">
+              <v:stroke joinstyle="miter"/>
+              <v:path gradientshapeok="t" o:connecttype="rect"/>
+            </v:shapetype>
+            <v:shape id="Text Box 2" o:spid="_x0000_s1026" type="#_x0000_t202" alt="Internal" style="position:absolute;margin-left:0;margin-top:0;width:30.05pt;height:52.35pt;z-index:251661312;visibility:visible;mso-wrap-style:none;mso-width-percent:0;mso-height-percent:0;mso-wrap-distance-left:0;mso-wrap-distance-top:0;mso-wrap-distance-right:0;mso-wrap-distance-bottom:0;mso-position-horizontal:center;mso-position-horizontal-relative:page;mso-position-vertical:bottom;mso-position-vertical-relative:page;mso-width-percent:0;mso-height-percent:0;mso-width-relative:margin;mso-height-relative:margin;v-text-anchor:bottom" o:gfxdata="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" filled="f" stroked="f">
+              <v:fill o:detectmouseclick="t"/>
+              <v:textbox style="mso-fit-shape-to-text:t" inset="0,0,0,28pt">
+                <w:txbxContent>
+                  <w:p>
+                    <w:pPr>
+                      <w:spacing w:after="0"/>
+                      <w:rPr>
+                        <w:rFonts w:ascii="Arial" w:eastAsia="Arial" w:hAnsi="Arial" w:cs="Arial"/>
+                        <w:noProof/>
+                        <w:color w:val="000000"/>
+                        <w:sz w:val="18"/>
+                        <w:szCs w:val="18"/>
+                      </w:rPr>
+                    </w:pPr>
+                    <w:r>
+                      <w:rPr>
+                        <w:rFonts w:ascii="Arial" w:eastAsia="Arial" w:hAnsi="Arial" w:cs="Arial"/>
+                        <w:noProof/>
+                        <w:color w:val="000000"/>
+                        <w:sz w:val="18"/>
+                        <w:szCs w:val="18"/>
+                      </w:rPr>
+                      <w:t>Internal</w:t>
+                    </w:r>
+                  </w:p>
+                </w:txbxContent>
+              </v:textbox>
+              <w10:wrap anchorx="page" anchory="page"/>
+            </v:shape>
+          </w:pict>
+        </mc:Fallback>
+      </mc:AlternateContent>
+    </w:r>
+  </w:p>
+</w:ftr>
+</file>
+
+<file path=word/footer2.xml><?xml version="1.0" encoding="utf-8"?>
+<w:ftr xmlns:wpc="http://schemas.microsoft.com/office/word/2010/wordprocessingCanvas" xmlns:cx="http://schemas.microsoft.com/office/drawing/2014/chartex" xmlns:cx1="http://schemas.microsoft.com/office/drawing/2015/9/8/chartex" xmlns:cx2="http://schemas.microsoft.com/office/drawing/2015/10/21/chartex" xmlns:cx3="http://schemas.microsoft.com/office/drawing/2016/5/9/chartex" xmlns:cx4="http://schemas.microsoft.com/office/drawing/2016/5/10/chartex" xmlns:cx5="http://schemas.microsoft.com/office/drawing/2016/5/11/chartex" xmlns:cx6="http://schemas.microsoft.com/office/drawing/2016/5/12/chartex" xmlns:cx7="http://schemas.microsoft.com/office/drawing/2016/5/13/chartex" xmlns:cx8="http://schemas.microsoft.com/office/drawing/2016/5/14/chartex" xmlns:mc="http://schemas.openxmlformats.org/markup-compatibility/2006" xmlns:aink="http://schemas.microsoft.com/office/drawing/2016/ink" xmlns:am3d="http://schemas.microsoft.com/office/drawing/2017/model3d" xmlns:o="urn:schemas-microsoft-com:office:office" xmlns:oel="http://schemas.microsoft.com/office/2019/extlst" xmlns:r="http://schemas.openxmlformats.org/officeDocument/2006/relationships" xmlns:m="http://schemas.openxmlformats.org/officeDocument/2006/math" xmlns:v="urn:schemas-microsoft-com:vml" xmlns:wp14="http://schemas.microsoft.com/office/word/2010/wordprocessingDrawing" xmlns:wp="http://schemas.openxmlformats.org/drawingml/2006/wordprocessingDrawing" xmlns:w10="urn:schemas-microsoft-com:office:word" xmlns:w="http://schemas.openxmlformats.org/wordprocessingml/2006/main" xmlns:w14="http://schemas.microsoft.com/office/word/2010/wordml" xmlns:w15="http://schemas.microsoft.com/office/word/2012/wordml" xmlns:w16cex="http://schemas.microsoft.com/office/word/2018/wordml/cex" xmlns:w16cid="http://schemas.microsoft.com/office/word/2016/wordml/cid" xmlns:w16="http://schemas.microsoft.com/office/word/2018/wordml" xmlns:w16du="http://schemas.microsoft.com/office/word/2023/wordml/word16du" xmlns:w16sdtdh="http://schemas.microsoft.com/office/word/2020/wordml/sdtdatahash" xmlns:w16sdtfl="http://schemas.microsoft.com/office/word/2024/wordml/sdtformatlock" xmlns:w16se="http://schemas.microsoft.com/office/word/2015/wordml/symex" xmlns:wpg="http://schemas.microsoft.com/office/word/2010/wordprocessingGroup" xmlns:wpi="http://schemas.microsoft.com/office/word/2010/wordprocessingInk" xmlns:wne="http://schemas.microsoft.com/office/word/2006/wordml" xmlns:wps="http://schemas.microsoft.com/office/word/2010/wordprocessingShape" mc:Ignorable="w14 w15 w16se w16cid w16 w16cex w16sdtdh w16sdtfl w16du wp14">
+  <w:p>
+    <w:pPr>
       <w:jc w:val="right"/>
       <w:rPr>
         <w:noProof/>
@@ -1524,6 +1479,138 @@
         <w:szCs w:val="18"/>
       </w:rPr>
     </w:pPr>
+    <w:r>
+      <w:rPr>
+        <w:b/>
+        <w:bCs/>
+        <w:i/>
+        <w:iCs/>
+        <w:noProof/>
+        <w:sz w:val="22"/>
+      </w:rPr>
+      <mc:AlternateContent>
+        <mc:Choice Requires="wps">
+          <w:drawing>
+            <wp:anchor distT="0" distB="0" distL="0" distR="0" simplePos="0" relativeHeight="251662336" behindDoc="0" locked="0" layoutInCell="1" allowOverlap="1" wp14:anchorId="68DA40F4" wp14:editId="43A125E9">
+              <wp:simplePos x="457200" y="8572500"/>
+              <wp:positionH relativeFrom="page">
+                <wp:align>center</wp:align>
+              </wp:positionH>
+              <wp:positionV relativeFrom="page">
+                <wp:align>bottom</wp:align>
+              </wp:positionV>
+              <wp:extent cx="381635" cy="664845"/>
+              <wp:effectExtent l="0" t="0" r="18415" b="0"/>
+              <wp:wrapNone/>
+              <wp:docPr id="725413328" name="Text Box 3" descr="Internal">
+                <a:extLst xmlns:a="http://schemas.openxmlformats.org/drawingml/2006/main">
+                  <a:ext uri="{5AE41FA2-C0FF-4470-9BD4-5FADCA87CBE2}">
+                    <aclsh:classification xmlns:aclsh="http://schemas.microsoft.com/office/drawing/2020/classificationShape" classificationOutcomeType="ftr"/>
+                  </a:ext>
+                </a:extLst>
+              </wp:docPr>
+              <wp:cNvGraphicFramePr/>
+              <a:graphic xmlns:a="http://schemas.openxmlformats.org/drawingml/2006/main">
+                <a:graphicData uri="http://schemas.microsoft.com/office/word/2010/wordprocessingShape">
+                  <wps:wsp>
+                    <wps:cNvSpPr txBox="1"/>
+                    <wps:spPr>
+                      <a:xfrm>
+                        <a:off x="0" y="0"/>
+                        <a:ext cx="381635" cy="664845"/>
+                      </a:xfrm>
+                      <a:prstGeom prst="rect">
+                        <a:avLst/>
+                      </a:prstGeom>
+                      <a:noFill/>
+                      <a:ln>
+                        <a:noFill/>
+                      </a:ln>
+                    </wps:spPr>
+                    <wps:txbx>
+                      <w:txbxContent>
+                        <w:p>
+                          <w:pPr>
+                            <w:spacing w:after="0"/>
+                            <w:rPr>
+                              <w:rFonts w:ascii="Arial" w:eastAsia="Arial" w:hAnsi="Arial" w:cs="Arial"/>
+                              <w:noProof/>
+                              <w:color w:val="000000"/>
+                              <w:sz w:val="18"/>
+                              <w:szCs w:val="18"/>
+                            </w:rPr>
+                          </w:pPr>
+                          <w:r>
+                            <w:rPr>
+                              <w:rFonts w:ascii="Arial" w:eastAsia="Arial" w:hAnsi="Arial" w:cs="Arial"/>
+                              <w:noProof/>
+                              <w:color w:val="000000"/>
+                              <w:sz w:val="18"/>
+                              <w:szCs w:val="18"/>
+                            </w:rPr>
+                            <w:t>Internal</w:t>
+                          </w:r>
+                        </w:p>
+                      </w:txbxContent>
+                    </wps:txbx>
+                    <wps:bodyPr rot="0" spcFirstLastPara="0" vertOverflow="overflow" horzOverflow="overflow" vert="horz" wrap="none" lIns="0" tIns="0" rIns="0" bIns="355600" numCol="1" spcCol="0" rtlCol="0" fromWordArt="0" anchor="b" anchorCtr="0" forceAA="0" compatLnSpc="1">
+                      <a:prstTxWarp prst="textNoShape">
+                        <a:avLst/>
+                      </a:prstTxWarp>
+                      <a:spAutoFit/>
+                    </wps:bodyPr>
+                  </wps:wsp>
+                </a:graphicData>
+              </a:graphic>
+              <wp14:sizeRelH relativeFrom="margin">
+                <wp14:pctWidth>0</wp14:pctWidth>
+              </wp14:sizeRelH>
+              <wp14:sizeRelV relativeFrom="margin">
+                <wp14:pctHeight>0</wp14:pctHeight>
+              </wp14:sizeRelV>
+            </wp:anchor>
+          </w:drawing>
+        </mc:Choice>
+        <mc:Fallback>
+          <w:pict>
+            <v:shapetype w14:anchorId="68DA40F4" id="_x0000_t202" coordsize="21600,21600" o:spt="202" path="m,l,21600r21600,l21600,xe">
+              <v:stroke joinstyle="miter"/>
+              <v:path gradientshapeok="t" o:connecttype="rect"/>
+            </v:shapetype>
+            <v:shape id="Text Box 3" o:spid="_x0000_s1027" type="#_x0000_t202" alt="Internal" style="position:absolute;left:0;text-align:left;margin-left:0;margin-top:0;width:30.05pt;height:52.35pt;z-index:251662336;visibility:visible;mso-wrap-style:none;mso-width-percent:0;mso-height-percent:0;mso-wrap-distance-left:0;mso-wrap-distance-top:0;mso-wrap-distance-right:0;mso-wrap-distance-bottom:0;mso-position-horizontal:center;mso-position-horizontal-relative:page;mso-position-vertical:bottom;mso-position-vertical-relative:page;mso-width-percent:0;mso-height-percent:0;mso-width-relative:margin;mso-height-relative:margin;v-text-anchor:bottom" o:gfxdata="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" filled="f" stroked="f">
+              <v:fill o:detectmouseclick="t"/>
+              <v:textbox style="mso-fit-shape-to-text:t" inset="0,0,0,28pt">
+                <w:txbxContent>
+                  <w:p>
+                    <w:pPr>
+                      <w:spacing w:after="0"/>
+                      <w:rPr>
+                        <w:rFonts w:ascii="Arial" w:eastAsia="Arial" w:hAnsi="Arial" w:cs="Arial"/>
+                        <w:noProof/>
+                        <w:color w:val="000000"/>
+                        <w:sz w:val="18"/>
+                        <w:szCs w:val="18"/>
+                      </w:rPr>
+                    </w:pPr>
+                    <w:r>
+                      <w:rPr>
+                        <w:rFonts w:ascii="Arial" w:eastAsia="Arial" w:hAnsi="Arial" w:cs="Arial"/>
+                        <w:noProof/>
+                        <w:color w:val="000000"/>
+                        <w:sz w:val="18"/>
+                        <w:szCs w:val="18"/>
+                      </w:rPr>
+                      <w:t>Internal</w:t>
+                    </w:r>
+                  </w:p>
+                </w:txbxContent>
+              </v:textbox>
+              <w10:wrap anchorx="page" anchory="page"/>
+            </v:shape>
+          </w:pict>
+        </mc:Fallback>
+      </mc:AlternateContent>
+    </w:r>
     <w:r>
       <w:rPr>
         <w:b/>
@@ -1620,6 +1707,143 @@
         <w:szCs w:val="20"/>
       </w:rPr>
       <w:t xml:space="preserve"> (250) 953-0496</w:t>
+    </w:r>
+  </w:p>
+</w:ftr>
+</file>
+
+<file path=word/footer3.xml><?xml version="1.0" encoding="utf-8"?>
+<w:ftr xmlns:wpc="http://schemas.microsoft.com/office/word/2010/wordprocessingCanvas" xmlns:cx="http://schemas.microsoft.com/office/drawing/2014/chartex" xmlns:cx1="http://schemas.microsoft.com/office/drawing/2015/9/8/chartex" xmlns:cx2="http://schemas.microsoft.com/office/drawing/2015/10/21/chartex" xmlns:cx3="http://schemas.microsoft.com/office/drawing/2016/5/9/chartex" xmlns:cx4="http://schemas.microsoft.com/office/drawing/2016/5/10/chartex" xmlns:cx5="http://schemas.microsoft.com/office/drawing/2016/5/11/chartex" xmlns:cx6="http://schemas.microsoft.com/office/drawing/2016/5/12/chartex" xmlns:cx7="http://schemas.microsoft.com/office/drawing/2016/5/13/chartex" xmlns:cx8="http://schemas.microsoft.com/office/drawing/2016/5/14/chartex" xmlns:mc="http://schemas.openxmlformats.org/markup-compatibility/2006" xmlns:aink="http://schemas.microsoft.com/office/drawing/2016/ink" xmlns:am3d="http://schemas.microsoft.com/office/drawing/2017/model3d" xmlns:o="urn:schemas-microsoft-com:office:office" xmlns:oel="http://schemas.microsoft.com/office/2019/extlst" xmlns:r="http://schemas.openxmlformats.org/officeDocument/2006/relationships" xmlns:m="http://schemas.openxmlformats.org/officeDocument/2006/math" xmlns:v="urn:schemas-microsoft-com:vml" xmlns:wp14="http://schemas.microsoft.com/office/word/2010/wordprocessingDrawing" xmlns:wp="http://schemas.openxmlformats.org/drawingml/2006/wordprocessingDrawing" xmlns:w10="urn:schemas-microsoft-com:office:word" xmlns:w="http://schemas.openxmlformats.org/wordprocessingml/2006/main" xmlns:w14="http://schemas.microsoft.com/office/word/2010/wordml" xmlns:w15="http://schemas.microsoft.com/office/word/2012/wordml" xmlns:w16cex="http://schemas.microsoft.com/office/word/2018/wordml/cex" xmlns:w16cid="http://schemas.microsoft.com/office/word/2016/wordml/cid" xmlns:w16="http://schemas.microsoft.com/office/word/2018/wordml" xmlns:w16du="http://schemas.microsoft.com/office/word/2023/wordml/word16du" xmlns:w16sdtdh="http://schemas.microsoft.com/office/word/2020/wordml/sdtdatahash" xmlns:w16sdtfl="http://schemas.microsoft.com/office/word/2024/wordml/sdtformatlock" xmlns:w16se="http://schemas.microsoft.com/office/word/2015/wordml/symex" xmlns:wpg="http://schemas.microsoft.com/office/word/2010/wordprocessingGroup" xmlns:wpi="http://schemas.microsoft.com/office/word/2010/wordprocessingInk" xmlns:wne="http://schemas.microsoft.com/office/word/2006/wordml" xmlns:wps="http://schemas.microsoft.com/office/word/2010/wordprocessingShape" mc:Ignorable="w14 w15 w16se w16cid w16 w16cex w16sdtdh w16sdtfl w16du wp14">
+  <w:p>
+    <w:pPr>
+      <w:pStyle w:val="Footer"/>
+    </w:pPr>
+    <w:r>
+      <w:rPr>
+        <w:noProof/>
+      </w:rPr>
+      <mc:AlternateContent>
+        <mc:Choice Requires="wps">
+          <w:drawing>
+            <wp:anchor distT="0" distB="0" distL="0" distR="0" simplePos="0" relativeHeight="251660288" behindDoc="0" locked="0" layoutInCell="1" allowOverlap="1" wp14:anchorId="6B50E1B2" wp14:editId="6BD4364E">
+              <wp:simplePos x="635" y="635"/>
+              <wp:positionH relativeFrom="page">
+                <wp:align>center</wp:align>
+              </wp:positionH>
+              <wp:positionV relativeFrom="page">
+                <wp:align>bottom</wp:align>
+              </wp:positionV>
+              <wp:extent cx="381635" cy="664845"/>
+              <wp:effectExtent l="0" t="0" r="18415" b="0"/>
+              <wp:wrapNone/>
+              <wp:docPr id="59044182" name="Text Box 1" descr="Internal">
+                <a:extLst xmlns:a="http://schemas.openxmlformats.org/drawingml/2006/main">
+                  <a:ext uri="{5AE41FA2-C0FF-4470-9BD4-5FADCA87CBE2}">
+                    <aclsh:classification xmlns:aclsh="http://schemas.microsoft.com/office/drawing/2020/classificationShape" classificationOutcomeType="ftr"/>
+                  </a:ext>
+                </a:extLst>
+              </wp:docPr>
+              <wp:cNvGraphicFramePr/>
+              <a:graphic xmlns:a="http://schemas.openxmlformats.org/drawingml/2006/main">
+                <a:graphicData uri="http://schemas.microsoft.com/office/word/2010/wordprocessingShape">
+                  <wps:wsp>
+                    <wps:cNvSpPr txBox="1"/>
+                    <wps:spPr>
+                      <a:xfrm>
+                        <a:off x="0" y="0"/>
+                        <a:ext cx="381635" cy="664845"/>
+                      </a:xfrm>
+                      <a:prstGeom prst="rect">
+                        <a:avLst/>
+                      </a:prstGeom>
+                      <a:noFill/>
+                      <a:ln>
+                        <a:noFill/>
+                      </a:ln>
+                    </wps:spPr>
+                    <wps:txbx>
+                      <w:txbxContent>
+                        <w:p>
+                          <w:pPr>
+                            <w:spacing w:after="0"/>
+                            <w:rPr>
+                              <w:rFonts w:ascii="Arial" w:eastAsia="Arial" w:hAnsi="Arial" w:cs="Arial"/>
+                              <w:noProof/>
+                              <w:color w:val="000000"/>
+                              <w:sz w:val="18"/>
+                              <w:szCs w:val="18"/>
+                            </w:rPr>
+                          </w:pPr>
+                          <w:r>
+                            <w:rPr>
+                              <w:rFonts w:ascii="Arial" w:eastAsia="Arial" w:hAnsi="Arial" w:cs="Arial"/>
+                              <w:noProof/>
+                              <w:color w:val="000000"/>
+                              <w:sz w:val="18"/>
+                              <w:szCs w:val="18"/>
+                            </w:rPr>
+                            <w:t>Internal</w:t>
+                          </w:r>
+                        </w:p>
+                      </w:txbxContent>
+                    </wps:txbx>
+                    <wps:bodyPr rot="0" spcFirstLastPara="0" vertOverflow="overflow" horzOverflow="overflow" vert="horz" wrap="none" lIns="0" tIns="0" rIns="0" bIns="355600" numCol="1" spcCol="0" rtlCol="0" fromWordArt="0" anchor="b" anchorCtr="0" forceAA="0" compatLnSpc="1">
+                      <a:prstTxWarp prst="textNoShape">
+                        <a:avLst/>
+                      </a:prstTxWarp>
+                      <a:spAutoFit/>
+                    </wps:bodyPr>
+                  </wps:wsp>
+                </a:graphicData>
+              </a:graphic>
+              <wp14:sizeRelH relativeFrom="margin">
+                <wp14:pctWidth>0</wp14:pctWidth>
+              </wp14:sizeRelH>
+              <wp14:sizeRelV relativeFrom="margin">
+                <wp14:pctHeight>0</wp14:pctHeight>
+              </wp14:sizeRelV>
+            </wp:anchor>
+          </w:drawing>
+        </mc:Choice>
+        <mc:Fallback>
+          <w:pict>
+            <v:shapetype w14:anchorId="6B50E1B2" id="_x0000_t202" coordsize="21600,21600" o:spt="202" path="m,l,21600r21600,l21600,xe">
+              <v:stroke joinstyle="miter"/>
+              <v:path gradientshapeok="t" o:connecttype="rect"/>
+            </v:shapetype>
+            <v:shape id="Text Box 1" o:spid="_x0000_s1028" type="#_x0000_t202" alt="Internal" style="position:absolute;margin-left:0;margin-top:0;width:30.05pt;height:52.35pt;z-index:251660288;visibility:visible;mso-wrap-style:none;mso-width-percent:0;mso-height-percent:0;mso-wrap-distance-left:0;mso-wrap-distance-top:0;mso-wrap-distance-right:0;mso-wrap-distance-bottom:0;mso-position-horizontal:center;mso-position-horizontal-relative:page;mso-position-vertical:bottom;mso-position-vertical-relative:page;mso-width-percent:0;mso-height-percent:0;mso-width-relative:margin;mso-height-relative:margin;v-text-anchor:bottom" o:gfxdata="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" filled="f" stroked="f">
+              <v:fill o:detectmouseclick="t"/>
+              <v:textbox style="mso-fit-shape-to-text:t" inset="0,0,0,28pt">
+                <w:txbxContent>
+                  <w:p>
+                    <w:pPr>
+                      <w:spacing w:after="0"/>
+                      <w:rPr>
+                        <w:rFonts w:ascii="Arial" w:eastAsia="Arial" w:hAnsi="Arial" w:cs="Arial"/>
+                        <w:noProof/>
+                        <w:color w:val="000000"/>
+                        <w:sz w:val="18"/>
+                        <w:szCs w:val="18"/>
+                      </w:rPr>
+                    </w:pPr>
+                    <w:r>
+                      <w:rPr>
+                        <w:rFonts w:ascii="Arial" w:eastAsia="Arial" w:hAnsi="Arial" w:cs="Arial"/>
+                        <w:noProof/>
+                        <w:color w:val="000000"/>
+                        <w:sz w:val="18"/>
+                        <w:szCs w:val="18"/>
+                      </w:rPr>
+                      <w:t>Internal</w:t>
+                    </w:r>
+                  </w:p>
+                </w:txbxContent>
+              </v:textbox>
+              <w10:wrap anchorx="page" anchory="page"/>
+            </v:shape>
+          </w:pict>
+        </mc:Fallback>
+      </mc:AlternateContent>
     </w:r>
   </w:p>
 </w:ftr>
@@ -1651,6 +1875,16 @@
 </file>
 
 <file path=word/header1.xml><?xml version="1.0" encoding="utf-8"?>
+<w:hdr xmlns:wpc="http://schemas.microsoft.com/office/word/2010/wordprocessingCanvas" xmlns:cx="http://schemas.microsoft.com/office/drawing/2014/chartex" xmlns:cx1="http://schemas.microsoft.com/office/drawing/2015/9/8/chartex" xmlns:cx2="http://schemas.microsoft.com/office/drawing/2015/10/21/chartex" xmlns:cx3="http://schemas.microsoft.com/office/drawing/2016/5/9/chartex" xmlns:cx4="http://schemas.microsoft.com/office/drawing/2016/5/10/chartex" xmlns:cx5="http://schemas.microsoft.com/office/drawing/2016/5/11/chartex" xmlns:cx6="http://schemas.microsoft.com/office/drawing/2016/5/12/chartex" xmlns:cx7="http://schemas.microsoft.com/office/drawing/2016/5/13/chartex" xmlns:cx8="http://schemas.microsoft.com/office/drawing/2016/5/14/chartex" xmlns:mc="http://schemas.openxmlformats.org/markup-compatibility/2006" xmlns:aink="http://schemas.microsoft.com/office/drawing/2016/ink" xmlns:am3d="http://schemas.microsoft.com/office/drawing/2017/model3d" xmlns:o="urn:schemas-microsoft-com:office:office" xmlns:oel="http://schemas.microsoft.com/office/2019/extlst" xmlns:r="http://schemas.openxmlformats.org/officeDocument/2006/relationships" xmlns:m="http://schemas.openxmlformats.org/officeDocument/2006/math" xmlns:v="urn:schemas-microsoft-com:vml" xmlns:wp14="http://schemas.microsoft.com/office/word/2010/wordprocessingDrawing" xmlns:wp="http://schemas.openxmlformats.org/drawingml/2006/wordprocessingDrawing" xmlns:w10="urn:schemas-microsoft-com:office:word" xmlns:w="http://schemas.openxmlformats.org/wordprocessingml/2006/main" xmlns:w14="http://schemas.microsoft.com/office/word/2010/wordml" xmlns:w15="http://schemas.microsoft.com/office/word/2012/wordml" xmlns:w16cex="http://schemas.microsoft.com/office/word/2018/wordml/cex" xmlns:w16cid="http://schemas.microsoft.com/office/word/2016/wordml/cid" xmlns:w16="http://schemas.microsoft.com/office/word/2018/wordml" xmlns:w16du="http://schemas.microsoft.com/office/word/2023/wordml/word16du" xmlns:w16sdtdh="http://schemas.microsoft.com/office/word/2020/wordml/sdtdatahash" xmlns:w16sdtfl="http://schemas.microsoft.com/office/word/2024/wordml/sdtformatlock" xmlns:w16se="http://schemas.microsoft.com/office/word/2015/wordml/symex" xmlns:wpg="http://schemas.microsoft.com/office/word/2010/wordprocessingGroup" xmlns:wpi="http://schemas.microsoft.com/office/word/2010/wordprocessingInk" xmlns:wne="http://schemas.microsoft.com/office/word/2006/wordml" xmlns:wps="http://schemas.microsoft.com/office/word/2010/wordprocessingShape" mc:Ignorable="w14 w15 w16se w16cid w16 w16cex w16sdtdh w16sdtfl w16du wp14">
+  <w:p>
+    <w:pPr>
+      <w:pStyle w:val="Header"/>
+    </w:pPr>
+  </w:p>
+</w:hdr>
+</file>
+
+<file path=word/header2.xml><?xml version="1.0" encoding="utf-8"?>
 <w:hdr xmlns:wpc="http://schemas.microsoft.com/office/word/2010/wordprocessingCanvas" xmlns:cx="http://schemas.microsoft.com/office/drawing/2014/chartex" xmlns:cx1="http://schemas.microsoft.com/office/drawing/2015/9/8/chartex" xmlns:cx2="http://schemas.microsoft.com/office/drawing/2015/10/21/chartex" xmlns:cx3="http://schemas.microsoft.com/office/drawing/2016/5/9/chartex" xmlns:cx4="http://schemas.microsoft.com/office/drawing/2016/5/10/chartex" xmlns:cx5="http://schemas.microsoft.com/office/drawing/2016/5/11/chartex" xmlns:cx6="http://schemas.microsoft.com/office/drawing/2016/5/12/chartex" xmlns:cx7="http://schemas.microsoft.com/office/drawing/2016/5/13/chartex" xmlns:cx8="http://schemas.microsoft.com/office/drawing/2016/5/14/chartex" xmlns:mc="http://schemas.openxmlformats.org/markup-compatibility/2006" xmlns:aink="http://schemas.microsoft.com/office/drawing/2016/ink" xmlns:am3d="http://schemas.microsoft.com/office/drawing/2017/model3d" xmlns:o="urn:schemas-microsoft-com:office:office" xmlns:oel="http://schemas.microsoft.com/office/2019/extlst" xmlns:r="http://schemas.openxmlformats.org/officeDocument/2006/relationships" xmlns:m="http://schemas.openxmlformats.org/officeDocument/2006/math" xmlns:v="urn:schemas-microsoft-com:vml" xmlns:wp14="http://schemas.microsoft.com/office/word/2010/wordprocessingDrawing" xmlns:wp="http://schemas.openxmlformats.org/drawingml/2006/wordprocessingDrawing" xmlns:w10="urn:schemas-microsoft-com:office:word" xmlns:w="http://schemas.openxmlformats.org/wordprocessingml/2006/main" xmlns:w14="http://schemas.microsoft.com/office/word/2010/wordml" xmlns:w15="http://schemas.microsoft.com/office/word/2012/wordml" xmlns:w16cex="http://schemas.microsoft.com/office/word/2018/wordml/cex" xmlns:w16cid="http://schemas.microsoft.com/office/word/2016/wordml/cid" xmlns:w16="http://schemas.microsoft.com/office/word/2018/wordml" xmlns:w16du="http://schemas.microsoft.com/office/word/2023/wordml/word16du" xmlns:w16sdtdh="http://schemas.microsoft.com/office/word/2020/wordml/sdtdatahash" xmlns:w16sdtfl="http://schemas.microsoft.com/office/word/2024/wordml/sdtformatlock" xmlns:w16se="http://schemas.microsoft.com/office/word/2015/wordml/symex" xmlns:wpg="http://schemas.microsoft.com/office/word/2010/wordprocessingGroup" xmlns:wpi="http://schemas.microsoft.com/office/word/2010/wordprocessingInk" xmlns:wne="http://schemas.microsoft.com/office/word/2006/wordml" xmlns:wps="http://schemas.microsoft.com/office/word/2010/wordprocessingShape" mc:Ignorable="w14 w15 w16se w16cid w16 w16cex w16sdtdh w16sdtfl w16du wp14">
   <w:p>
     <w:pPr>
@@ -1829,27 +2063,7 @@
         <w:sz w:val="30"/>
         <w:szCs w:val="30"/>
       </w:rPr>
-      <w:t>{{</w:t>
-    </w:r>
-    <w:proofErr w:type="spellStart"/>
-    <w:r>
-      <w:rPr>
-        <w:b/>
-        <w:bCs/>
-        <w:sz w:val="30"/>
-        <w:szCs w:val="30"/>
-      </w:rPr>
-      <w:t>InvoiceId</w:t>
-    </w:r>
-    <w:proofErr w:type="spellEnd"/>
-    <w:r>
-      <w:rPr>
-        <w:b/>
-        <w:bCs/>
-        <w:sz w:val="30"/>
-        <w:szCs w:val="30"/>
-      </w:rPr>
-      <w:t>}}</w:t>
+      <w:t>{{InvoiceId}}</w:t>
     </w:r>
     <w:r>
       <w:rPr>
@@ -1942,25 +2156,7 @@
         <w:szCs w:val="20"/>
         <w14:ligatures w14:val="none"/>
       </w:rPr>
-      <w:t>{{</w:t>
-    </w:r>
-    <w:proofErr w:type="spellStart"/>
-    <w:r>
-      <w:rPr>
-        <w:kern w:val="0"/>
-        <w:szCs w:val="20"/>
-        <w14:ligatures w14:val="none"/>
-      </w:rPr>
-      <w:t>InvoiceCreatedDate</w:t>
-    </w:r>
-    <w:proofErr w:type="spellEnd"/>
-    <w:r>
-      <w:rPr>
-        <w:kern w:val="0"/>
-        <w:szCs w:val="20"/>
-        <w14:ligatures w14:val="none"/>
-      </w:rPr>
-      <w:t>}}</w:t>
+      <w:t>{{InvoiceCreatedDate}}</w:t>
     </w:r>
     <w:r>
       <w:rPr>
@@ -1993,7 +2189,21 @@
         <w:noProof/>
         <w:szCs w:val="20"/>
       </w:rPr>
-      <w:t>PO Box 9601 STN Prov Gov</w:t>
+      <w:t>PO Box 960</w:t>
+    </w:r>
+    <w:r>
+      <w:rPr>
+        <w:noProof/>
+        <w:szCs w:val="20"/>
+      </w:rPr>
+      <w:t>4</w:t>
+    </w:r>
+    <w:r>
+      <w:rPr>
+        <w:noProof/>
+        <w:szCs w:val="20"/>
+      </w:rPr>
+      <w:t xml:space="preserve"> STN Prov Gov</w:t>
     </w:r>
     <w:r>
       <w:rPr>
@@ -2010,6 +2220,16 @@
         <w:noProof/>
         <w:sz w:val="22"/>
       </w:rPr>
+    </w:pPr>
+  </w:p>
+</w:hdr>
+</file>
+
+<file path=word/header3.xml><?xml version="1.0" encoding="utf-8"?>
+<w:hdr xmlns:wpc="http://schemas.microsoft.com/office/word/2010/wordprocessingCanvas" xmlns:cx="http://schemas.microsoft.com/office/drawing/2014/chartex" xmlns:cx1="http://schemas.microsoft.com/office/drawing/2015/9/8/chartex" xmlns:cx2="http://schemas.microsoft.com/office/drawing/2015/10/21/chartex" xmlns:cx3="http://schemas.microsoft.com/office/drawing/2016/5/9/chartex" xmlns:cx4="http://schemas.microsoft.com/office/drawing/2016/5/10/chartex" xmlns:cx5="http://schemas.microsoft.com/office/drawing/2016/5/11/chartex" xmlns:cx6="http://schemas.microsoft.com/office/drawing/2016/5/12/chartex" xmlns:cx7="http://schemas.microsoft.com/office/drawing/2016/5/13/chartex" xmlns:cx8="http://schemas.microsoft.com/office/drawing/2016/5/14/chartex" xmlns:mc="http://schemas.openxmlformats.org/markup-compatibility/2006" xmlns:aink="http://schemas.microsoft.com/office/drawing/2016/ink" xmlns:am3d="http://schemas.microsoft.com/office/drawing/2017/model3d" xmlns:o="urn:schemas-microsoft-com:office:office" xmlns:oel="http://schemas.microsoft.com/office/2019/extlst" xmlns:r="http://schemas.openxmlformats.org/officeDocument/2006/relationships" xmlns:m="http://schemas.openxmlformats.org/officeDocument/2006/math" xmlns:v="urn:schemas-microsoft-com:vml" xmlns:wp14="http://schemas.microsoft.com/office/word/2010/wordprocessingDrawing" xmlns:wp="http://schemas.openxmlformats.org/drawingml/2006/wordprocessingDrawing" xmlns:w10="urn:schemas-microsoft-com:office:word" xmlns:w="http://schemas.openxmlformats.org/wordprocessingml/2006/main" xmlns:w14="http://schemas.microsoft.com/office/word/2010/wordml" xmlns:w15="http://schemas.microsoft.com/office/word/2012/wordml" xmlns:w16cex="http://schemas.microsoft.com/office/word/2018/wordml/cex" xmlns:w16cid="http://schemas.microsoft.com/office/word/2016/wordml/cid" xmlns:w16="http://schemas.microsoft.com/office/word/2018/wordml" xmlns:w16du="http://schemas.microsoft.com/office/word/2023/wordml/word16du" xmlns:w16sdtdh="http://schemas.microsoft.com/office/word/2020/wordml/sdtdatahash" xmlns:w16sdtfl="http://schemas.microsoft.com/office/word/2024/wordml/sdtformatlock" xmlns:w16se="http://schemas.microsoft.com/office/word/2015/wordml/symex" xmlns:wpg="http://schemas.microsoft.com/office/word/2010/wordprocessingGroup" xmlns:wpi="http://schemas.microsoft.com/office/word/2010/wordprocessingInk" xmlns:wne="http://schemas.microsoft.com/office/word/2006/wordml" xmlns:wps="http://schemas.microsoft.com/office/word/2010/wordprocessingShape" mc:Ignorable="w14 w15 w16se w16cid w16 w16cex w16sdtdh w16sdtfl w16du wp14">
+  <w:p>
+    <w:pPr>
+      <w:pStyle w:val="Header"/>
     </w:pPr>
   </w:p>
 </w:hdr>
@@ -2851,6 +3071,7 @@
 
 <file path=docMetadata/LabelInfo.xml><?xml version="1.0" encoding="utf-8"?>
 <clbl:labelList xmlns:clbl="http://schemas.microsoft.com/office/2020/mipLabelMetadata">
+  <clbl:label id="{4af293e6-3850-4258-b2c7-0aa0e3bfa7d9}" enabled="1" method="Privileged" siteId="{b9fec68c-c92d-461e-9a97-3d03a0f18b82}" contentBits="3" removed="0"/>
   <clbl:label id="{e0793d39-0939-496d-b129-198edd916feb}" enabled="0" method="" siteId="{e0793d39-0939-496d-b129-198edd916feb}" removed="1"/>
 </clbl:labelList>
 </file>
</xml_diff>

<commit_message>
BCMOHAM-31884-V1 || Updated the address from 9601 to 9604
</commit_message>
<xml_diff>
--- a/ALR-DocgenTemplates/Application Fee Receipt Template.docx
+++ b/ALR-DocgenTemplates/Application Fee Receipt Template.docx
@@ -12,12 +12,8 @@
           <w:szCs w:val="34"/>
         </w:rPr>
         <w:sectPr>
-          <w:headerReference w:type="even" r:id="rId6"/>
-          <w:headerReference w:type="default" r:id="rId7"/>
-          <w:footerReference w:type="even" r:id="rId8"/>
-          <w:footerReference w:type="default" r:id="rId9"/>
-          <w:headerReference w:type="first" r:id="rId10"/>
-          <w:footerReference w:type="first" r:id="rId11"/>
+          <w:headerReference w:type="default" r:id="rId6"/>
+          <w:footerReference w:type="default" r:id="rId7"/>
           <w:pgSz w:w="12240" w:h="15840"/>
           <w:pgMar w:top="720" w:right="720" w:bottom="720" w:left="720" w:header="708" w:footer="708" w:gutter="0"/>
           <w:cols w:space="708"/>
@@ -136,7 +132,29 @@
                 <w:szCs w:val="24"/>
                 <w14:ligatures w14:val="none"/>
               </w:rPr>
-              <w:t>{{RegistrantName}}</w:t>
+              <w:t>{{</w:t>
+            </w:r>
+            <w:proofErr w:type="spellStart"/>
+            <w:r>
+              <w:rPr>
+                <w:color w:val="000000" w:themeColor="text1"/>
+                <w:kern w:val="0"/>
+                <w:sz w:val="24"/>
+                <w:szCs w:val="24"/>
+                <w14:ligatures w14:val="none"/>
+              </w:rPr>
+              <w:t>RegistrantName</w:t>
+            </w:r>
+            <w:proofErr w:type="spellEnd"/>
+            <w:r>
+              <w:rPr>
+                <w:color w:val="000000" w:themeColor="text1"/>
+                <w:kern w:val="0"/>
+                <w:sz w:val="24"/>
+                <w:szCs w:val="24"/>
+                <w14:ligatures w14:val="none"/>
+              </w:rPr>
+              <w:t>}}</w:t>
             </w:r>
           </w:p>
         </w:tc>
@@ -161,7 +179,29 @@
                 <w:szCs w:val="24"/>
                 <w14:ligatures w14:val="none"/>
               </w:rPr>
-              <w:t>{{ResidenceName}}</w:t>
+              <w:t>{{</w:t>
+            </w:r>
+            <w:proofErr w:type="spellStart"/>
+            <w:r>
+              <w:rPr>
+                <w:color w:val="000000" w:themeColor="text1"/>
+                <w:kern w:val="0"/>
+                <w:sz w:val="24"/>
+                <w:szCs w:val="24"/>
+                <w14:ligatures w14:val="none"/>
+              </w:rPr>
+              <w:t>ResidenceName</w:t>
+            </w:r>
+            <w:proofErr w:type="spellEnd"/>
+            <w:r>
+              <w:rPr>
+                <w:color w:val="000000" w:themeColor="text1"/>
+                <w:kern w:val="0"/>
+                <w:sz w:val="24"/>
+                <w:szCs w:val="24"/>
+                <w14:ligatures w14:val="none"/>
+              </w:rPr>
+              <w:t>}}</w:t>
             </w:r>
           </w:p>
         </w:tc>
@@ -191,7 +231,29 @@
                 <w:szCs w:val="24"/>
                 <w14:ligatures w14:val="none"/>
               </w:rPr>
-              <w:t>{{RegistrantAddress}}</w:t>
+              <w:t>{{</w:t>
+            </w:r>
+            <w:proofErr w:type="spellStart"/>
+            <w:r>
+              <w:rPr>
+                <w:color w:val="000000" w:themeColor="text1"/>
+                <w:kern w:val="0"/>
+                <w:sz w:val="24"/>
+                <w:szCs w:val="24"/>
+                <w14:ligatures w14:val="none"/>
+              </w:rPr>
+              <w:t>RegistrantAddress</w:t>
+            </w:r>
+            <w:proofErr w:type="spellEnd"/>
+            <w:r>
+              <w:rPr>
+                <w:color w:val="000000" w:themeColor="text1"/>
+                <w:kern w:val="0"/>
+                <w:sz w:val="24"/>
+                <w:szCs w:val="24"/>
+                <w14:ligatures w14:val="none"/>
+              </w:rPr>
+              <w:t>}}</w:t>
             </w:r>
           </w:p>
         </w:tc>
@@ -294,7 +356,25 @@
                 <w:sz w:val="24"/>
                 <w:szCs w:val="24"/>
               </w:rPr>
-              <w:t>{{ResidenceAddress}}</w:t>
+              <w:t>{{</w:t>
+            </w:r>
+            <w:proofErr w:type="spellStart"/>
+            <w:r>
+              <w:rPr>
+                <w:color w:val="000000" w:themeColor="text1"/>
+                <w:sz w:val="24"/>
+                <w:szCs w:val="24"/>
+              </w:rPr>
+              <w:t>ResidenceAddress</w:t>
+            </w:r>
+            <w:proofErr w:type="spellEnd"/>
+            <w:r>
+              <w:rPr>
+                <w:color w:val="000000" w:themeColor="text1"/>
+                <w:sz w:val="24"/>
+                <w:szCs w:val="24"/>
+              </w:rPr>
+              <w:t>}}</w:t>
             </w:r>
             <w:bookmarkEnd w:id="1"/>
           </w:p>
@@ -457,7 +537,25 @@
                 <w:sz w:val="22"/>
                 <w14:ligatures w14:val="none"/>
               </w:rPr>
-              <w:t>{{#InvoiceItem}}{{Name}}</w:t>
+              <w:t>{{#InvoiceItem</w:t>
+            </w:r>
+            <w:proofErr w:type="gramStart"/>
+            <w:r>
+              <w:rPr>
+                <w:kern w:val="0"/>
+                <w:sz w:val="22"/>
+                <w14:ligatures w14:val="none"/>
+              </w:rPr>
+              <w:t>}}{</w:t>
+            </w:r>
+            <w:proofErr w:type="gramEnd"/>
+            <w:r>
+              <w:rPr>
+                <w:kern w:val="0"/>
+                <w:sz w:val="22"/>
+                <w14:ligatures w14:val="none"/>
+              </w:rPr>
+              <w:t>{Name}}</w:t>
             </w:r>
           </w:p>
         </w:tc>
@@ -554,7 +652,27 @@
                 <w:sz w:val="22"/>
                 <w14:ligatures w14:val="none"/>
               </w:rPr>
-              <w:t>{{Fees}}{{/I</w:t>
+              <w:t>{{Fees</w:t>
+            </w:r>
+            <w:proofErr w:type="gramStart"/>
+            <w:r>
+              <w:rPr>
+                <w:rStyle w:val="ui-provider"/>
+                <w:kern w:val="0"/>
+                <w:sz w:val="22"/>
+                <w14:ligatures w14:val="none"/>
+              </w:rPr>
+              <w:t>}}{</w:t>
+            </w:r>
+            <w:proofErr w:type="gramEnd"/>
+            <w:r>
+              <w:rPr>
+                <w:rStyle w:val="ui-provider"/>
+                <w:kern w:val="0"/>
+                <w:sz w:val="22"/>
+                <w14:ligatures w14:val="none"/>
+              </w:rPr>
+              <w:t>{/I</w:t>
             </w:r>
             <w:r>
               <w:rPr>
@@ -865,9 +983,9 @@
     </w:p>
     <w:tbl>
       <w:tblPr>
-        <w:tblStyle w:val="TableGrid1"/>
-        <w:tblW w:w="10435" w:type="dxa"/>
-        <w:tblInd w:w="0" w:type="dxa"/>
+        <w:tblStyle w:val="TableGrid"/>
+        <w:tblW w:w="10773" w:type="dxa"/>
+        <w:tblInd w:w="421" w:type="dxa"/>
         <w:tblBorders>
           <w:top w:val="none" w:sz="0" w:space="0" w:color="auto"/>
           <w:left w:val="none" w:sz="0" w:space="0" w:color="auto"/>
@@ -876,29 +994,31 @@
           <w:insideH w:val="none" w:sz="0" w:space="0" w:color="auto"/>
           <w:insideV w:val="none" w:sz="0" w:space="0" w:color="auto"/>
         </w:tblBorders>
+        <w:tblLayout w:type="fixed"/>
         <w:tblLook w:val="04A0" w:firstRow="1" w:lastRow="0" w:firstColumn="1" w:lastColumn="0" w:noHBand="0" w:noVBand="1"/>
       </w:tblPr>
       <w:tblGrid>
-        <w:gridCol w:w="4721"/>
-        <w:gridCol w:w="3457"/>
-        <w:gridCol w:w="2257"/>
+        <w:gridCol w:w="4677"/>
+        <w:gridCol w:w="1418"/>
+        <w:gridCol w:w="4678"/>
       </w:tblGrid>
       <w:tr>
-        <w:trPr>
-          <w:trHeight w:val="168"/>
-        </w:trPr>
         <w:tc>
           <w:tcPr>
-            <w:tcW w:w="4721" w:type="dxa"/>
-            <w:hideMark/>
+            <w:tcW w:w="4677" w:type="dxa"/>
           </w:tcPr>
           <w:p>
             <w:pPr>
+              <w:tabs>
+                <w:tab w:val="left" w:pos="2880"/>
+              </w:tabs>
               <w:rPr>
                 <w:noProof/>
                 <w:sz w:val="22"/>
               </w:rPr>
             </w:pPr>
+            <w:bookmarkStart w:id="3" w:name="OLE_LINK6"/>
+            <w:proofErr w:type="gramStart"/>
             <w:r>
               <w:rPr>
                 <w:b/>
@@ -907,112 +1027,214 @@
                 <w:sz w:val="24"/>
                 <w:szCs w:val="24"/>
               </w:rPr>
-              <w:t xml:space="preserve">     </w:t>
-            </w:r>
-            <w:bookmarkStart w:id="3" w:name="OLE_LINK6"/>
-            <w:r>
-              <w:rPr>
-                <w:b/>
-                <w:bCs/>
-                <w:color w:val="000000" w:themeColor="text1"/>
-                <w:sz w:val="24"/>
-                <w:szCs w:val="24"/>
-              </w:rPr>
-              <w:t xml:space="preserve">Registration: </w:t>
-            </w:r>
-            <w:r>
-              <w:rPr>
-                <w:color w:val="000000" w:themeColor="text1"/>
-                <w:sz w:val="19"/>
-                <w:szCs w:val="19"/>
-              </w:rPr>
-              <w:t>{{IF_isCertificateIdNotPresent}}</w:t>
+              <w:t>Registration:</w:t>
+            </w:r>
+            <w:r>
+              <w:rPr>
+                <w:color w:val="000000" w:themeColor="text1"/>
+                <w:szCs w:val="20"/>
+              </w:rPr>
+              <w:t>{</w:t>
+            </w:r>
+            <w:proofErr w:type="gramEnd"/>
+            <w:r>
+              <w:rPr>
+                <w:color w:val="000000" w:themeColor="text1"/>
+                <w:szCs w:val="20"/>
+              </w:rPr>
+              <w:t>{</w:t>
+            </w:r>
+            <w:proofErr w:type="spellStart"/>
+            <w:r>
+              <w:rPr>
+                <w:color w:val="000000" w:themeColor="text1"/>
+                <w:szCs w:val="20"/>
+              </w:rPr>
+              <w:t>IF_isCertificateIdNotPresent</w:t>
+            </w:r>
+            <w:proofErr w:type="spellEnd"/>
+            <w:r>
+              <w:rPr>
+                <w:color w:val="000000" w:themeColor="text1"/>
+                <w:szCs w:val="20"/>
+              </w:rPr>
+              <w:t>}}</w:t>
             </w:r>
           </w:p>
         </w:tc>
         <w:tc>
           <w:tcPr>
-            <w:tcW w:w="3457" w:type="dxa"/>
-            <w:hideMark/>
+            <w:tcW w:w="1418" w:type="dxa"/>
           </w:tcPr>
           <w:p>
             <w:pPr>
+              <w:tabs>
+                <w:tab w:val="left" w:pos="2880"/>
+              </w:tabs>
               <w:rPr>
                 <w:noProof/>
                 <w:sz w:val="22"/>
               </w:rPr>
             </w:pPr>
-            <w:r>
-              <w:rPr>
-                <w:b/>
-                <w:bCs/>
-                <w:color w:val="000000" w:themeColor="text1"/>
-                <w:sz w:val="24"/>
-                <w:szCs w:val="24"/>
-              </w:rPr>
-              <w:t xml:space="preserve">             </w:t>
-            </w:r>
-            <w:r>
-              <w:rPr>
-                <w:b/>
-                <w:bCs/>
-                <w:color w:val="000000" w:themeColor="text1"/>
-                <w:sz w:val="24"/>
-                <w:szCs w:val="24"/>
-              </w:rPr>
-              <w:t xml:space="preserve">  </w:t>
-            </w:r>
-            <w:r>
-              <w:rPr>
-                <w:b/>
-                <w:bCs/>
-                <w:color w:val="000000" w:themeColor="text1"/>
-                <w:sz w:val="24"/>
-                <w:szCs w:val="24"/>
-              </w:rPr>
-              <w:t>Invoice total:</w:t>
-            </w:r>
           </w:p>
         </w:tc>
         <w:tc>
           <w:tcPr>
-            <w:tcW w:w="2257" w:type="dxa"/>
-            <w:hideMark/>
+            <w:tcW w:w="4678" w:type="dxa"/>
           </w:tcPr>
           <w:p>
             <w:pPr>
-              <w:jc w:val="right"/>
+              <w:tabs>
+                <w:tab w:val="left" w:pos="2880"/>
+              </w:tabs>
               <w:rPr>
                 <w:noProof/>
                 <w:sz w:val="22"/>
               </w:rPr>
             </w:pPr>
-            <w:bookmarkStart w:id="4" w:name="OLE_LINK14"/>
-            <w:r>
-              <w:rPr>
-                <w:color w:val="000000" w:themeColor="text1"/>
-                <w:kern w:val="0"/>
-                <w:sz w:val="24"/>
-                <w:szCs w:val="24"/>
-                <w14:ligatures w14:val="none"/>
-              </w:rPr>
-              <w:t>{{TotalFeeAmount}}</w:t>
-            </w:r>
-            <w:bookmarkEnd w:id="4"/>
+            <w:r>
+              <w:rPr>
+                <w:b/>
+                <w:bCs/>
+                <w:color w:val="000000" w:themeColor="text1"/>
+                <w:sz w:val="24"/>
+                <w:szCs w:val="24"/>
+              </w:rPr>
+              <w:t>Invoice total:</w:t>
+            </w:r>
+            <w:r>
+              <w:rPr>
+                <w:color w:val="000000" w:themeColor="text1"/>
+                <w:kern w:val="0"/>
+                <w:sz w:val="24"/>
+                <w:szCs w:val="24"/>
+                <w14:ligatures w14:val="none"/>
+              </w:rPr>
+              <w:t xml:space="preserve"> </w:t>
+            </w:r>
+            <w:r>
+              <w:rPr>
+                <w:color w:val="000000" w:themeColor="text1"/>
+                <w:kern w:val="0"/>
+                <w:sz w:val="24"/>
+                <w:szCs w:val="24"/>
+                <w14:ligatures w14:val="none"/>
+              </w:rPr>
+              <w:t xml:space="preserve"> </w:t>
+            </w:r>
+            <w:r>
+              <w:rPr>
+                <w:color w:val="000000" w:themeColor="text1"/>
+                <w:kern w:val="0"/>
+                <w:sz w:val="24"/>
+                <w:szCs w:val="24"/>
+                <w14:ligatures w14:val="none"/>
+              </w:rPr>
+              <w:t xml:space="preserve">       </w:t>
+            </w:r>
+            <w:r>
+              <w:rPr>
+                <w:color w:val="000000" w:themeColor="text1"/>
+                <w:kern w:val="0"/>
+                <w:sz w:val="24"/>
+                <w:szCs w:val="24"/>
+                <w14:ligatures w14:val="none"/>
+              </w:rPr>
+              <w:t xml:space="preserve"> </w:t>
+            </w:r>
+            <w:proofErr w:type="gramStart"/>
+            <w:r>
+              <w:rPr>
+                <w:color w:val="000000" w:themeColor="text1"/>
+                <w:kern w:val="0"/>
+                <w:sz w:val="24"/>
+                <w:szCs w:val="24"/>
+                <w14:ligatures w14:val="none"/>
+              </w:rPr>
+              <w:t xml:space="preserve"> </w:t>
+            </w:r>
+            <w:r>
+              <w:rPr>
+                <w:color w:val="000000" w:themeColor="text1"/>
+                <w:kern w:val="0"/>
+                <w:sz w:val="24"/>
+                <w:szCs w:val="24"/>
+                <w14:ligatures w14:val="none"/>
+              </w:rPr>
+              <w:t xml:space="preserve"> </w:t>
+            </w:r>
+            <w:r>
+              <w:rPr>
+                <w:color w:val="000000" w:themeColor="text1"/>
+                <w:kern w:val="0"/>
+                <w:sz w:val="24"/>
+                <w:szCs w:val="24"/>
+                <w14:ligatures w14:val="none"/>
+              </w:rPr>
+              <w:t xml:space="preserve"> </w:t>
+            </w:r>
+            <w:r>
+              <w:rPr>
+                <w:color w:val="000000" w:themeColor="text1"/>
+                <w:kern w:val="0"/>
+                <w:sz w:val="24"/>
+                <w:szCs w:val="24"/>
+                <w14:ligatures w14:val="none"/>
+              </w:rPr>
+              <w:t>{</w:t>
+            </w:r>
+            <w:proofErr w:type="gramEnd"/>
+            <w:r>
+              <w:rPr>
+                <w:color w:val="000000" w:themeColor="text1"/>
+                <w:kern w:val="0"/>
+                <w:sz w:val="24"/>
+                <w:szCs w:val="24"/>
+                <w14:ligatures w14:val="none"/>
+              </w:rPr>
+              <w:t>{</w:t>
+            </w:r>
+            <w:proofErr w:type="spellStart"/>
+            <w:r>
+              <w:rPr>
+                <w:color w:val="000000" w:themeColor="text1"/>
+                <w:kern w:val="0"/>
+                <w:sz w:val="24"/>
+                <w:szCs w:val="24"/>
+                <w14:ligatures w14:val="none"/>
+              </w:rPr>
+              <w:t>TotalFeeAmount</w:t>
+            </w:r>
+            <w:proofErr w:type="spellEnd"/>
+            <w:r>
+              <w:rPr>
+                <w:color w:val="000000" w:themeColor="text1"/>
+                <w:kern w:val="0"/>
+                <w:sz w:val="24"/>
+                <w:szCs w:val="24"/>
+                <w14:ligatures w14:val="none"/>
+              </w:rPr>
+              <w:t>}}</w:t>
+            </w:r>
           </w:p>
         </w:tc>
       </w:tr>
       <w:tr>
-        <w:trPr>
-          <w:trHeight w:val="168"/>
-        </w:trPr>
         <w:tc>
           <w:tcPr>
-            <w:tcW w:w="4721" w:type="dxa"/>
-            <w:hideMark/>
+            <w:tcW w:w="4677" w:type="dxa"/>
           </w:tcPr>
           <w:p>
             <w:pPr>
+              <w:tabs>
+                <w:tab w:val="left" w:pos="2880"/>
+              </w:tabs>
+              <w:rPr>
+                <w:noProof/>
+                <w:sz w:val="22"/>
+              </w:rPr>
+            </w:pPr>
+            <w:r>
               <w:rPr>
                 <w:b/>
                 <w:bCs/>
@@ -1021,7 +1243,9 @@
                 <w:szCs w:val="24"/>
                 <w14:ligatures w14:val="none"/>
               </w:rPr>
-            </w:pPr>
+              <w:t xml:space="preserve">Payment </w:t>
+            </w:r>
+            <w:proofErr w:type="gramStart"/>
             <w:r>
               <w:rPr>
                 <w:b/>
@@ -1031,18 +1255,30 @@
                 <w:szCs w:val="24"/>
                 <w14:ligatures w14:val="none"/>
               </w:rPr>
-              <w:t xml:space="preserve">     Payment Date: </w:t>
-            </w:r>
-            <w:r>
-              <w:rPr>
-                <w:color w:val="000000" w:themeColor="text1"/>
-                <w:kern w:val="0"/>
-                <w:sz w:val="24"/>
-                <w:szCs w:val="24"/>
-                <w14:ligatures w14:val="none"/>
-              </w:rPr>
-              <w:t>{{</w:t>
-            </w:r>
+              <w:t>Date:</w:t>
+            </w:r>
+            <w:r>
+              <w:rPr>
+                <w:color w:val="000000" w:themeColor="text1"/>
+                <w:kern w:val="0"/>
+                <w:sz w:val="24"/>
+                <w:szCs w:val="24"/>
+                <w14:ligatures w14:val="none"/>
+              </w:rPr>
+              <w:t>{</w:t>
+            </w:r>
+            <w:proofErr w:type="gramEnd"/>
+            <w:r>
+              <w:rPr>
+                <w:color w:val="000000" w:themeColor="text1"/>
+                <w:kern w:val="0"/>
+                <w:sz w:val="24"/>
+                <w:szCs w:val="24"/>
+                <w14:ligatures w14:val="none"/>
+              </w:rPr>
+              <w:t>{</w:t>
+            </w:r>
+            <w:proofErr w:type="spellStart"/>
             <w:r>
               <w:rPr>
                 <w:kern w:val="0"/>
@@ -1058,231 +1294,272 @@
                 <w:szCs w:val="24"/>
                 <w14:ligatures w14:val="none"/>
               </w:rPr>
-              <w:t>nvoicePaymentDate}}</w:t>
+              <w:t>nvoicePaymentDate</w:t>
+            </w:r>
+            <w:proofErr w:type="spellEnd"/>
+            <w:r>
+              <w:rPr>
+                <w:color w:val="000000" w:themeColor="text1"/>
+                <w:kern w:val="0"/>
+                <w:sz w:val="24"/>
+                <w:szCs w:val="24"/>
+                <w14:ligatures w14:val="none"/>
+              </w:rPr>
+              <w:t>}}</w:t>
             </w:r>
           </w:p>
         </w:tc>
         <w:tc>
           <w:tcPr>
-            <w:tcW w:w="3457" w:type="dxa"/>
-            <w:hideMark/>
+            <w:tcW w:w="1418" w:type="dxa"/>
           </w:tcPr>
           <w:p>
             <w:pPr>
-              <w:jc w:val="center"/>
-              <w:rPr>
-                <w:b/>
-                <w:bCs/>
-                <w:kern w:val="0"/>
-                <w:sz w:val="24"/>
-                <w:szCs w:val="24"/>
-                <w14:ligatures w14:val="none"/>
+              <w:tabs>
+                <w:tab w:val="left" w:pos="2880"/>
+              </w:tabs>
+              <w:rPr>
+                <w:noProof/>
+                <w:sz w:val="22"/>
               </w:rPr>
             </w:pPr>
-            <w:r>
-              <w:rPr>
-                <w:b/>
-                <w:bCs/>
-                <w:kern w:val="0"/>
-                <w:sz w:val="24"/>
-                <w:szCs w:val="24"/>
-                <w14:ligatures w14:val="none"/>
-              </w:rPr>
-              <w:t xml:space="preserve">             </w:t>
-            </w:r>
-            <w:r>
-              <w:rPr>
-                <w:b/>
-                <w:bCs/>
-                <w:kern w:val="0"/>
-                <w:sz w:val="24"/>
-                <w:szCs w:val="24"/>
-                <w14:ligatures w14:val="none"/>
-              </w:rPr>
-              <w:t xml:space="preserve"> </w:t>
-            </w:r>
-            <w:r>
-              <w:rPr>
-                <w:b/>
-                <w:bCs/>
-                <w:kern w:val="0"/>
-                <w:sz w:val="24"/>
-                <w:szCs w:val="24"/>
-                <w14:ligatures w14:val="none"/>
-              </w:rPr>
-              <w:t>Payment</w:t>
-            </w:r>
-            <w:r>
-              <w:rPr>
-                <w:b/>
-                <w:bCs/>
-                <w:kern w:val="0"/>
-                <w:sz w:val="24"/>
-                <w:szCs w:val="24"/>
-                <w14:ligatures w14:val="none"/>
-              </w:rPr>
-              <w:t xml:space="preserve"> R</w:t>
-            </w:r>
-            <w:r>
-              <w:rPr>
-                <w:b/>
-                <w:bCs/>
-                <w:kern w:val="0"/>
-                <w:sz w:val="24"/>
-                <w:szCs w:val="24"/>
-                <w14:ligatures w14:val="none"/>
-              </w:rPr>
-              <w:t>eceived:</w:t>
-            </w:r>
           </w:p>
         </w:tc>
         <w:tc>
           <w:tcPr>
-            <w:tcW w:w="2257" w:type="dxa"/>
-            <w:hideMark/>
+            <w:tcW w:w="4678" w:type="dxa"/>
           </w:tcPr>
           <w:p>
             <w:pPr>
-              <w:jc w:val="right"/>
-              <w:rPr>
-                <w:color w:val="000000" w:themeColor="text1"/>
-                <w:kern w:val="0"/>
-                <w:sz w:val="24"/>
-                <w:szCs w:val="24"/>
-                <w14:ligatures w14:val="none"/>
+              <w:tabs>
+                <w:tab w:val="left" w:pos="2880"/>
+              </w:tabs>
+              <w:rPr>
+                <w:noProof/>
+                <w:sz w:val="22"/>
               </w:rPr>
             </w:pPr>
             <w:r>
               <w:rPr>
-                <w:color w:val="000000" w:themeColor="text1"/>
-                <w:kern w:val="0"/>
-                <w:sz w:val="24"/>
-                <w:szCs w:val="24"/>
-                <w14:ligatures w14:val="none"/>
-              </w:rPr>
-              <w:t>{{TotalFeeAmount}}</w:t>
+                <w:b/>
+                <w:bCs/>
+                <w:kern w:val="0"/>
+                <w:sz w:val="24"/>
+                <w:szCs w:val="24"/>
+                <w14:ligatures w14:val="none"/>
+              </w:rPr>
+              <w:t>Payment Received</w:t>
+            </w:r>
+            <w:proofErr w:type="gramStart"/>
+            <w:r>
+              <w:rPr>
+                <w:b/>
+                <w:bCs/>
+                <w:kern w:val="0"/>
+                <w:sz w:val="24"/>
+                <w:szCs w:val="24"/>
+                <w14:ligatures w14:val="none"/>
+              </w:rPr>
+              <w:t>:</w:t>
+            </w:r>
+            <w:r>
+              <w:rPr>
+                <w:color w:val="000000" w:themeColor="text1"/>
+                <w:kern w:val="0"/>
+                <w:sz w:val="24"/>
+                <w:szCs w:val="24"/>
+                <w14:ligatures w14:val="none"/>
+              </w:rPr>
+              <w:t xml:space="preserve"> </w:t>
+            </w:r>
+            <w:r>
+              <w:rPr>
+                <w:color w:val="000000" w:themeColor="text1"/>
+                <w:kern w:val="0"/>
+                <w:sz w:val="24"/>
+                <w:szCs w:val="24"/>
+                <w14:ligatures w14:val="none"/>
+              </w:rPr>
+              <w:t xml:space="preserve"> </w:t>
+            </w:r>
+            <w:r>
+              <w:rPr>
+                <w:color w:val="000000" w:themeColor="text1"/>
+                <w:kern w:val="0"/>
+                <w:sz w:val="24"/>
+                <w:szCs w:val="24"/>
+                <w14:ligatures w14:val="none"/>
+              </w:rPr>
+              <w:t>{</w:t>
+            </w:r>
+            <w:proofErr w:type="gramEnd"/>
+            <w:r>
+              <w:rPr>
+                <w:color w:val="000000" w:themeColor="text1"/>
+                <w:kern w:val="0"/>
+                <w:sz w:val="24"/>
+                <w:szCs w:val="24"/>
+                <w14:ligatures w14:val="none"/>
+              </w:rPr>
+              <w:t>{</w:t>
+            </w:r>
+            <w:proofErr w:type="spellStart"/>
+            <w:r>
+              <w:rPr>
+                <w:color w:val="000000" w:themeColor="text1"/>
+                <w:kern w:val="0"/>
+                <w:sz w:val="24"/>
+                <w:szCs w:val="24"/>
+                <w14:ligatures w14:val="none"/>
+              </w:rPr>
+              <w:t>TotalFeeAmount</w:t>
+            </w:r>
+            <w:proofErr w:type="spellEnd"/>
+            <w:r>
+              <w:rPr>
+                <w:color w:val="000000" w:themeColor="text1"/>
+                <w:kern w:val="0"/>
+                <w:sz w:val="24"/>
+                <w:szCs w:val="24"/>
+                <w14:ligatures w14:val="none"/>
+              </w:rPr>
+              <w:t>}}</w:t>
             </w:r>
           </w:p>
         </w:tc>
       </w:tr>
       <w:tr>
-        <w:trPr>
-          <w:trHeight w:val="168"/>
-        </w:trPr>
         <w:tc>
           <w:tcPr>
-            <w:tcW w:w="4721" w:type="dxa"/>
-            <w:hideMark/>
+            <w:tcW w:w="4677" w:type="dxa"/>
           </w:tcPr>
           <w:p>
             <w:pPr>
-              <w:rPr>
-                <w:b/>
-                <w:bCs/>
-                <w:color w:val="000000" w:themeColor="text1"/>
-                <w:kern w:val="0"/>
-                <w:sz w:val="24"/>
-                <w:szCs w:val="24"/>
-                <w14:ligatures w14:val="none"/>
+              <w:tabs>
+                <w:tab w:val="left" w:pos="2880"/>
+              </w:tabs>
+              <w:rPr>
+                <w:noProof/>
+                <w:sz w:val="22"/>
               </w:rPr>
             </w:pPr>
-            <w:r>
-              <w:rPr>
-                <w:b/>
-                <w:bCs/>
-                <w:kern w:val="0"/>
-                <w:sz w:val="24"/>
-                <w:szCs w:val="24"/>
-                <w14:ligatures w14:val="none"/>
-              </w:rPr>
-              <w:t xml:space="preserve">     </w:t>
-            </w:r>
           </w:p>
         </w:tc>
         <w:tc>
           <w:tcPr>
-            <w:tcW w:w="3457" w:type="dxa"/>
-            <w:hideMark/>
+            <w:tcW w:w="1418" w:type="dxa"/>
           </w:tcPr>
           <w:p>
             <w:pPr>
-              <w:rPr>
-                <w:b/>
-                <w:bCs/>
-                <w:color w:val="000000" w:themeColor="text1"/>
-                <w:kern w:val="0"/>
-                <w:sz w:val="24"/>
-                <w:szCs w:val="24"/>
-                <w14:ligatures w14:val="none"/>
+              <w:tabs>
+                <w:tab w:val="left" w:pos="2880"/>
+              </w:tabs>
+              <w:rPr>
+                <w:noProof/>
+                <w:sz w:val="22"/>
               </w:rPr>
             </w:pPr>
-            <w:r>
-              <w:rPr>
-                <w:b/>
-                <w:bCs/>
-                <w:kern w:val="0"/>
-                <w:sz w:val="24"/>
-                <w:szCs w:val="24"/>
-                <w14:ligatures w14:val="none"/>
-              </w:rPr>
-              <w:t xml:space="preserve">              </w:t>
-            </w:r>
-            <w:r>
-              <w:rPr>
-                <w:b/>
-                <w:bCs/>
-                <w:kern w:val="0"/>
-                <w:sz w:val="24"/>
-                <w:szCs w:val="24"/>
-                <w14:ligatures w14:val="none"/>
-              </w:rPr>
-              <w:t xml:space="preserve"> </w:t>
-            </w:r>
-            <w:r>
-              <w:rPr>
-                <w:b/>
-                <w:bCs/>
-                <w:kern w:val="0"/>
-                <w:sz w:val="24"/>
-                <w:szCs w:val="24"/>
-                <w14:ligatures w14:val="none"/>
-              </w:rPr>
-              <w:t>Balance due:</w:t>
-            </w:r>
           </w:p>
         </w:tc>
         <w:tc>
           <w:tcPr>
-            <w:tcW w:w="2257" w:type="dxa"/>
-            <w:hideMark/>
+            <w:tcW w:w="4678" w:type="dxa"/>
           </w:tcPr>
           <w:p>
             <w:pPr>
-              <w:jc w:val="right"/>
+              <w:tabs>
+                <w:tab w:val="left" w:pos="2880"/>
+              </w:tabs>
+              <w:rPr>
+                <w:noProof/>
+                <w:sz w:val="22"/>
+              </w:rPr>
+            </w:pPr>
+            <w:r>
               <w:rPr>
                 <w:b/>
                 <w:bCs/>
-                <w:color w:val="000000" w:themeColor="text1"/>
-                <w:kern w:val="0"/>
-                <w:sz w:val="24"/>
-                <w:szCs w:val="24"/>
-                <w14:ligatures w14:val="none"/>
-              </w:rPr>
-            </w:pPr>
-            <w:r>
-              <w:rPr>
-                <w:color w:val="000000" w:themeColor="text1"/>
-                <w:kern w:val="0"/>
-                <w:sz w:val="24"/>
-                <w:szCs w:val="24"/>
-                <w14:ligatures w14:val="none"/>
-              </w:rPr>
-              <w:t xml:space="preserve">  $0.00</w:t>
+                <w:kern w:val="0"/>
+                <w:sz w:val="24"/>
+                <w:szCs w:val="24"/>
+                <w14:ligatures w14:val="none"/>
+              </w:rPr>
+              <w:t>Balance due:</w:t>
+            </w:r>
+            <w:r>
+              <w:rPr>
+                <w:color w:val="000000" w:themeColor="text1"/>
+                <w:kern w:val="0"/>
+                <w:sz w:val="24"/>
+                <w:szCs w:val="24"/>
+                <w14:ligatures w14:val="none"/>
+              </w:rPr>
+              <w:t xml:space="preserve"> </w:t>
+            </w:r>
+            <w:r>
+              <w:rPr>
+                <w:color w:val="000000" w:themeColor="text1"/>
+                <w:kern w:val="0"/>
+                <w:sz w:val="24"/>
+                <w:szCs w:val="24"/>
+                <w14:ligatures w14:val="none"/>
+              </w:rPr>
+              <w:t xml:space="preserve"> </w:t>
+            </w:r>
+            <w:r>
+              <w:rPr>
+                <w:color w:val="000000" w:themeColor="text1"/>
+                <w:kern w:val="0"/>
+                <w:sz w:val="24"/>
+                <w:szCs w:val="24"/>
+                <w14:ligatures w14:val="none"/>
+              </w:rPr>
+              <w:t xml:space="preserve">         </w:t>
+            </w:r>
+            <w:r>
+              <w:rPr>
+                <w:color w:val="000000" w:themeColor="text1"/>
+                <w:kern w:val="0"/>
+                <w:sz w:val="24"/>
+                <w:szCs w:val="24"/>
+                <w14:ligatures w14:val="none"/>
+              </w:rPr>
+              <w:t xml:space="preserve">   </w:t>
+            </w:r>
+            <w:r>
+              <w:rPr>
+                <w:color w:val="000000" w:themeColor="text1"/>
+                <w:kern w:val="0"/>
+                <w:sz w:val="24"/>
+                <w:szCs w:val="24"/>
+                <w14:ligatures w14:val="none"/>
+              </w:rPr>
+              <w:t xml:space="preserve">  </w:t>
+            </w:r>
+            <w:r>
+              <w:rPr>
+                <w:color w:val="000000" w:themeColor="text1"/>
+                <w:kern w:val="0"/>
+                <w:sz w:val="24"/>
+                <w:szCs w:val="24"/>
+                <w14:ligatures w14:val="none"/>
+              </w:rPr>
+              <w:t xml:space="preserve"> </w:t>
+            </w:r>
+            <w:r>
+              <w:rPr>
+                <w:color w:val="000000" w:themeColor="text1"/>
+                <w:kern w:val="0"/>
+                <w:sz w:val="24"/>
+                <w:szCs w:val="24"/>
+                <w14:ligatures w14:val="none"/>
+              </w:rPr>
+              <w:t>$0.00</w:t>
             </w:r>
           </w:p>
         </w:tc>
-        <w:bookmarkEnd w:id="3"/>
       </w:tr>
+      <w:bookmarkEnd w:id="3"/>
     </w:tbl>
     <w:p>
       <w:pPr>
@@ -1335,143 +1612,6 @@
 <w:ftr xmlns:wpc="http://schemas.microsoft.com/office/word/2010/wordprocessingCanvas" xmlns:cx="http://schemas.microsoft.com/office/drawing/2014/chartex" xmlns:cx1="http://schemas.microsoft.com/office/drawing/2015/9/8/chartex" xmlns:cx2="http://schemas.microsoft.com/office/drawing/2015/10/21/chartex" xmlns:cx3="http://schemas.microsoft.com/office/drawing/2016/5/9/chartex" xmlns:cx4="http://schemas.microsoft.com/office/drawing/2016/5/10/chartex" xmlns:cx5="http://schemas.microsoft.com/office/drawing/2016/5/11/chartex" xmlns:cx6="http://schemas.microsoft.com/office/drawing/2016/5/12/chartex" xmlns:cx7="http://schemas.microsoft.com/office/drawing/2016/5/13/chartex" xmlns:cx8="http://schemas.microsoft.com/office/drawing/2016/5/14/chartex" xmlns:mc="http://schemas.openxmlformats.org/markup-compatibility/2006" xmlns:aink="http://schemas.microsoft.com/office/drawing/2016/ink" xmlns:am3d="http://schemas.microsoft.com/office/drawing/2017/model3d" xmlns:o="urn:schemas-microsoft-com:office:office" xmlns:oel="http://schemas.microsoft.com/office/2019/extlst" xmlns:r="http://schemas.openxmlformats.org/officeDocument/2006/relationships" xmlns:m="http://schemas.openxmlformats.org/officeDocument/2006/math" xmlns:v="urn:schemas-microsoft-com:vml" xmlns:wp14="http://schemas.microsoft.com/office/word/2010/wordprocessingDrawing" xmlns:wp="http://schemas.openxmlformats.org/drawingml/2006/wordprocessingDrawing" xmlns:w10="urn:schemas-microsoft-com:office:word" xmlns:w="http://schemas.openxmlformats.org/wordprocessingml/2006/main" xmlns:w14="http://schemas.microsoft.com/office/word/2010/wordml" xmlns:w15="http://schemas.microsoft.com/office/word/2012/wordml" xmlns:w16cex="http://schemas.microsoft.com/office/word/2018/wordml/cex" xmlns:w16cid="http://schemas.microsoft.com/office/word/2016/wordml/cid" xmlns:w16="http://schemas.microsoft.com/office/word/2018/wordml" xmlns:w16du="http://schemas.microsoft.com/office/word/2023/wordml/word16du" xmlns:w16sdtdh="http://schemas.microsoft.com/office/word/2020/wordml/sdtdatahash" xmlns:w16sdtfl="http://schemas.microsoft.com/office/word/2024/wordml/sdtformatlock" xmlns:w16se="http://schemas.microsoft.com/office/word/2015/wordml/symex" xmlns:wpg="http://schemas.microsoft.com/office/word/2010/wordprocessingGroup" xmlns:wpi="http://schemas.microsoft.com/office/word/2010/wordprocessingInk" xmlns:wne="http://schemas.microsoft.com/office/word/2006/wordml" xmlns:wps="http://schemas.microsoft.com/office/word/2010/wordprocessingShape" mc:Ignorable="w14 w15 w16se w16cid w16 w16cex w16sdtdh w16sdtfl w16du wp14">
   <w:p>
     <w:pPr>
-      <w:pStyle w:val="Footer"/>
-    </w:pPr>
-    <w:r>
-      <w:rPr>
-        <w:noProof/>
-      </w:rPr>
-      <mc:AlternateContent>
-        <mc:Choice Requires="wps">
-          <w:drawing>
-            <wp:anchor distT="0" distB="0" distL="0" distR="0" simplePos="0" relativeHeight="251661312" behindDoc="0" locked="0" layoutInCell="1" allowOverlap="1" wp14:anchorId="2D66912B" wp14:editId="7B09FFF4">
-              <wp:simplePos x="635" y="635"/>
-              <wp:positionH relativeFrom="page">
-                <wp:align>center</wp:align>
-              </wp:positionH>
-              <wp:positionV relativeFrom="page">
-                <wp:align>bottom</wp:align>
-              </wp:positionV>
-              <wp:extent cx="381635" cy="664845"/>
-              <wp:effectExtent l="0" t="0" r="18415" b="0"/>
-              <wp:wrapNone/>
-              <wp:docPr id="1920128537" name="Text Box 2" descr="Internal">
-                <a:extLst xmlns:a="http://schemas.openxmlformats.org/drawingml/2006/main">
-                  <a:ext uri="{5AE41FA2-C0FF-4470-9BD4-5FADCA87CBE2}">
-                    <aclsh:classification xmlns:aclsh="http://schemas.microsoft.com/office/drawing/2020/classificationShape" classificationOutcomeType="ftr"/>
-                  </a:ext>
-                </a:extLst>
-              </wp:docPr>
-              <wp:cNvGraphicFramePr/>
-              <a:graphic xmlns:a="http://schemas.openxmlformats.org/drawingml/2006/main">
-                <a:graphicData uri="http://schemas.microsoft.com/office/word/2010/wordprocessingShape">
-                  <wps:wsp>
-                    <wps:cNvSpPr txBox="1"/>
-                    <wps:spPr>
-                      <a:xfrm>
-                        <a:off x="0" y="0"/>
-                        <a:ext cx="381635" cy="664845"/>
-                      </a:xfrm>
-                      <a:prstGeom prst="rect">
-                        <a:avLst/>
-                      </a:prstGeom>
-                      <a:noFill/>
-                      <a:ln>
-                        <a:noFill/>
-                      </a:ln>
-                    </wps:spPr>
-                    <wps:txbx>
-                      <w:txbxContent>
-                        <w:p>
-                          <w:pPr>
-                            <w:spacing w:after="0"/>
-                            <w:rPr>
-                              <w:rFonts w:ascii="Arial" w:eastAsia="Arial" w:hAnsi="Arial" w:cs="Arial"/>
-                              <w:noProof/>
-                              <w:color w:val="000000"/>
-                              <w:sz w:val="18"/>
-                              <w:szCs w:val="18"/>
-                            </w:rPr>
-                          </w:pPr>
-                          <w:r>
-                            <w:rPr>
-                              <w:rFonts w:ascii="Arial" w:eastAsia="Arial" w:hAnsi="Arial" w:cs="Arial"/>
-                              <w:noProof/>
-                              <w:color w:val="000000"/>
-                              <w:sz w:val="18"/>
-                              <w:szCs w:val="18"/>
-                            </w:rPr>
-                            <w:t>Internal</w:t>
-                          </w:r>
-                        </w:p>
-                      </w:txbxContent>
-                    </wps:txbx>
-                    <wps:bodyPr rot="0" spcFirstLastPara="0" vertOverflow="overflow" horzOverflow="overflow" vert="horz" wrap="none" lIns="0" tIns="0" rIns="0" bIns="355600" numCol="1" spcCol="0" rtlCol="0" fromWordArt="0" anchor="b" anchorCtr="0" forceAA="0" compatLnSpc="1">
-                      <a:prstTxWarp prst="textNoShape">
-                        <a:avLst/>
-                      </a:prstTxWarp>
-                      <a:spAutoFit/>
-                    </wps:bodyPr>
-                  </wps:wsp>
-                </a:graphicData>
-              </a:graphic>
-              <wp14:sizeRelH relativeFrom="margin">
-                <wp14:pctWidth>0</wp14:pctWidth>
-              </wp14:sizeRelH>
-              <wp14:sizeRelV relativeFrom="margin">
-                <wp14:pctHeight>0</wp14:pctHeight>
-              </wp14:sizeRelV>
-            </wp:anchor>
-          </w:drawing>
-        </mc:Choice>
-        <mc:Fallback>
-          <w:pict>
-            <v:shapetype w14:anchorId="2D66912B" id="_x0000_t202" coordsize="21600,21600" o:spt="202" path="m,l,21600r21600,l21600,xe">
-              <v:stroke joinstyle="miter"/>
-              <v:path gradientshapeok="t" o:connecttype="rect"/>
-            </v:shapetype>
-            <v:shape id="Text Box 2" o:spid="_x0000_s1026" type="#_x0000_t202" alt="Internal" style="position:absolute;margin-left:0;margin-top:0;width:30.05pt;height:52.35pt;z-index:251661312;visibility:visible;mso-wrap-style:none;mso-width-percent:0;mso-height-percent:0;mso-wrap-distance-left:0;mso-wrap-distance-top:0;mso-wrap-distance-right:0;mso-wrap-distance-bottom:0;mso-position-horizontal:center;mso-position-horizontal-relative:page;mso-position-vertical:bottom;mso-position-vertical-relative:page;mso-width-percent:0;mso-height-percent:0;mso-width-relative:margin;mso-height-relative:margin;v-text-anchor:bottom" o:gfxdata="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" filled="f" stroked="f">
-              <v:fill o:detectmouseclick="t"/>
-              <v:textbox style="mso-fit-shape-to-text:t" inset="0,0,0,28pt">
-                <w:txbxContent>
-                  <w:p>
-                    <w:pPr>
-                      <w:spacing w:after="0"/>
-                      <w:rPr>
-                        <w:rFonts w:ascii="Arial" w:eastAsia="Arial" w:hAnsi="Arial" w:cs="Arial"/>
-                        <w:noProof/>
-                        <w:color w:val="000000"/>
-                        <w:sz w:val="18"/>
-                        <w:szCs w:val="18"/>
-                      </w:rPr>
-                    </w:pPr>
-                    <w:r>
-                      <w:rPr>
-                        <w:rFonts w:ascii="Arial" w:eastAsia="Arial" w:hAnsi="Arial" w:cs="Arial"/>
-                        <w:noProof/>
-                        <w:color w:val="000000"/>
-                        <w:sz w:val="18"/>
-                        <w:szCs w:val="18"/>
-                      </w:rPr>
-                      <w:t>Internal</w:t>
-                    </w:r>
-                  </w:p>
-                </w:txbxContent>
-              </v:textbox>
-              <w10:wrap anchorx="page" anchory="page"/>
-            </v:shape>
-          </w:pict>
-        </mc:Fallback>
-      </mc:AlternateContent>
-    </w:r>
-  </w:p>
-</w:ftr>
-</file>
-
-<file path=word/footer2.xml><?xml version="1.0" encoding="utf-8"?>
-<w:ftr xmlns:wpc="http://schemas.microsoft.com/office/word/2010/wordprocessingCanvas" xmlns:cx="http://schemas.microsoft.com/office/drawing/2014/chartex" xmlns:cx1="http://schemas.microsoft.com/office/drawing/2015/9/8/chartex" xmlns:cx2="http://schemas.microsoft.com/office/drawing/2015/10/21/chartex" xmlns:cx3="http://schemas.microsoft.com/office/drawing/2016/5/9/chartex" xmlns:cx4="http://schemas.microsoft.com/office/drawing/2016/5/10/chartex" xmlns:cx5="http://schemas.microsoft.com/office/drawing/2016/5/11/chartex" xmlns:cx6="http://schemas.microsoft.com/office/drawing/2016/5/12/chartex" xmlns:cx7="http://schemas.microsoft.com/office/drawing/2016/5/13/chartex" xmlns:cx8="http://schemas.microsoft.com/office/drawing/2016/5/14/chartex" xmlns:mc="http://schemas.openxmlformats.org/markup-compatibility/2006" xmlns:aink="http://schemas.microsoft.com/office/drawing/2016/ink" xmlns:am3d="http://schemas.microsoft.com/office/drawing/2017/model3d" xmlns:o="urn:schemas-microsoft-com:office:office" xmlns:oel="http://schemas.microsoft.com/office/2019/extlst" xmlns:r="http://schemas.openxmlformats.org/officeDocument/2006/relationships" xmlns:m="http://schemas.openxmlformats.org/officeDocument/2006/math" xmlns:v="urn:schemas-microsoft-com:vml" xmlns:wp14="http://schemas.microsoft.com/office/word/2010/wordprocessingDrawing" xmlns:wp="http://schemas.openxmlformats.org/drawingml/2006/wordprocessingDrawing" xmlns:w10="urn:schemas-microsoft-com:office:word" xmlns:w="http://schemas.openxmlformats.org/wordprocessingml/2006/main" xmlns:w14="http://schemas.microsoft.com/office/word/2010/wordml" xmlns:w15="http://schemas.microsoft.com/office/word/2012/wordml" xmlns:w16cex="http://schemas.microsoft.com/office/word/2018/wordml/cex" xmlns:w16cid="http://schemas.microsoft.com/office/word/2016/wordml/cid" xmlns:w16="http://schemas.microsoft.com/office/word/2018/wordml" xmlns:w16du="http://schemas.microsoft.com/office/word/2023/wordml/word16du" xmlns:w16sdtdh="http://schemas.microsoft.com/office/word/2020/wordml/sdtdatahash" xmlns:w16sdtfl="http://schemas.microsoft.com/office/word/2024/wordml/sdtformatlock" xmlns:w16se="http://schemas.microsoft.com/office/word/2015/wordml/symex" xmlns:wpg="http://schemas.microsoft.com/office/word/2010/wordprocessingGroup" xmlns:wpi="http://schemas.microsoft.com/office/word/2010/wordprocessingInk" xmlns:wne="http://schemas.microsoft.com/office/word/2006/wordml" xmlns:wps="http://schemas.microsoft.com/office/word/2010/wordprocessingShape" mc:Ignorable="w14 w15 w16se w16cid w16 w16cex w16sdtdh w16sdtfl w16du wp14">
-  <w:p>
-    <w:pPr>
       <w:jc w:val="right"/>
       <w:rPr>
         <w:noProof/>
@@ -1479,138 +1619,6 @@
         <w:szCs w:val="18"/>
       </w:rPr>
     </w:pPr>
-    <w:r>
-      <w:rPr>
-        <w:b/>
-        <w:bCs/>
-        <w:i/>
-        <w:iCs/>
-        <w:noProof/>
-        <w:sz w:val="22"/>
-      </w:rPr>
-      <mc:AlternateContent>
-        <mc:Choice Requires="wps">
-          <w:drawing>
-            <wp:anchor distT="0" distB="0" distL="0" distR="0" simplePos="0" relativeHeight="251662336" behindDoc="0" locked="0" layoutInCell="1" allowOverlap="1" wp14:anchorId="68DA40F4" wp14:editId="43A125E9">
-              <wp:simplePos x="457200" y="8572500"/>
-              <wp:positionH relativeFrom="page">
-                <wp:align>center</wp:align>
-              </wp:positionH>
-              <wp:positionV relativeFrom="page">
-                <wp:align>bottom</wp:align>
-              </wp:positionV>
-              <wp:extent cx="381635" cy="664845"/>
-              <wp:effectExtent l="0" t="0" r="18415" b="0"/>
-              <wp:wrapNone/>
-              <wp:docPr id="725413328" name="Text Box 3" descr="Internal">
-                <a:extLst xmlns:a="http://schemas.openxmlformats.org/drawingml/2006/main">
-                  <a:ext uri="{5AE41FA2-C0FF-4470-9BD4-5FADCA87CBE2}">
-                    <aclsh:classification xmlns:aclsh="http://schemas.microsoft.com/office/drawing/2020/classificationShape" classificationOutcomeType="ftr"/>
-                  </a:ext>
-                </a:extLst>
-              </wp:docPr>
-              <wp:cNvGraphicFramePr/>
-              <a:graphic xmlns:a="http://schemas.openxmlformats.org/drawingml/2006/main">
-                <a:graphicData uri="http://schemas.microsoft.com/office/word/2010/wordprocessingShape">
-                  <wps:wsp>
-                    <wps:cNvSpPr txBox="1"/>
-                    <wps:spPr>
-                      <a:xfrm>
-                        <a:off x="0" y="0"/>
-                        <a:ext cx="381635" cy="664845"/>
-                      </a:xfrm>
-                      <a:prstGeom prst="rect">
-                        <a:avLst/>
-                      </a:prstGeom>
-                      <a:noFill/>
-                      <a:ln>
-                        <a:noFill/>
-                      </a:ln>
-                    </wps:spPr>
-                    <wps:txbx>
-                      <w:txbxContent>
-                        <w:p>
-                          <w:pPr>
-                            <w:spacing w:after="0"/>
-                            <w:rPr>
-                              <w:rFonts w:ascii="Arial" w:eastAsia="Arial" w:hAnsi="Arial" w:cs="Arial"/>
-                              <w:noProof/>
-                              <w:color w:val="000000"/>
-                              <w:sz w:val="18"/>
-                              <w:szCs w:val="18"/>
-                            </w:rPr>
-                          </w:pPr>
-                          <w:r>
-                            <w:rPr>
-                              <w:rFonts w:ascii="Arial" w:eastAsia="Arial" w:hAnsi="Arial" w:cs="Arial"/>
-                              <w:noProof/>
-                              <w:color w:val="000000"/>
-                              <w:sz w:val="18"/>
-                              <w:szCs w:val="18"/>
-                            </w:rPr>
-                            <w:t>Internal</w:t>
-                          </w:r>
-                        </w:p>
-                      </w:txbxContent>
-                    </wps:txbx>
-                    <wps:bodyPr rot="0" spcFirstLastPara="0" vertOverflow="overflow" horzOverflow="overflow" vert="horz" wrap="none" lIns="0" tIns="0" rIns="0" bIns="355600" numCol="1" spcCol="0" rtlCol="0" fromWordArt="0" anchor="b" anchorCtr="0" forceAA="0" compatLnSpc="1">
-                      <a:prstTxWarp prst="textNoShape">
-                        <a:avLst/>
-                      </a:prstTxWarp>
-                      <a:spAutoFit/>
-                    </wps:bodyPr>
-                  </wps:wsp>
-                </a:graphicData>
-              </a:graphic>
-              <wp14:sizeRelH relativeFrom="margin">
-                <wp14:pctWidth>0</wp14:pctWidth>
-              </wp14:sizeRelH>
-              <wp14:sizeRelV relativeFrom="margin">
-                <wp14:pctHeight>0</wp14:pctHeight>
-              </wp14:sizeRelV>
-            </wp:anchor>
-          </w:drawing>
-        </mc:Choice>
-        <mc:Fallback>
-          <w:pict>
-            <v:shapetype w14:anchorId="68DA40F4" id="_x0000_t202" coordsize="21600,21600" o:spt="202" path="m,l,21600r21600,l21600,xe">
-              <v:stroke joinstyle="miter"/>
-              <v:path gradientshapeok="t" o:connecttype="rect"/>
-            </v:shapetype>
-            <v:shape id="Text Box 3" o:spid="_x0000_s1027" type="#_x0000_t202" alt="Internal" style="position:absolute;left:0;text-align:left;margin-left:0;margin-top:0;width:30.05pt;height:52.35pt;z-index:251662336;visibility:visible;mso-wrap-style:none;mso-width-percent:0;mso-height-percent:0;mso-wrap-distance-left:0;mso-wrap-distance-top:0;mso-wrap-distance-right:0;mso-wrap-distance-bottom:0;mso-position-horizontal:center;mso-position-horizontal-relative:page;mso-position-vertical:bottom;mso-position-vertical-relative:page;mso-width-percent:0;mso-height-percent:0;mso-width-relative:margin;mso-height-relative:margin;v-text-anchor:bottom" o:gfxdata="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" filled="f" stroked="f">
-              <v:fill o:detectmouseclick="t"/>
-              <v:textbox style="mso-fit-shape-to-text:t" inset="0,0,0,28pt">
-                <w:txbxContent>
-                  <w:p>
-                    <w:pPr>
-                      <w:spacing w:after="0"/>
-                      <w:rPr>
-                        <w:rFonts w:ascii="Arial" w:eastAsia="Arial" w:hAnsi="Arial" w:cs="Arial"/>
-                        <w:noProof/>
-                        <w:color w:val="000000"/>
-                        <w:sz w:val="18"/>
-                        <w:szCs w:val="18"/>
-                      </w:rPr>
-                    </w:pPr>
-                    <w:r>
-                      <w:rPr>
-                        <w:rFonts w:ascii="Arial" w:eastAsia="Arial" w:hAnsi="Arial" w:cs="Arial"/>
-                        <w:noProof/>
-                        <w:color w:val="000000"/>
-                        <w:sz w:val="18"/>
-                        <w:szCs w:val="18"/>
-                      </w:rPr>
-                      <w:t>Internal</w:t>
-                    </w:r>
-                  </w:p>
-                </w:txbxContent>
-              </v:textbox>
-              <w10:wrap anchorx="page" anchory="page"/>
-            </v:shape>
-          </w:pict>
-        </mc:Fallback>
-      </mc:AlternateContent>
-    </w:r>
     <w:r>
       <w:rPr>
         <w:b/>
@@ -1707,143 +1715,6 @@
         <w:szCs w:val="20"/>
       </w:rPr>
       <w:t xml:space="preserve"> (250) 953-0496</w:t>
-    </w:r>
-  </w:p>
-</w:ftr>
-</file>
-
-<file path=word/footer3.xml><?xml version="1.0" encoding="utf-8"?>
-<w:ftr xmlns:wpc="http://schemas.microsoft.com/office/word/2010/wordprocessingCanvas" xmlns:cx="http://schemas.microsoft.com/office/drawing/2014/chartex" xmlns:cx1="http://schemas.microsoft.com/office/drawing/2015/9/8/chartex" xmlns:cx2="http://schemas.microsoft.com/office/drawing/2015/10/21/chartex" xmlns:cx3="http://schemas.microsoft.com/office/drawing/2016/5/9/chartex" xmlns:cx4="http://schemas.microsoft.com/office/drawing/2016/5/10/chartex" xmlns:cx5="http://schemas.microsoft.com/office/drawing/2016/5/11/chartex" xmlns:cx6="http://schemas.microsoft.com/office/drawing/2016/5/12/chartex" xmlns:cx7="http://schemas.microsoft.com/office/drawing/2016/5/13/chartex" xmlns:cx8="http://schemas.microsoft.com/office/drawing/2016/5/14/chartex" xmlns:mc="http://schemas.openxmlformats.org/markup-compatibility/2006" xmlns:aink="http://schemas.microsoft.com/office/drawing/2016/ink" xmlns:am3d="http://schemas.microsoft.com/office/drawing/2017/model3d" xmlns:o="urn:schemas-microsoft-com:office:office" xmlns:oel="http://schemas.microsoft.com/office/2019/extlst" xmlns:r="http://schemas.openxmlformats.org/officeDocument/2006/relationships" xmlns:m="http://schemas.openxmlformats.org/officeDocument/2006/math" xmlns:v="urn:schemas-microsoft-com:vml" xmlns:wp14="http://schemas.microsoft.com/office/word/2010/wordprocessingDrawing" xmlns:wp="http://schemas.openxmlformats.org/drawingml/2006/wordprocessingDrawing" xmlns:w10="urn:schemas-microsoft-com:office:word" xmlns:w="http://schemas.openxmlformats.org/wordprocessingml/2006/main" xmlns:w14="http://schemas.microsoft.com/office/word/2010/wordml" xmlns:w15="http://schemas.microsoft.com/office/word/2012/wordml" xmlns:w16cex="http://schemas.microsoft.com/office/word/2018/wordml/cex" xmlns:w16cid="http://schemas.microsoft.com/office/word/2016/wordml/cid" xmlns:w16="http://schemas.microsoft.com/office/word/2018/wordml" xmlns:w16du="http://schemas.microsoft.com/office/word/2023/wordml/word16du" xmlns:w16sdtdh="http://schemas.microsoft.com/office/word/2020/wordml/sdtdatahash" xmlns:w16sdtfl="http://schemas.microsoft.com/office/word/2024/wordml/sdtformatlock" xmlns:w16se="http://schemas.microsoft.com/office/word/2015/wordml/symex" xmlns:wpg="http://schemas.microsoft.com/office/word/2010/wordprocessingGroup" xmlns:wpi="http://schemas.microsoft.com/office/word/2010/wordprocessingInk" xmlns:wne="http://schemas.microsoft.com/office/word/2006/wordml" xmlns:wps="http://schemas.microsoft.com/office/word/2010/wordprocessingShape" mc:Ignorable="w14 w15 w16se w16cid w16 w16cex w16sdtdh w16sdtfl w16du wp14">
-  <w:p>
-    <w:pPr>
-      <w:pStyle w:val="Footer"/>
-    </w:pPr>
-    <w:r>
-      <w:rPr>
-        <w:noProof/>
-      </w:rPr>
-      <mc:AlternateContent>
-        <mc:Choice Requires="wps">
-          <w:drawing>
-            <wp:anchor distT="0" distB="0" distL="0" distR="0" simplePos="0" relativeHeight="251660288" behindDoc="0" locked="0" layoutInCell="1" allowOverlap="1" wp14:anchorId="6B50E1B2" wp14:editId="6BD4364E">
-              <wp:simplePos x="635" y="635"/>
-              <wp:positionH relativeFrom="page">
-                <wp:align>center</wp:align>
-              </wp:positionH>
-              <wp:positionV relativeFrom="page">
-                <wp:align>bottom</wp:align>
-              </wp:positionV>
-              <wp:extent cx="381635" cy="664845"/>
-              <wp:effectExtent l="0" t="0" r="18415" b="0"/>
-              <wp:wrapNone/>
-              <wp:docPr id="59044182" name="Text Box 1" descr="Internal">
-                <a:extLst xmlns:a="http://schemas.openxmlformats.org/drawingml/2006/main">
-                  <a:ext uri="{5AE41FA2-C0FF-4470-9BD4-5FADCA87CBE2}">
-                    <aclsh:classification xmlns:aclsh="http://schemas.microsoft.com/office/drawing/2020/classificationShape" classificationOutcomeType="ftr"/>
-                  </a:ext>
-                </a:extLst>
-              </wp:docPr>
-              <wp:cNvGraphicFramePr/>
-              <a:graphic xmlns:a="http://schemas.openxmlformats.org/drawingml/2006/main">
-                <a:graphicData uri="http://schemas.microsoft.com/office/word/2010/wordprocessingShape">
-                  <wps:wsp>
-                    <wps:cNvSpPr txBox="1"/>
-                    <wps:spPr>
-                      <a:xfrm>
-                        <a:off x="0" y="0"/>
-                        <a:ext cx="381635" cy="664845"/>
-                      </a:xfrm>
-                      <a:prstGeom prst="rect">
-                        <a:avLst/>
-                      </a:prstGeom>
-                      <a:noFill/>
-                      <a:ln>
-                        <a:noFill/>
-                      </a:ln>
-                    </wps:spPr>
-                    <wps:txbx>
-                      <w:txbxContent>
-                        <w:p>
-                          <w:pPr>
-                            <w:spacing w:after="0"/>
-                            <w:rPr>
-                              <w:rFonts w:ascii="Arial" w:eastAsia="Arial" w:hAnsi="Arial" w:cs="Arial"/>
-                              <w:noProof/>
-                              <w:color w:val="000000"/>
-                              <w:sz w:val="18"/>
-                              <w:szCs w:val="18"/>
-                            </w:rPr>
-                          </w:pPr>
-                          <w:r>
-                            <w:rPr>
-                              <w:rFonts w:ascii="Arial" w:eastAsia="Arial" w:hAnsi="Arial" w:cs="Arial"/>
-                              <w:noProof/>
-                              <w:color w:val="000000"/>
-                              <w:sz w:val="18"/>
-                              <w:szCs w:val="18"/>
-                            </w:rPr>
-                            <w:t>Internal</w:t>
-                          </w:r>
-                        </w:p>
-                      </w:txbxContent>
-                    </wps:txbx>
-                    <wps:bodyPr rot="0" spcFirstLastPara="0" vertOverflow="overflow" horzOverflow="overflow" vert="horz" wrap="none" lIns="0" tIns="0" rIns="0" bIns="355600" numCol="1" spcCol="0" rtlCol="0" fromWordArt="0" anchor="b" anchorCtr="0" forceAA="0" compatLnSpc="1">
-                      <a:prstTxWarp prst="textNoShape">
-                        <a:avLst/>
-                      </a:prstTxWarp>
-                      <a:spAutoFit/>
-                    </wps:bodyPr>
-                  </wps:wsp>
-                </a:graphicData>
-              </a:graphic>
-              <wp14:sizeRelH relativeFrom="margin">
-                <wp14:pctWidth>0</wp14:pctWidth>
-              </wp14:sizeRelH>
-              <wp14:sizeRelV relativeFrom="margin">
-                <wp14:pctHeight>0</wp14:pctHeight>
-              </wp14:sizeRelV>
-            </wp:anchor>
-          </w:drawing>
-        </mc:Choice>
-        <mc:Fallback>
-          <w:pict>
-            <v:shapetype w14:anchorId="6B50E1B2" id="_x0000_t202" coordsize="21600,21600" o:spt="202" path="m,l,21600r21600,l21600,xe">
-              <v:stroke joinstyle="miter"/>
-              <v:path gradientshapeok="t" o:connecttype="rect"/>
-            </v:shapetype>
-            <v:shape id="Text Box 1" o:spid="_x0000_s1028" type="#_x0000_t202" alt="Internal" style="position:absolute;margin-left:0;margin-top:0;width:30.05pt;height:52.35pt;z-index:251660288;visibility:visible;mso-wrap-style:none;mso-width-percent:0;mso-height-percent:0;mso-wrap-distance-left:0;mso-wrap-distance-top:0;mso-wrap-distance-right:0;mso-wrap-distance-bottom:0;mso-position-horizontal:center;mso-position-horizontal-relative:page;mso-position-vertical:bottom;mso-position-vertical-relative:page;mso-width-percent:0;mso-height-percent:0;mso-width-relative:margin;mso-height-relative:margin;v-text-anchor:bottom" o:gfxdata="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" filled="f" stroked="f">
-              <v:fill o:detectmouseclick="t"/>
-              <v:textbox style="mso-fit-shape-to-text:t" inset="0,0,0,28pt">
-                <w:txbxContent>
-                  <w:p>
-                    <w:pPr>
-                      <w:spacing w:after="0"/>
-                      <w:rPr>
-                        <w:rFonts w:ascii="Arial" w:eastAsia="Arial" w:hAnsi="Arial" w:cs="Arial"/>
-                        <w:noProof/>
-                        <w:color w:val="000000"/>
-                        <w:sz w:val="18"/>
-                        <w:szCs w:val="18"/>
-                      </w:rPr>
-                    </w:pPr>
-                    <w:r>
-                      <w:rPr>
-                        <w:rFonts w:ascii="Arial" w:eastAsia="Arial" w:hAnsi="Arial" w:cs="Arial"/>
-                        <w:noProof/>
-                        <w:color w:val="000000"/>
-                        <w:sz w:val="18"/>
-                        <w:szCs w:val="18"/>
-                      </w:rPr>
-                      <w:t>Internal</w:t>
-                    </w:r>
-                  </w:p>
-                </w:txbxContent>
-              </v:textbox>
-              <w10:wrap anchorx="page" anchory="page"/>
-            </v:shape>
-          </w:pict>
-        </mc:Fallback>
-      </mc:AlternateContent>
     </w:r>
   </w:p>
 </w:ftr>
@@ -1875,16 +1746,6 @@
 </file>
 
 <file path=word/header1.xml><?xml version="1.0" encoding="utf-8"?>
-<w:hdr xmlns:wpc="http://schemas.microsoft.com/office/word/2010/wordprocessingCanvas" xmlns:cx="http://schemas.microsoft.com/office/drawing/2014/chartex" xmlns:cx1="http://schemas.microsoft.com/office/drawing/2015/9/8/chartex" xmlns:cx2="http://schemas.microsoft.com/office/drawing/2015/10/21/chartex" xmlns:cx3="http://schemas.microsoft.com/office/drawing/2016/5/9/chartex" xmlns:cx4="http://schemas.microsoft.com/office/drawing/2016/5/10/chartex" xmlns:cx5="http://schemas.microsoft.com/office/drawing/2016/5/11/chartex" xmlns:cx6="http://schemas.microsoft.com/office/drawing/2016/5/12/chartex" xmlns:cx7="http://schemas.microsoft.com/office/drawing/2016/5/13/chartex" xmlns:cx8="http://schemas.microsoft.com/office/drawing/2016/5/14/chartex" xmlns:mc="http://schemas.openxmlformats.org/markup-compatibility/2006" xmlns:aink="http://schemas.microsoft.com/office/drawing/2016/ink" xmlns:am3d="http://schemas.microsoft.com/office/drawing/2017/model3d" xmlns:o="urn:schemas-microsoft-com:office:office" xmlns:oel="http://schemas.microsoft.com/office/2019/extlst" xmlns:r="http://schemas.openxmlformats.org/officeDocument/2006/relationships" xmlns:m="http://schemas.openxmlformats.org/officeDocument/2006/math" xmlns:v="urn:schemas-microsoft-com:vml" xmlns:wp14="http://schemas.microsoft.com/office/word/2010/wordprocessingDrawing" xmlns:wp="http://schemas.openxmlformats.org/drawingml/2006/wordprocessingDrawing" xmlns:w10="urn:schemas-microsoft-com:office:word" xmlns:w="http://schemas.openxmlformats.org/wordprocessingml/2006/main" xmlns:w14="http://schemas.microsoft.com/office/word/2010/wordml" xmlns:w15="http://schemas.microsoft.com/office/word/2012/wordml" xmlns:w16cex="http://schemas.microsoft.com/office/word/2018/wordml/cex" xmlns:w16cid="http://schemas.microsoft.com/office/word/2016/wordml/cid" xmlns:w16="http://schemas.microsoft.com/office/word/2018/wordml" xmlns:w16du="http://schemas.microsoft.com/office/word/2023/wordml/word16du" xmlns:w16sdtdh="http://schemas.microsoft.com/office/word/2020/wordml/sdtdatahash" xmlns:w16sdtfl="http://schemas.microsoft.com/office/word/2024/wordml/sdtformatlock" xmlns:w16se="http://schemas.microsoft.com/office/word/2015/wordml/symex" xmlns:wpg="http://schemas.microsoft.com/office/word/2010/wordprocessingGroup" xmlns:wpi="http://schemas.microsoft.com/office/word/2010/wordprocessingInk" xmlns:wne="http://schemas.microsoft.com/office/word/2006/wordml" xmlns:wps="http://schemas.microsoft.com/office/word/2010/wordprocessingShape" mc:Ignorable="w14 w15 w16se w16cid w16 w16cex w16sdtdh w16sdtfl w16du wp14">
-  <w:p>
-    <w:pPr>
-      <w:pStyle w:val="Header"/>
-    </w:pPr>
-  </w:p>
-</w:hdr>
-</file>
-
-<file path=word/header2.xml><?xml version="1.0" encoding="utf-8"?>
 <w:hdr xmlns:wpc="http://schemas.microsoft.com/office/word/2010/wordprocessingCanvas" xmlns:cx="http://schemas.microsoft.com/office/drawing/2014/chartex" xmlns:cx1="http://schemas.microsoft.com/office/drawing/2015/9/8/chartex" xmlns:cx2="http://schemas.microsoft.com/office/drawing/2015/10/21/chartex" xmlns:cx3="http://schemas.microsoft.com/office/drawing/2016/5/9/chartex" xmlns:cx4="http://schemas.microsoft.com/office/drawing/2016/5/10/chartex" xmlns:cx5="http://schemas.microsoft.com/office/drawing/2016/5/11/chartex" xmlns:cx6="http://schemas.microsoft.com/office/drawing/2016/5/12/chartex" xmlns:cx7="http://schemas.microsoft.com/office/drawing/2016/5/13/chartex" xmlns:cx8="http://schemas.microsoft.com/office/drawing/2016/5/14/chartex" xmlns:mc="http://schemas.openxmlformats.org/markup-compatibility/2006" xmlns:aink="http://schemas.microsoft.com/office/drawing/2016/ink" xmlns:am3d="http://schemas.microsoft.com/office/drawing/2017/model3d" xmlns:o="urn:schemas-microsoft-com:office:office" xmlns:oel="http://schemas.microsoft.com/office/2019/extlst" xmlns:r="http://schemas.openxmlformats.org/officeDocument/2006/relationships" xmlns:m="http://schemas.openxmlformats.org/officeDocument/2006/math" xmlns:v="urn:schemas-microsoft-com:vml" xmlns:wp14="http://schemas.microsoft.com/office/word/2010/wordprocessingDrawing" xmlns:wp="http://schemas.openxmlformats.org/drawingml/2006/wordprocessingDrawing" xmlns:w10="urn:schemas-microsoft-com:office:word" xmlns:w="http://schemas.openxmlformats.org/wordprocessingml/2006/main" xmlns:w14="http://schemas.microsoft.com/office/word/2010/wordml" xmlns:w15="http://schemas.microsoft.com/office/word/2012/wordml" xmlns:w16cex="http://schemas.microsoft.com/office/word/2018/wordml/cex" xmlns:w16cid="http://schemas.microsoft.com/office/word/2016/wordml/cid" xmlns:w16="http://schemas.microsoft.com/office/word/2018/wordml" xmlns:w16du="http://schemas.microsoft.com/office/word/2023/wordml/word16du" xmlns:w16sdtdh="http://schemas.microsoft.com/office/word/2020/wordml/sdtdatahash" xmlns:w16sdtfl="http://schemas.microsoft.com/office/word/2024/wordml/sdtformatlock" xmlns:w16se="http://schemas.microsoft.com/office/word/2015/wordml/symex" xmlns:wpg="http://schemas.microsoft.com/office/word/2010/wordprocessingGroup" xmlns:wpi="http://schemas.microsoft.com/office/word/2010/wordprocessingInk" xmlns:wne="http://schemas.microsoft.com/office/word/2006/wordml" xmlns:wps="http://schemas.microsoft.com/office/word/2010/wordprocessingShape" mc:Ignorable="w14 w15 w16se w16cid w16 w16cex w16sdtdh w16sdtfl w16du wp14">
   <w:p>
     <w:pPr>
@@ -2009,6 +1870,7 @@
       </w:rPr>
       <w:tab/>
     </w:r>
+    <w:bookmarkStart w:id="0" w:name="OLE_LINK2"/>
     <w:r>
       <w:rPr>
         <w:b/>
@@ -2016,18 +1878,8 @@
         <w:noProof/>
         <w:sz w:val="22"/>
       </w:rPr>
-      <w:tab/>
-    </w:r>
-    <w:r>
-      <w:rPr>
-        <w:b/>
-        <w:bCs/>
-        <w:noProof/>
-        <w:sz w:val="22"/>
-      </w:rPr>
-      <w:t xml:space="preserve">        </w:t>
-    </w:r>
-    <w:bookmarkStart w:id="0" w:name="OLE_LINK2"/>
+      <w:t xml:space="preserve">     </w:t>
+    </w:r>
     <w:r>
       <w:rPr>
         <w:b/>
@@ -2044,16 +1896,7 @@
         <w:sz w:val="30"/>
         <w:szCs w:val="32"/>
       </w:rPr>
-      <w:t>#:</w:t>
-    </w:r>
-    <w:r>
-      <w:rPr>
-        <w:b/>
-        <w:bCs/>
-        <w:sz w:val="30"/>
-        <w:szCs w:val="32"/>
-      </w:rPr>
-      <w:t xml:space="preserve"> </w:t>
+      <w:t xml:space="preserve">#: </w:t>
     </w:r>
     <w:bookmarkEnd w:id="0"/>
     <w:r>
@@ -2063,7 +1906,27 @@
         <w:sz w:val="30"/>
         <w:szCs w:val="30"/>
       </w:rPr>
-      <w:t>{{InvoiceId}}</w:t>
+      <w:t>{{</w:t>
+    </w:r>
+    <w:proofErr w:type="spellStart"/>
+    <w:r>
+      <w:rPr>
+        <w:b/>
+        <w:bCs/>
+        <w:sz w:val="30"/>
+        <w:szCs w:val="30"/>
+      </w:rPr>
+      <w:t>InvoiceId</w:t>
+    </w:r>
+    <w:proofErr w:type="spellEnd"/>
+    <w:r>
+      <w:rPr>
+        <w:b/>
+        <w:bCs/>
+        <w:sz w:val="30"/>
+        <w:szCs w:val="30"/>
+      </w:rPr>
+      <w:t>}}</w:t>
     </w:r>
     <w:r>
       <w:rPr>
@@ -2091,43 +1954,7 @@
         <w:noProof/>
         <w:sz w:val="22"/>
       </w:rPr>
-      <w:t xml:space="preserve"> </w:t>
-    </w:r>
-    <w:r>
-      <w:rPr>
-        <w:i/>
-        <w:iCs/>
-        <w:noProof/>
-        <w:sz w:val="22"/>
-      </w:rPr>
-      <w:t xml:space="preserve">                                             </w:t>
-    </w:r>
-    <w:r>
-      <w:rPr>
-        <w:i/>
-        <w:iCs/>
-        <w:noProof/>
-        <w:sz w:val="22"/>
-      </w:rPr>
-      <w:t xml:space="preserve">  </w:t>
-    </w:r>
-    <w:r>
-      <w:rPr>
-        <w:i/>
-        <w:iCs/>
-        <w:noProof/>
-        <w:sz w:val="22"/>
-      </w:rPr>
-      <w:t xml:space="preserve">   </w:t>
-    </w:r>
-    <w:r>
-      <w:rPr>
-        <w:i/>
-        <w:iCs/>
-        <w:noProof/>
-        <w:sz w:val="22"/>
-      </w:rPr>
-      <w:t xml:space="preserve">  </w:t>
+      <w:t xml:space="preserve">                          </w:t>
     </w:r>
     <w:r>
       <w:rPr>
@@ -2156,7 +1983,25 @@
         <w:szCs w:val="20"/>
         <w14:ligatures w14:val="none"/>
       </w:rPr>
-      <w:t>{{InvoiceCreatedDate}}</w:t>
+      <w:t>{{</w:t>
+    </w:r>
+    <w:proofErr w:type="spellStart"/>
+    <w:r>
+      <w:rPr>
+        <w:kern w:val="0"/>
+        <w:szCs w:val="20"/>
+        <w14:ligatures w14:val="none"/>
+      </w:rPr>
+      <w:t>InvoiceCreatedDate</w:t>
+    </w:r>
+    <w:proofErr w:type="spellEnd"/>
+    <w:r>
+      <w:rPr>
+        <w:kern w:val="0"/>
+        <w:szCs w:val="20"/>
+        <w14:ligatures w14:val="none"/>
+      </w:rPr>
+      <w:t>}}</w:t>
     </w:r>
     <w:r>
       <w:rPr>
@@ -2220,16 +2065,6 @@
         <w:noProof/>
         <w:sz w:val="22"/>
       </w:rPr>
-    </w:pPr>
-  </w:p>
-</w:hdr>
-</file>
-
-<file path=word/header3.xml><?xml version="1.0" encoding="utf-8"?>
-<w:hdr xmlns:wpc="http://schemas.microsoft.com/office/word/2010/wordprocessingCanvas" xmlns:cx="http://schemas.microsoft.com/office/drawing/2014/chartex" xmlns:cx1="http://schemas.microsoft.com/office/drawing/2015/9/8/chartex" xmlns:cx2="http://schemas.microsoft.com/office/drawing/2015/10/21/chartex" xmlns:cx3="http://schemas.microsoft.com/office/drawing/2016/5/9/chartex" xmlns:cx4="http://schemas.microsoft.com/office/drawing/2016/5/10/chartex" xmlns:cx5="http://schemas.microsoft.com/office/drawing/2016/5/11/chartex" xmlns:cx6="http://schemas.microsoft.com/office/drawing/2016/5/12/chartex" xmlns:cx7="http://schemas.microsoft.com/office/drawing/2016/5/13/chartex" xmlns:cx8="http://schemas.microsoft.com/office/drawing/2016/5/14/chartex" xmlns:mc="http://schemas.openxmlformats.org/markup-compatibility/2006" xmlns:aink="http://schemas.microsoft.com/office/drawing/2016/ink" xmlns:am3d="http://schemas.microsoft.com/office/drawing/2017/model3d" xmlns:o="urn:schemas-microsoft-com:office:office" xmlns:oel="http://schemas.microsoft.com/office/2019/extlst" xmlns:r="http://schemas.openxmlformats.org/officeDocument/2006/relationships" xmlns:m="http://schemas.openxmlformats.org/officeDocument/2006/math" xmlns:v="urn:schemas-microsoft-com:vml" xmlns:wp14="http://schemas.microsoft.com/office/word/2010/wordprocessingDrawing" xmlns:wp="http://schemas.openxmlformats.org/drawingml/2006/wordprocessingDrawing" xmlns:w10="urn:schemas-microsoft-com:office:word" xmlns:w="http://schemas.openxmlformats.org/wordprocessingml/2006/main" xmlns:w14="http://schemas.microsoft.com/office/word/2010/wordml" xmlns:w15="http://schemas.microsoft.com/office/word/2012/wordml" xmlns:w16cex="http://schemas.microsoft.com/office/word/2018/wordml/cex" xmlns:w16cid="http://schemas.microsoft.com/office/word/2016/wordml/cid" xmlns:w16="http://schemas.microsoft.com/office/word/2018/wordml" xmlns:w16du="http://schemas.microsoft.com/office/word/2023/wordml/word16du" xmlns:w16sdtdh="http://schemas.microsoft.com/office/word/2020/wordml/sdtdatahash" xmlns:w16sdtfl="http://schemas.microsoft.com/office/word/2024/wordml/sdtformatlock" xmlns:w16se="http://schemas.microsoft.com/office/word/2015/wordml/symex" xmlns:wpg="http://schemas.microsoft.com/office/word/2010/wordprocessingGroup" xmlns:wpi="http://schemas.microsoft.com/office/word/2010/wordprocessingInk" xmlns:wne="http://schemas.microsoft.com/office/word/2006/wordml" xmlns:wps="http://schemas.microsoft.com/office/word/2010/wordprocessingShape" mc:Ignorable="w14 w15 w16se w16cid w16 w16cex w16sdtdh w16sdtfl w16du wp14">
-  <w:p>
-    <w:pPr>
-      <w:pStyle w:val="Header"/>
     </w:pPr>
   </w:p>
 </w:hdr>
@@ -3071,7 +2906,6 @@
 
 <file path=docMetadata/LabelInfo.xml><?xml version="1.0" encoding="utf-8"?>
 <clbl:labelList xmlns:clbl="http://schemas.microsoft.com/office/2020/mipLabelMetadata">
-  <clbl:label id="{4af293e6-3850-4258-b2c7-0aa0e3bfa7d9}" enabled="1" method="Privileged" siteId="{b9fec68c-c92d-461e-9a97-3d03a0f18b82}" contentBits="3" removed="0"/>
   <clbl:label id="{e0793d39-0939-496d-b129-198edd916feb}" enabled="0" method="" siteId="{e0793d39-0939-496d-b129-198edd916feb}" removed="1"/>
 </clbl:labelList>
 </file>
</xml_diff>

<commit_message>
BCMOHAM-31885-V2 || Updated the templates with 9604
</commit_message>
<xml_diff>
--- a/ALR-DocgenTemplates/Application Fee Receipt Template.docx
+++ b/ALR-DocgenTemplates/Application Fee Receipt Template.docx
@@ -12,8 +12,12 @@
           <w:szCs w:val="34"/>
         </w:rPr>
         <w:sectPr>
-          <w:headerReference w:type="default" r:id="rId6"/>
-          <w:footerReference w:type="default" r:id="rId7"/>
+          <w:headerReference w:type="even" r:id="rId6"/>
+          <w:headerReference w:type="default" r:id="rId7"/>
+          <w:footerReference w:type="even" r:id="rId8"/>
+          <w:footerReference w:type="default" r:id="rId9"/>
+          <w:headerReference w:type="first" r:id="rId10"/>
+          <w:footerReference w:type="first" r:id="rId11"/>
           <w:pgSz w:w="12240" w:h="15840"/>
           <w:pgMar w:top="720" w:right="720" w:bottom="720" w:left="720" w:header="708" w:footer="708" w:gutter="0"/>
           <w:cols w:space="708"/>
@@ -132,29 +136,7 @@
                 <w:szCs w:val="24"/>
                 <w14:ligatures w14:val="none"/>
               </w:rPr>
-              <w:t>{{</w:t>
-            </w:r>
-            <w:proofErr w:type="spellStart"/>
-            <w:r>
-              <w:rPr>
-                <w:color w:val="000000" w:themeColor="text1"/>
-                <w:kern w:val="0"/>
-                <w:sz w:val="24"/>
-                <w:szCs w:val="24"/>
-                <w14:ligatures w14:val="none"/>
-              </w:rPr>
-              <w:t>RegistrantName</w:t>
-            </w:r>
-            <w:proofErr w:type="spellEnd"/>
-            <w:r>
-              <w:rPr>
-                <w:color w:val="000000" w:themeColor="text1"/>
-                <w:kern w:val="0"/>
-                <w:sz w:val="24"/>
-                <w:szCs w:val="24"/>
-                <w14:ligatures w14:val="none"/>
-              </w:rPr>
-              <w:t>}}</w:t>
+              <w:t>{{RegistrantName}}</w:t>
             </w:r>
           </w:p>
         </w:tc>
@@ -179,29 +161,7 @@
                 <w:szCs w:val="24"/>
                 <w14:ligatures w14:val="none"/>
               </w:rPr>
-              <w:t>{{</w:t>
-            </w:r>
-            <w:proofErr w:type="spellStart"/>
-            <w:r>
-              <w:rPr>
-                <w:color w:val="000000" w:themeColor="text1"/>
-                <w:kern w:val="0"/>
-                <w:sz w:val="24"/>
-                <w:szCs w:val="24"/>
-                <w14:ligatures w14:val="none"/>
-              </w:rPr>
-              <w:t>ResidenceName</w:t>
-            </w:r>
-            <w:proofErr w:type="spellEnd"/>
-            <w:r>
-              <w:rPr>
-                <w:color w:val="000000" w:themeColor="text1"/>
-                <w:kern w:val="0"/>
-                <w:sz w:val="24"/>
-                <w:szCs w:val="24"/>
-                <w14:ligatures w14:val="none"/>
-              </w:rPr>
-              <w:t>}}</w:t>
+              <w:t>{{ResidenceName}}</w:t>
             </w:r>
           </w:p>
         </w:tc>
@@ -231,29 +191,7 @@
                 <w:szCs w:val="24"/>
                 <w14:ligatures w14:val="none"/>
               </w:rPr>
-              <w:t>{{</w:t>
-            </w:r>
-            <w:proofErr w:type="spellStart"/>
-            <w:r>
-              <w:rPr>
-                <w:color w:val="000000" w:themeColor="text1"/>
-                <w:kern w:val="0"/>
-                <w:sz w:val="24"/>
-                <w:szCs w:val="24"/>
-                <w14:ligatures w14:val="none"/>
-              </w:rPr>
-              <w:t>RegistrantAddress</w:t>
-            </w:r>
-            <w:proofErr w:type="spellEnd"/>
-            <w:r>
-              <w:rPr>
-                <w:color w:val="000000" w:themeColor="text1"/>
-                <w:kern w:val="0"/>
-                <w:sz w:val="24"/>
-                <w:szCs w:val="24"/>
-                <w14:ligatures w14:val="none"/>
-              </w:rPr>
-              <w:t>}}</w:t>
+              <w:t>{{RegistrantAddress}}</w:t>
             </w:r>
           </w:p>
         </w:tc>
@@ -356,25 +294,7 @@
                 <w:sz w:val="24"/>
                 <w:szCs w:val="24"/>
               </w:rPr>
-              <w:t>{{</w:t>
-            </w:r>
-            <w:proofErr w:type="spellStart"/>
-            <w:r>
-              <w:rPr>
-                <w:color w:val="000000" w:themeColor="text1"/>
-                <w:sz w:val="24"/>
-                <w:szCs w:val="24"/>
-              </w:rPr>
-              <w:t>ResidenceAddress</w:t>
-            </w:r>
-            <w:proofErr w:type="spellEnd"/>
-            <w:r>
-              <w:rPr>
-                <w:color w:val="000000" w:themeColor="text1"/>
-                <w:sz w:val="24"/>
-                <w:szCs w:val="24"/>
-              </w:rPr>
-              <w:t>}}</w:t>
+              <w:t>{{ResidenceAddress}}</w:t>
             </w:r>
             <w:bookmarkEnd w:id="1"/>
           </w:p>
@@ -537,25 +457,7 @@
                 <w:sz w:val="22"/>
                 <w14:ligatures w14:val="none"/>
               </w:rPr>
-              <w:t>{{#InvoiceItem</w:t>
-            </w:r>
-            <w:proofErr w:type="gramStart"/>
-            <w:r>
-              <w:rPr>
-                <w:kern w:val="0"/>
-                <w:sz w:val="22"/>
-                <w14:ligatures w14:val="none"/>
-              </w:rPr>
-              <w:t>}}{</w:t>
-            </w:r>
-            <w:proofErr w:type="gramEnd"/>
-            <w:r>
-              <w:rPr>
-                <w:kern w:val="0"/>
-                <w:sz w:val="22"/>
-                <w14:ligatures w14:val="none"/>
-              </w:rPr>
-              <w:t>{Name}}</w:t>
+              <w:t>{{#InvoiceItem}}{{Name}}</w:t>
             </w:r>
           </w:p>
         </w:tc>
@@ -652,27 +554,7 @@
                 <w:sz w:val="22"/>
                 <w14:ligatures w14:val="none"/>
               </w:rPr>
-              <w:t>{{Fees</w:t>
-            </w:r>
-            <w:proofErr w:type="gramStart"/>
-            <w:r>
-              <w:rPr>
-                <w:rStyle w:val="ui-provider"/>
-                <w:kern w:val="0"/>
-                <w:sz w:val="22"/>
-                <w14:ligatures w14:val="none"/>
-              </w:rPr>
-              <w:t>}}{</w:t>
-            </w:r>
-            <w:proofErr w:type="gramEnd"/>
-            <w:r>
-              <w:rPr>
-                <w:rStyle w:val="ui-provider"/>
-                <w:kern w:val="0"/>
-                <w:sz w:val="22"/>
-                <w14:ligatures w14:val="none"/>
-              </w:rPr>
-              <w:t>{/I</w:t>
+              <w:t>{{Fees}}{{/I</w:t>
             </w:r>
             <w:r>
               <w:rPr>
@@ -983,9 +865,9 @@
     </w:p>
     <w:tbl>
       <w:tblPr>
-        <w:tblStyle w:val="TableGrid"/>
-        <w:tblW w:w="10773" w:type="dxa"/>
-        <w:tblInd w:w="421" w:type="dxa"/>
+        <w:tblStyle w:val="TableGrid1"/>
+        <w:tblW w:w="10435" w:type="dxa"/>
+        <w:tblInd w:w="0" w:type="dxa"/>
         <w:tblBorders>
           <w:top w:val="none" w:sz="0" w:space="0" w:color="auto"/>
           <w:left w:val="none" w:sz="0" w:space="0" w:color="auto"/>
@@ -994,31 +876,40 @@
           <w:insideH w:val="none" w:sz="0" w:space="0" w:color="auto"/>
           <w:insideV w:val="none" w:sz="0" w:space="0" w:color="auto"/>
         </w:tblBorders>
-        <w:tblLayout w:type="fixed"/>
         <w:tblLook w:val="04A0" w:firstRow="1" w:lastRow="0" w:firstColumn="1" w:lastColumn="0" w:noHBand="0" w:noVBand="1"/>
       </w:tblPr>
       <w:tblGrid>
-        <w:gridCol w:w="4677"/>
-        <w:gridCol w:w="1418"/>
-        <w:gridCol w:w="4678"/>
+        <w:gridCol w:w="4636"/>
+        <w:gridCol w:w="3354"/>
+        <w:gridCol w:w="2445"/>
       </w:tblGrid>
       <w:tr>
+        <w:trPr>
+          <w:trHeight w:val="168"/>
+        </w:trPr>
         <w:tc>
           <w:tcPr>
-            <w:tcW w:w="4677" w:type="dxa"/>
+            <w:tcW w:w="4721" w:type="dxa"/>
+            <w:hideMark/>
           </w:tcPr>
           <w:p>
             <w:pPr>
-              <w:tabs>
-                <w:tab w:val="left" w:pos="2880"/>
-              </w:tabs>
               <w:rPr>
                 <w:noProof/>
                 <w:sz w:val="22"/>
               </w:rPr>
             </w:pPr>
+            <w:r>
+              <w:rPr>
+                <w:b/>
+                <w:bCs/>
+                <w:color w:val="000000" w:themeColor="text1"/>
+                <w:sz w:val="24"/>
+                <w:szCs w:val="24"/>
+              </w:rPr>
+              <w:t xml:space="preserve">     </w:t>
+            </w:r>
             <w:bookmarkStart w:id="3" w:name="OLE_LINK6"/>
-            <w:proofErr w:type="gramStart"/>
             <w:r>
               <w:rPr>
                 <w:b/>
@@ -1027,211 +918,108 @@
                 <w:sz w:val="24"/>
                 <w:szCs w:val="24"/>
               </w:rPr>
-              <w:t>Registration:</w:t>
+              <w:t xml:space="preserve">Registration: </w:t>
             </w:r>
             <w:r>
               <w:rPr>
                 <w:color w:val="000000" w:themeColor="text1"/>
-                <w:szCs w:val="20"/>
-              </w:rPr>
-              <w:t>{</w:t>
-            </w:r>
-            <w:proofErr w:type="gramEnd"/>
-            <w:r>
-              <w:rPr>
-                <w:color w:val="000000" w:themeColor="text1"/>
-                <w:szCs w:val="20"/>
-              </w:rPr>
-              <w:t>{</w:t>
-            </w:r>
-            <w:proofErr w:type="spellStart"/>
-            <w:r>
-              <w:rPr>
-                <w:color w:val="000000" w:themeColor="text1"/>
-                <w:szCs w:val="20"/>
-              </w:rPr>
-              <w:t>IF_isCertificateIdNotPresent</w:t>
-            </w:r>
-            <w:proofErr w:type="spellEnd"/>
-            <w:r>
-              <w:rPr>
-                <w:color w:val="000000" w:themeColor="text1"/>
-                <w:szCs w:val="20"/>
-              </w:rPr>
-              <w:t>}}</w:t>
+                <w:sz w:val="19"/>
+                <w:szCs w:val="19"/>
+              </w:rPr>
+              <w:t>{{IF_isCertificateIdNotPresent}}</w:t>
             </w:r>
           </w:p>
         </w:tc>
         <w:tc>
           <w:tcPr>
-            <w:tcW w:w="1418" w:type="dxa"/>
+            <w:tcW w:w="3457" w:type="dxa"/>
+            <w:hideMark/>
           </w:tcPr>
           <w:p>
             <w:pPr>
-              <w:tabs>
-                <w:tab w:val="left" w:pos="2880"/>
-              </w:tabs>
               <w:rPr>
                 <w:noProof/>
                 <w:sz w:val="22"/>
               </w:rPr>
             </w:pPr>
+            <w:r>
+              <w:rPr>
+                <w:b/>
+                <w:bCs/>
+                <w:color w:val="000000" w:themeColor="text1"/>
+                <w:sz w:val="24"/>
+                <w:szCs w:val="24"/>
+              </w:rPr>
+              <w:t xml:space="preserve">             </w:t>
+            </w:r>
+            <w:r>
+              <w:rPr>
+                <w:b/>
+                <w:bCs/>
+                <w:color w:val="000000" w:themeColor="text1"/>
+                <w:sz w:val="24"/>
+                <w:szCs w:val="24"/>
+              </w:rPr>
+              <w:t xml:space="preserve">  </w:t>
+            </w:r>
+            <w:r>
+              <w:rPr>
+                <w:b/>
+                <w:bCs/>
+                <w:color w:val="000000" w:themeColor="text1"/>
+                <w:sz w:val="24"/>
+                <w:szCs w:val="24"/>
+              </w:rPr>
+              <w:t>Invoice total:</w:t>
+            </w:r>
           </w:p>
         </w:tc>
         <w:tc>
           <w:tcPr>
-            <w:tcW w:w="4678" w:type="dxa"/>
+            <w:tcW w:w="2257" w:type="dxa"/>
+            <w:hideMark/>
           </w:tcPr>
           <w:p>
             <w:pPr>
-              <w:tabs>
-                <w:tab w:val="left" w:pos="2880"/>
-              </w:tabs>
+              <w:jc w:val="right"/>
               <w:rPr>
                 <w:noProof/>
                 <w:sz w:val="22"/>
               </w:rPr>
             </w:pPr>
-            <w:r>
-              <w:rPr>
-                <w:b/>
-                <w:bCs/>
+            <w:bookmarkStart w:id="4" w:name="OLE_LINK14"/>
+            <w:r>
+              <w:rPr>
                 <w:color w:val="000000" w:themeColor="text1"/>
-                <w:sz w:val="24"/>
-                <w:szCs w:val="24"/>
-              </w:rPr>
-              <w:t>Invoice total:</w:t>
-            </w:r>
-            <w:r>
-              <w:rPr>
-                <w:color w:val="000000" w:themeColor="text1"/>
-                <w:kern w:val="0"/>
-                <w:sz w:val="24"/>
-                <w:szCs w:val="24"/>
-                <w14:ligatures w14:val="none"/>
-              </w:rPr>
-              <w:t xml:space="preserve"> </w:t>
-            </w:r>
-            <w:r>
-              <w:rPr>
-                <w:color w:val="000000" w:themeColor="text1"/>
-                <w:kern w:val="0"/>
-                <w:sz w:val="24"/>
-                <w:szCs w:val="24"/>
-                <w14:ligatures w14:val="none"/>
-              </w:rPr>
-              <w:t xml:space="preserve"> </w:t>
-            </w:r>
-            <w:r>
-              <w:rPr>
-                <w:color w:val="000000" w:themeColor="text1"/>
-                <w:kern w:val="0"/>
-                <w:sz w:val="24"/>
-                <w:szCs w:val="24"/>
-                <w14:ligatures w14:val="none"/>
-              </w:rPr>
-              <w:t xml:space="preserve">       </w:t>
-            </w:r>
-            <w:r>
-              <w:rPr>
-                <w:color w:val="000000" w:themeColor="text1"/>
-                <w:kern w:val="0"/>
-                <w:sz w:val="24"/>
-                <w:szCs w:val="24"/>
-                <w14:ligatures w14:val="none"/>
-              </w:rPr>
-              <w:t xml:space="preserve"> </w:t>
-            </w:r>
-            <w:proofErr w:type="gramStart"/>
-            <w:r>
-              <w:rPr>
-                <w:color w:val="000000" w:themeColor="text1"/>
-                <w:kern w:val="0"/>
-                <w:sz w:val="24"/>
-                <w:szCs w:val="24"/>
-                <w14:ligatures w14:val="none"/>
-              </w:rPr>
-              <w:t xml:space="preserve"> </w:t>
-            </w:r>
-            <w:r>
-              <w:rPr>
-                <w:color w:val="000000" w:themeColor="text1"/>
-                <w:kern w:val="0"/>
-                <w:sz w:val="24"/>
-                <w:szCs w:val="24"/>
-                <w14:ligatures w14:val="none"/>
-              </w:rPr>
-              <w:t xml:space="preserve"> </w:t>
-            </w:r>
-            <w:r>
-              <w:rPr>
-                <w:color w:val="000000" w:themeColor="text1"/>
-                <w:kern w:val="0"/>
-                <w:sz w:val="24"/>
-                <w:szCs w:val="24"/>
-                <w14:ligatures w14:val="none"/>
-              </w:rPr>
-              <w:t xml:space="preserve"> </w:t>
-            </w:r>
-            <w:r>
-              <w:rPr>
-                <w:color w:val="000000" w:themeColor="text1"/>
-                <w:kern w:val="0"/>
-                <w:sz w:val="24"/>
-                <w:szCs w:val="24"/>
-                <w14:ligatures w14:val="none"/>
-              </w:rPr>
-              <w:t>{</w:t>
-            </w:r>
-            <w:proofErr w:type="gramEnd"/>
-            <w:r>
-              <w:rPr>
-                <w:color w:val="000000" w:themeColor="text1"/>
-                <w:kern w:val="0"/>
-                <w:sz w:val="24"/>
-                <w:szCs w:val="24"/>
-                <w14:ligatures w14:val="none"/>
-              </w:rPr>
-              <w:t>{</w:t>
-            </w:r>
-            <w:proofErr w:type="spellStart"/>
-            <w:r>
-              <w:rPr>
-                <w:color w:val="000000" w:themeColor="text1"/>
-                <w:kern w:val="0"/>
-                <w:sz w:val="24"/>
-                <w:szCs w:val="24"/>
-                <w14:ligatures w14:val="none"/>
-              </w:rPr>
-              <w:t>TotalFeeAmount</w:t>
-            </w:r>
-            <w:proofErr w:type="spellEnd"/>
-            <w:r>
-              <w:rPr>
-                <w:color w:val="000000" w:themeColor="text1"/>
-                <w:kern w:val="0"/>
-                <w:sz w:val="24"/>
-                <w:szCs w:val="24"/>
-                <w14:ligatures w14:val="none"/>
-              </w:rPr>
-              <w:t>}}</w:t>
-            </w:r>
+                <w:kern w:val="0"/>
+                <w:sz w:val="24"/>
+                <w:szCs w:val="24"/>
+                <w14:ligatures w14:val="none"/>
+              </w:rPr>
+              <w:t>{{TotalFeeAmount}}</w:t>
+            </w:r>
+            <w:bookmarkEnd w:id="4"/>
           </w:p>
         </w:tc>
       </w:tr>
       <w:tr>
+        <w:trPr>
+          <w:trHeight w:val="168"/>
+        </w:trPr>
         <w:tc>
           <w:tcPr>
-            <w:tcW w:w="4677" w:type="dxa"/>
+            <w:tcW w:w="4721" w:type="dxa"/>
+            <w:hideMark/>
           </w:tcPr>
           <w:p>
             <w:pPr>
-              <w:tabs>
-                <w:tab w:val="left" w:pos="2880"/>
-              </w:tabs>
-              <w:rPr>
-                <w:noProof/>
-                <w:sz w:val="22"/>
+              <w:rPr>
+                <w:b/>
+                <w:bCs/>
+                <w:kern w:val="0"/>
+                <w:sz w:val="24"/>
+                <w:szCs w:val="24"/>
+                <w14:ligatures w14:val="none"/>
               </w:rPr>
             </w:pPr>
             <w:r>
@@ -1243,19 +1031,7 @@
                 <w:szCs w:val="24"/>
                 <w14:ligatures w14:val="none"/>
               </w:rPr>
-              <w:t xml:space="preserve">Payment </w:t>
-            </w:r>
-            <w:proofErr w:type="gramStart"/>
-            <w:r>
-              <w:rPr>
-                <w:b/>
-                <w:bCs/>
-                <w:kern w:val="0"/>
-                <w:sz w:val="24"/>
-                <w:szCs w:val="24"/>
-                <w14:ligatures w14:val="none"/>
-              </w:rPr>
-              <w:t>Date:</w:t>
+              <w:t xml:space="preserve">     Payment Date: </w:t>
             </w:r>
             <w:r>
               <w:rPr>
@@ -1265,9 +1041,15 @@
                 <w:szCs w:val="24"/>
                 <w14:ligatures w14:val="none"/>
               </w:rPr>
-              <w:t>{</w:t>
-            </w:r>
-            <w:proofErr w:type="gramEnd"/>
+              <w:t>{{</w:t>
+            </w:r>
+            <w:r>
+              <w:rPr>
+                <w:kern w:val="0"/>
+                <w14:ligatures w14:val="none"/>
+              </w:rPr>
+              <w:t>I</w:t>
+            </w:r>
             <w:r>
               <w:rPr>
                 <w:color w:val="000000" w:themeColor="text1"/>
@@ -1276,290 +1058,231 @@
                 <w:szCs w:val="24"/>
                 <w14:ligatures w14:val="none"/>
               </w:rPr>
-              <w:t>{</w:t>
-            </w:r>
-            <w:proofErr w:type="spellStart"/>
-            <w:r>
-              <w:rPr>
-                <w:kern w:val="0"/>
-                <w14:ligatures w14:val="none"/>
-              </w:rPr>
-              <w:t>I</w:t>
-            </w:r>
-            <w:r>
-              <w:rPr>
-                <w:color w:val="000000" w:themeColor="text1"/>
-                <w:kern w:val="0"/>
-                <w:sz w:val="24"/>
-                <w:szCs w:val="24"/>
-                <w14:ligatures w14:val="none"/>
-              </w:rPr>
-              <w:t>nvoicePaymentDate</w:t>
-            </w:r>
-            <w:proofErr w:type="spellEnd"/>
-            <w:r>
-              <w:rPr>
-                <w:color w:val="000000" w:themeColor="text1"/>
-                <w:kern w:val="0"/>
-                <w:sz w:val="24"/>
-                <w:szCs w:val="24"/>
-                <w14:ligatures w14:val="none"/>
-              </w:rPr>
-              <w:t>}}</w:t>
+              <w:t>nvoicePaymentDate}}</w:t>
             </w:r>
           </w:p>
         </w:tc>
         <w:tc>
           <w:tcPr>
-            <w:tcW w:w="1418" w:type="dxa"/>
+            <w:tcW w:w="3457" w:type="dxa"/>
+            <w:hideMark/>
           </w:tcPr>
           <w:p>
             <w:pPr>
-              <w:tabs>
-                <w:tab w:val="left" w:pos="2880"/>
-              </w:tabs>
-              <w:rPr>
-                <w:noProof/>
-                <w:sz w:val="22"/>
+              <w:jc w:val="center"/>
+              <w:rPr>
+                <w:b/>
+                <w:bCs/>
+                <w:kern w:val="0"/>
+                <w:sz w:val="24"/>
+                <w:szCs w:val="24"/>
+                <w14:ligatures w14:val="none"/>
               </w:rPr>
             </w:pPr>
+            <w:r>
+              <w:rPr>
+                <w:b/>
+                <w:bCs/>
+                <w:kern w:val="0"/>
+                <w:sz w:val="24"/>
+                <w:szCs w:val="24"/>
+                <w14:ligatures w14:val="none"/>
+              </w:rPr>
+              <w:t xml:space="preserve">             </w:t>
+            </w:r>
+            <w:r>
+              <w:rPr>
+                <w:b/>
+                <w:bCs/>
+                <w:kern w:val="0"/>
+                <w:sz w:val="24"/>
+                <w:szCs w:val="24"/>
+                <w14:ligatures w14:val="none"/>
+              </w:rPr>
+              <w:t xml:space="preserve"> </w:t>
+            </w:r>
+            <w:r>
+              <w:rPr>
+                <w:b/>
+                <w:bCs/>
+                <w:kern w:val="0"/>
+                <w:sz w:val="24"/>
+                <w:szCs w:val="24"/>
+                <w14:ligatures w14:val="none"/>
+              </w:rPr>
+              <w:t>Payment</w:t>
+            </w:r>
+            <w:r>
+              <w:rPr>
+                <w:b/>
+                <w:bCs/>
+                <w:kern w:val="0"/>
+                <w:sz w:val="24"/>
+                <w:szCs w:val="24"/>
+                <w14:ligatures w14:val="none"/>
+              </w:rPr>
+              <w:t xml:space="preserve"> R</w:t>
+            </w:r>
+            <w:r>
+              <w:rPr>
+                <w:b/>
+                <w:bCs/>
+                <w:kern w:val="0"/>
+                <w:sz w:val="24"/>
+                <w:szCs w:val="24"/>
+                <w14:ligatures w14:val="none"/>
+              </w:rPr>
+              <w:t>eceived:</w:t>
+            </w:r>
           </w:p>
         </w:tc>
         <w:tc>
           <w:tcPr>
-            <w:tcW w:w="4678" w:type="dxa"/>
+            <w:tcW w:w="2257" w:type="dxa"/>
+            <w:hideMark/>
           </w:tcPr>
           <w:p>
             <w:pPr>
-              <w:tabs>
-                <w:tab w:val="left" w:pos="2880"/>
-              </w:tabs>
-              <w:rPr>
-                <w:noProof/>
-                <w:sz w:val="22"/>
+              <w:jc w:val="right"/>
+              <w:rPr>
+                <w:color w:val="000000" w:themeColor="text1"/>
+                <w:kern w:val="0"/>
+                <w:sz w:val="24"/>
+                <w:szCs w:val="24"/>
+                <w14:ligatures w14:val="none"/>
               </w:rPr>
             </w:pPr>
             <w:r>
               <w:rPr>
-                <w:b/>
-                <w:bCs/>
-                <w:kern w:val="0"/>
-                <w:sz w:val="24"/>
-                <w:szCs w:val="24"/>
-                <w14:ligatures w14:val="none"/>
-              </w:rPr>
-              <w:t>Payment Received</w:t>
-            </w:r>
-            <w:proofErr w:type="gramStart"/>
-            <w:r>
-              <w:rPr>
-                <w:b/>
-                <w:bCs/>
-                <w:kern w:val="0"/>
-                <w:sz w:val="24"/>
-                <w:szCs w:val="24"/>
-                <w14:ligatures w14:val="none"/>
-              </w:rPr>
-              <w:t>:</w:t>
-            </w:r>
-            <w:r>
-              <w:rPr>
                 <w:color w:val="000000" w:themeColor="text1"/>
                 <w:kern w:val="0"/>
                 <w:sz w:val="24"/>
                 <w:szCs w:val="24"/>
                 <w14:ligatures w14:val="none"/>
               </w:rPr>
-              <w:t xml:space="preserve"> </w:t>
-            </w:r>
-            <w:r>
-              <w:rPr>
-                <w:color w:val="000000" w:themeColor="text1"/>
-                <w:kern w:val="0"/>
-                <w:sz w:val="24"/>
-                <w:szCs w:val="24"/>
-                <w14:ligatures w14:val="none"/>
-              </w:rPr>
-              <w:t xml:space="preserve"> </w:t>
-            </w:r>
-            <w:r>
-              <w:rPr>
-                <w:color w:val="000000" w:themeColor="text1"/>
-                <w:kern w:val="0"/>
-                <w:sz w:val="24"/>
-                <w:szCs w:val="24"/>
-                <w14:ligatures w14:val="none"/>
-              </w:rPr>
-              <w:t>{</w:t>
-            </w:r>
-            <w:proofErr w:type="gramEnd"/>
-            <w:r>
-              <w:rPr>
-                <w:color w:val="000000" w:themeColor="text1"/>
-                <w:kern w:val="0"/>
-                <w:sz w:val="24"/>
-                <w:szCs w:val="24"/>
-                <w14:ligatures w14:val="none"/>
-              </w:rPr>
-              <w:t>{</w:t>
-            </w:r>
-            <w:proofErr w:type="spellStart"/>
-            <w:r>
-              <w:rPr>
-                <w:color w:val="000000" w:themeColor="text1"/>
-                <w:kern w:val="0"/>
-                <w:sz w:val="24"/>
-                <w:szCs w:val="24"/>
-                <w14:ligatures w14:val="none"/>
-              </w:rPr>
-              <w:t>TotalFeeAmount</w:t>
-            </w:r>
-            <w:proofErr w:type="spellEnd"/>
-            <w:r>
-              <w:rPr>
-                <w:color w:val="000000" w:themeColor="text1"/>
-                <w:kern w:val="0"/>
-                <w:sz w:val="24"/>
-                <w:szCs w:val="24"/>
-                <w14:ligatures w14:val="none"/>
-              </w:rPr>
-              <w:t>}}</w:t>
+              <w:t>{{TotalFeeAmount}}</w:t>
             </w:r>
           </w:p>
         </w:tc>
       </w:tr>
       <w:tr>
+        <w:trPr>
+          <w:trHeight w:val="168"/>
+        </w:trPr>
         <w:tc>
           <w:tcPr>
-            <w:tcW w:w="4677" w:type="dxa"/>
+            <w:tcW w:w="4721" w:type="dxa"/>
+            <w:hideMark/>
           </w:tcPr>
           <w:p>
             <w:pPr>
-              <w:tabs>
-                <w:tab w:val="left" w:pos="2880"/>
-              </w:tabs>
-              <w:rPr>
-                <w:noProof/>
-                <w:sz w:val="22"/>
+              <w:rPr>
+                <w:b/>
+                <w:bCs/>
+                <w:color w:val="000000" w:themeColor="text1"/>
+                <w:kern w:val="0"/>
+                <w:sz w:val="24"/>
+                <w:szCs w:val="24"/>
+                <w14:ligatures w14:val="none"/>
               </w:rPr>
             </w:pPr>
+            <w:r>
+              <w:rPr>
+                <w:b/>
+                <w:bCs/>
+                <w:kern w:val="0"/>
+                <w:sz w:val="24"/>
+                <w:szCs w:val="24"/>
+                <w14:ligatures w14:val="none"/>
+              </w:rPr>
+              <w:t xml:space="preserve">     </w:t>
+            </w:r>
           </w:p>
         </w:tc>
         <w:tc>
           <w:tcPr>
-            <w:tcW w:w="1418" w:type="dxa"/>
+            <w:tcW w:w="3457" w:type="dxa"/>
+            <w:hideMark/>
           </w:tcPr>
           <w:p>
             <w:pPr>
-              <w:tabs>
-                <w:tab w:val="left" w:pos="2880"/>
-              </w:tabs>
-              <w:rPr>
-                <w:noProof/>
-                <w:sz w:val="22"/>
+              <w:rPr>
+                <w:b/>
+                <w:bCs/>
+                <w:color w:val="000000" w:themeColor="text1"/>
+                <w:kern w:val="0"/>
+                <w:sz w:val="24"/>
+                <w:szCs w:val="24"/>
+                <w14:ligatures w14:val="none"/>
               </w:rPr>
             </w:pPr>
+            <w:r>
+              <w:rPr>
+                <w:b/>
+                <w:bCs/>
+                <w:kern w:val="0"/>
+                <w:sz w:val="24"/>
+                <w:szCs w:val="24"/>
+                <w14:ligatures w14:val="none"/>
+              </w:rPr>
+              <w:t xml:space="preserve">              </w:t>
+            </w:r>
+            <w:r>
+              <w:rPr>
+                <w:b/>
+                <w:bCs/>
+                <w:kern w:val="0"/>
+                <w:sz w:val="24"/>
+                <w:szCs w:val="24"/>
+                <w14:ligatures w14:val="none"/>
+              </w:rPr>
+              <w:t xml:space="preserve"> </w:t>
+            </w:r>
+            <w:r>
+              <w:rPr>
+                <w:b/>
+                <w:bCs/>
+                <w:kern w:val="0"/>
+                <w:sz w:val="24"/>
+                <w:szCs w:val="24"/>
+                <w14:ligatures w14:val="none"/>
+              </w:rPr>
+              <w:t>Balance due:</w:t>
+            </w:r>
           </w:p>
         </w:tc>
         <w:tc>
           <w:tcPr>
-            <w:tcW w:w="4678" w:type="dxa"/>
+            <w:tcW w:w="2257" w:type="dxa"/>
+            <w:hideMark/>
           </w:tcPr>
           <w:p>
             <w:pPr>
-              <w:tabs>
-                <w:tab w:val="left" w:pos="2880"/>
-              </w:tabs>
-              <w:rPr>
-                <w:noProof/>
-                <w:sz w:val="22"/>
+              <w:jc w:val="right"/>
+              <w:rPr>
+                <w:b/>
+                <w:bCs/>
+                <w:color w:val="000000" w:themeColor="text1"/>
+                <w:kern w:val="0"/>
+                <w:sz w:val="24"/>
+                <w:szCs w:val="24"/>
+                <w14:ligatures w14:val="none"/>
               </w:rPr>
             </w:pPr>
             <w:r>
               <w:rPr>
-                <w:b/>
-                <w:bCs/>
-                <w:kern w:val="0"/>
-                <w:sz w:val="24"/>
-                <w:szCs w:val="24"/>
-                <w14:ligatures w14:val="none"/>
-              </w:rPr>
-              <w:t>Balance due:</w:t>
-            </w:r>
-            <w:r>
-              <w:rPr>
                 <w:color w:val="000000" w:themeColor="text1"/>
                 <w:kern w:val="0"/>
                 <w:sz w:val="24"/>
                 <w:szCs w:val="24"/>
                 <w14:ligatures w14:val="none"/>
               </w:rPr>
-              <w:t xml:space="preserve"> </w:t>
-            </w:r>
-            <w:r>
-              <w:rPr>
-                <w:color w:val="000000" w:themeColor="text1"/>
-                <w:kern w:val="0"/>
-                <w:sz w:val="24"/>
-                <w:szCs w:val="24"/>
-                <w14:ligatures w14:val="none"/>
-              </w:rPr>
-              <w:t xml:space="preserve"> </w:t>
-            </w:r>
-            <w:r>
-              <w:rPr>
-                <w:color w:val="000000" w:themeColor="text1"/>
-                <w:kern w:val="0"/>
-                <w:sz w:val="24"/>
-                <w:szCs w:val="24"/>
-                <w14:ligatures w14:val="none"/>
-              </w:rPr>
-              <w:t xml:space="preserve">         </w:t>
-            </w:r>
-            <w:r>
-              <w:rPr>
-                <w:color w:val="000000" w:themeColor="text1"/>
-                <w:kern w:val="0"/>
-                <w:sz w:val="24"/>
-                <w:szCs w:val="24"/>
-                <w14:ligatures w14:val="none"/>
-              </w:rPr>
-              <w:t xml:space="preserve">   </w:t>
-            </w:r>
-            <w:r>
-              <w:rPr>
-                <w:color w:val="000000" w:themeColor="text1"/>
-                <w:kern w:val="0"/>
-                <w:sz w:val="24"/>
-                <w:szCs w:val="24"/>
-                <w14:ligatures w14:val="none"/>
-              </w:rPr>
-              <w:t xml:space="preserve">  </w:t>
-            </w:r>
-            <w:r>
-              <w:rPr>
-                <w:color w:val="000000" w:themeColor="text1"/>
-                <w:kern w:val="0"/>
-                <w:sz w:val="24"/>
-                <w:szCs w:val="24"/>
-                <w14:ligatures w14:val="none"/>
-              </w:rPr>
-              <w:t xml:space="preserve"> </w:t>
-            </w:r>
-            <w:r>
-              <w:rPr>
-                <w:color w:val="000000" w:themeColor="text1"/>
-                <w:kern w:val="0"/>
-                <w:sz w:val="24"/>
-                <w:szCs w:val="24"/>
-                <w14:ligatures w14:val="none"/>
-              </w:rPr>
-              <w:t>$0.00</w:t>
+              <w:t xml:space="preserve">  $0.00</w:t>
             </w:r>
           </w:p>
         </w:tc>
+        <w:bookmarkEnd w:id="3"/>
       </w:tr>
-      <w:bookmarkEnd w:id="3"/>
     </w:tbl>
     <w:p>
       <w:pPr>
@@ -1612,6 +1335,16 @@
 <w:ftr xmlns:wpc="http://schemas.microsoft.com/office/word/2010/wordprocessingCanvas" xmlns:cx="http://schemas.microsoft.com/office/drawing/2014/chartex" xmlns:cx1="http://schemas.microsoft.com/office/drawing/2015/9/8/chartex" xmlns:cx2="http://schemas.microsoft.com/office/drawing/2015/10/21/chartex" xmlns:cx3="http://schemas.microsoft.com/office/drawing/2016/5/9/chartex" xmlns:cx4="http://schemas.microsoft.com/office/drawing/2016/5/10/chartex" xmlns:cx5="http://schemas.microsoft.com/office/drawing/2016/5/11/chartex" xmlns:cx6="http://schemas.microsoft.com/office/drawing/2016/5/12/chartex" xmlns:cx7="http://schemas.microsoft.com/office/drawing/2016/5/13/chartex" xmlns:cx8="http://schemas.microsoft.com/office/drawing/2016/5/14/chartex" xmlns:mc="http://schemas.openxmlformats.org/markup-compatibility/2006" xmlns:aink="http://schemas.microsoft.com/office/drawing/2016/ink" xmlns:am3d="http://schemas.microsoft.com/office/drawing/2017/model3d" xmlns:o="urn:schemas-microsoft-com:office:office" xmlns:oel="http://schemas.microsoft.com/office/2019/extlst" xmlns:r="http://schemas.openxmlformats.org/officeDocument/2006/relationships" xmlns:m="http://schemas.openxmlformats.org/officeDocument/2006/math" xmlns:v="urn:schemas-microsoft-com:vml" xmlns:wp14="http://schemas.microsoft.com/office/word/2010/wordprocessingDrawing" xmlns:wp="http://schemas.openxmlformats.org/drawingml/2006/wordprocessingDrawing" xmlns:w10="urn:schemas-microsoft-com:office:word" xmlns:w="http://schemas.openxmlformats.org/wordprocessingml/2006/main" xmlns:w14="http://schemas.microsoft.com/office/word/2010/wordml" xmlns:w15="http://schemas.microsoft.com/office/word/2012/wordml" xmlns:w16cex="http://schemas.microsoft.com/office/word/2018/wordml/cex" xmlns:w16cid="http://schemas.microsoft.com/office/word/2016/wordml/cid" xmlns:w16="http://schemas.microsoft.com/office/word/2018/wordml" xmlns:w16du="http://schemas.microsoft.com/office/word/2023/wordml/word16du" xmlns:w16sdtdh="http://schemas.microsoft.com/office/word/2020/wordml/sdtdatahash" xmlns:w16sdtfl="http://schemas.microsoft.com/office/word/2024/wordml/sdtformatlock" xmlns:w16se="http://schemas.microsoft.com/office/word/2015/wordml/symex" xmlns:wpg="http://schemas.microsoft.com/office/word/2010/wordprocessingGroup" xmlns:wpi="http://schemas.microsoft.com/office/word/2010/wordprocessingInk" xmlns:wne="http://schemas.microsoft.com/office/word/2006/wordml" xmlns:wps="http://schemas.microsoft.com/office/word/2010/wordprocessingShape" mc:Ignorable="w14 w15 w16se w16cid w16 w16cex w16sdtdh w16sdtfl w16du wp14">
   <w:p>
     <w:pPr>
+      <w:pStyle w:val="Footer"/>
+    </w:pPr>
+  </w:p>
+</w:ftr>
+</file>
+
+<file path=word/footer2.xml><?xml version="1.0" encoding="utf-8"?>
+<w:ftr xmlns:wpc="http://schemas.microsoft.com/office/word/2010/wordprocessingCanvas" xmlns:cx="http://schemas.microsoft.com/office/drawing/2014/chartex" xmlns:cx1="http://schemas.microsoft.com/office/drawing/2015/9/8/chartex" xmlns:cx2="http://schemas.microsoft.com/office/drawing/2015/10/21/chartex" xmlns:cx3="http://schemas.microsoft.com/office/drawing/2016/5/9/chartex" xmlns:cx4="http://schemas.microsoft.com/office/drawing/2016/5/10/chartex" xmlns:cx5="http://schemas.microsoft.com/office/drawing/2016/5/11/chartex" xmlns:cx6="http://schemas.microsoft.com/office/drawing/2016/5/12/chartex" xmlns:cx7="http://schemas.microsoft.com/office/drawing/2016/5/13/chartex" xmlns:cx8="http://schemas.microsoft.com/office/drawing/2016/5/14/chartex" xmlns:mc="http://schemas.openxmlformats.org/markup-compatibility/2006" xmlns:aink="http://schemas.microsoft.com/office/drawing/2016/ink" xmlns:am3d="http://schemas.microsoft.com/office/drawing/2017/model3d" xmlns:o="urn:schemas-microsoft-com:office:office" xmlns:oel="http://schemas.microsoft.com/office/2019/extlst" xmlns:r="http://schemas.openxmlformats.org/officeDocument/2006/relationships" xmlns:m="http://schemas.openxmlformats.org/officeDocument/2006/math" xmlns:v="urn:schemas-microsoft-com:vml" xmlns:wp14="http://schemas.microsoft.com/office/word/2010/wordprocessingDrawing" xmlns:wp="http://schemas.openxmlformats.org/drawingml/2006/wordprocessingDrawing" xmlns:w10="urn:schemas-microsoft-com:office:word" xmlns:w="http://schemas.openxmlformats.org/wordprocessingml/2006/main" xmlns:w14="http://schemas.microsoft.com/office/word/2010/wordml" xmlns:w15="http://schemas.microsoft.com/office/word/2012/wordml" xmlns:w16cex="http://schemas.microsoft.com/office/word/2018/wordml/cex" xmlns:w16cid="http://schemas.microsoft.com/office/word/2016/wordml/cid" xmlns:w16="http://schemas.microsoft.com/office/word/2018/wordml" xmlns:w16du="http://schemas.microsoft.com/office/word/2023/wordml/word16du" xmlns:w16sdtdh="http://schemas.microsoft.com/office/word/2020/wordml/sdtdatahash" xmlns:w16sdtfl="http://schemas.microsoft.com/office/word/2024/wordml/sdtformatlock" xmlns:w16se="http://schemas.microsoft.com/office/word/2015/wordml/symex" xmlns:wpg="http://schemas.microsoft.com/office/word/2010/wordprocessingGroup" xmlns:wpi="http://schemas.microsoft.com/office/word/2010/wordprocessingInk" xmlns:wne="http://schemas.microsoft.com/office/word/2006/wordml" xmlns:wps="http://schemas.microsoft.com/office/word/2010/wordprocessingShape" mc:Ignorable="w14 w15 w16se w16cid w16 w16cex w16sdtdh w16sdtfl w16du wp14">
+  <w:p>
+    <w:pPr>
       <w:jc w:val="right"/>
       <w:rPr>
         <w:noProof/>
@@ -1716,6 +1449,16 @@
       </w:rPr>
       <w:t xml:space="preserve"> (250) 953-0496</w:t>
     </w:r>
+  </w:p>
+</w:ftr>
+</file>
+
+<file path=word/footer3.xml><?xml version="1.0" encoding="utf-8"?>
+<w:ftr xmlns:wpc="http://schemas.microsoft.com/office/word/2010/wordprocessingCanvas" xmlns:cx="http://schemas.microsoft.com/office/drawing/2014/chartex" xmlns:cx1="http://schemas.microsoft.com/office/drawing/2015/9/8/chartex" xmlns:cx2="http://schemas.microsoft.com/office/drawing/2015/10/21/chartex" xmlns:cx3="http://schemas.microsoft.com/office/drawing/2016/5/9/chartex" xmlns:cx4="http://schemas.microsoft.com/office/drawing/2016/5/10/chartex" xmlns:cx5="http://schemas.microsoft.com/office/drawing/2016/5/11/chartex" xmlns:cx6="http://schemas.microsoft.com/office/drawing/2016/5/12/chartex" xmlns:cx7="http://schemas.microsoft.com/office/drawing/2016/5/13/chartex" xmlns:cx8="http://schemas.microsoft.com/office/drawing/2016/5/14/chartex" xmlns:mc="http://schemas.openxmlformats.org/markup-compatibility/2006" xmlns:aink="http://schemas.microsoft.com/office/drawing/2016/ink" xmlns:am3d="http://schemas.microsoft.com/office/drawing/2017/model3d" xmlns:o="urn:schemas-microsoft-com:office:office" xmlns:oel="http://schemas.microsoft.com/office/2019/extlst" xmlns:r="http://schemas.openxmlformats.org/officeDocument/2006/relationships" xmlns:m="http://schemas.openxmlformats.org/officeDocument/2006/math" xmlns:v="urn:schemas-microsoft-com:vml" xmlns:wp14="http://schemas.microsoft.com/office/word/2010/wordprocessingDrawing" xmlns:wp="http://schemas.openxmlformats.org/drawingml/2006/wordprocessingDrawing" xmlns:w10="urn:schemas-microsoft-com:office:word" xmlns:w="http://schemas.openxmlformats.org/wordprocessingml/2006/main" xmlns:w14="http://schemas.microsoft.com/office/word/2010/wordml" xmlns:w15="http://schemas.microsoft.com/office/word/2012/wordml" xmlns:w16cex="http://schemas.microsoft.com/office/word/2018/wordml/cex" xmlns:w16cid="http://schemas.microsoft.com/office/word/2016/wordml/cid" xmlns:w16="http://schemas.microsoft.com/office/word/2018/wordml" xmlns:w16du="http://schemas.microsoft.com/office/word/2023/wordml/word16du" xmlns:w16sdtdh="http://schemas.microsoft.com/office/word/2020/wordml/sdtdatahash" xmlns:w16sdtfl="http://schemas.microsoft.com/office/word/2024/wordml/sdtformatlock" xmlns:w16se="http://schemas.microsoft.com/office/word/2015/wordml/symex" xmlns:wpg="http://schemas.microsoft.com/office/word/2010/wordprocessingGroup" xmlns:wpi="http://schemas.microsoft.com/office/word/2010/wordprocessingInk" xmlns:wne="http://schemas.microsoft.com/office/word/2006/wordml" xmlns:wps="http://schemas.microsoft.com/office/word/2010/wordprocessingShape" mc:Ignorable="w14 w15 w16se w16cid w16 w16cex w16sdtdh w16sdtfl w16du wp14">
+  <w:p>
+    <w:pPr>
+      <w:pStyle w:val="Footer"/>
+    </w:pPr>
   </w:p>
 </w:ftr>
 </file>
@@ -1746,6 +1489,16 @@
 </file>
 
 <file path=word/header1.xml><?xml version="1.0" encoding="utf-8"?>
+<w:hdr xmlns:wpc="http://schemas.microsoft.com/office/word/2010/wordprocessingCanvas" xmlns:cx="http://schemas.microsoft.com/office/drawing/2014/chartex" xmlns:cx1="http://schemas.microsoft.com/office/drawing/2015/9/8/chartex" xmlns:cx2="http://schemas.microsoft.com/office/drawing/2015/10/21/chartex" xmlns:cx3="http://schemas.microsoft.com/office/drawing/2016/5/9/chartex" xmlns:cx4="http://schemas.microsoft.com/office/drawing/2016/5/10/chartex" xmlns:cx5="http://schemas.microsoft.com/office/drawing/2016/5/11/chartex" xmlns:cx6="http://schemas.microsoft.com/office/drawing/2016/5/12/chartex" xmlns:cx7="http://schemas.microsoft.com/office/drawing/2016/5/13/chartex" xmlns:cx8="http://schemas.microsoft.com/office/drawing/2016/5/14/chartex" xmlns:mc="http://schemas.openxmlformats.org/markup-compatibility/2006" xmlns:aink="http://schemas.microsoft.com/office/drawing/2016/ink" xmlns:am3d="http://schemas.microsoft.com/office/drawing/2017/model3d" xmlns:o="urn:schemas-microsoft-com:office:office" xmlns:oel="http://schemas.microsoft.com/office/2019/extlst" xmlns:r="http://schemas.openxmlformats.org/officeDocument/2006/relationships" xmlns:m="http://schemas.openxmlformats.org/officeDocument/2006/math" xmlns:v="urn:schemas-microsoft-com:vml" xmlns:wp14="http://schemas.microsoft.com/office/word/2010/wordprocessingDrawing" xmlns:wp="http://schemas.openxmlformats.org/drawingml/2006/wordprocessingDrawing" xmlns:w10="urn:schemas-microsoft-com:office:word" xmlns:w="http://schemas.openxmlformats.org/wordprocessingml/2006/main" xmlns:w14="http://schemas.microsoft.com/office/word/2010/wordml" xmlns:w15="http://schemas.microsoft.com/office/word/2012/wordml" xmlns:w16cex="http://schemas.microsoft.com/office/word/2018/wordml/cex" xmlns:w16cid="http://schemas.microsoft.com/office/word/2016/wordml/cid" xmlns:w16="http://schemas.microsoft.com/office/word/2018/wordml" xmlns:w16du="http://schemas.microsoft.com/office/word/2023/wordml/word16du" xmlns:w16sdtdh="http://schemas.microsoft.com/office/word/2020/wordml/sdtdatahash" xmlns:w16sdtfl="http://schemas.microsoft.com/office/word/2024/wordml/sdtformatlock" xmlns:w16se="http://schemas.microsoft.com/office/word/2015/wordml/symex" xmlns:wpg="http://schemas.microsoft.com/office/word/2010/wordprocessingGroup" xmlns:wpi="http://schemas.microsoft.com/office/word/2010/wordprocessingInk" xmlns:wne="http://schemas.microsoft.com/office/word/2006/wordml" xmlns:wps="http://schemas.microsoft.com/office/word/2010/wordprocessingShape" mc:Ignorable="w14 w15 w16se w16cid w16 w16cex w16sdtdh w16sdtfl w16du wp14">
+  <w:p>
+    <w:pPr>
+      <w:pStyle w:val="Header"/>
+    </w:pPr>
+  </w:p>
+</w:hdr>
+</file>
+
+<file path=word/header2.xml><?xml version="1.0" encoding="utf-8"?>
 <w:hdr xmlns:wpc="http://schemas.microsoft.com/office/word/2010/wordprocessingCanvas" xmlns:cx="http://schemas.microsoft.com/office/drawing/2014/chartex" xmlns:cx1="http://schemas.microsoft.com/office/drawing/2015/9/8/chartex" xmlns:cx2="http://schemas.microsoft.com/office/drawing/2015/10/21/chartex" xmlns:cx3="http://schemas.microsoft.com/office/drawing/2016/5/9/chartex" xmlns:cx4="http://schemas.microsoft.com/office/drawing/2016/5/10/chartex" xmlns:cx5="http://schemas.microsoft.com/office/drawing/2016/5/11/chartex" xmlns:cx6="http://schemas.microsoft.com/office/drawing/2016/5/12/chartex" xmlns:cx7="http://schemas.microsoft.com/office/drawing/2016/5/13/chartex" xmlns:cx8="http://schemas.microsoft.com/office/drawing/2016/5/14/chartex" xmlns:mc="http://schemas.openxmlformats.org/markup-compatibility/2006" xmlns:aink="http://schemas.microsoft.com/office/drawing/2016/ink" xmlns:am3d="http://schemas.microsoft.com/office/drawing/2017/model3d" xmlns:o="urn:schemas-microsoft-com:office:office" xmlns:oel="http://schemas.microsoft.com/office/2019/extlst" xmlns:r="http://schemas.openxmlformats.org/officeDocument/2006/relationships" xmlns:m="http://schemas.openxmlformats.org/officeDocument/2006/math" xmlns:v="urn:schemas-microsoft-com:vml" xmlns:wp14="http://schemas.microsoft.com/office/word/2010/wordprocessingDrawing" xmlns:wp="http://schemas.openxmlformats.org/drawingml/2006/wordprocessingDrawing" xmlns:w10="urn:schemas-microsoft-com:office:word" xmlns:w="http://schemas.openxmlformats.org/wordprocessingml/2006/main" xmlns:w14="http://schemas.microsoft.com/office/word/2010/wordml" xmlns:w15="http://schemas.microsoft.com/office/word/2012/wordml" xmlns:w16cex="http://schemas.microsoft.com/office/word/2018/wordml/cex" xmlns:w16cid="http://schemas.microsoft.com/office/word/2016/wordml/cid" xmlns:w16="http://schemas.microsoft.com/office/word/2018/wordml" xmlns:w16du="http://schemas.microsoft.com/office/word/2023/wordml/word16du" xmlns:w16sdtdh="http://schemas.microsoft.com/office/word/2020/wordml/sdtdatahash" xmlns:w16sdtfl="http://schemas.microsoft.com/office/word/2024/wordml/sdtformatlock" xmlns:w16se="http://schemas.microsoft.com/office/word/2015/wordml/symex" xmlns:wpg="http://schemas.microsoft.com/office/word/2010/wordprocessingGroup" xmlns:wpi="http://schemas.microsoft.com/office/word/2010/wordprocessingInk" xmlns:wne="http://schemas.microsoft.com/office/word/2006/wordml" xmlns:wps="http://schemas.microsoft.com/office/word/2010/wordprocessingShape" mc:Ignorable="w14 w15 w16se w16cid w16 w16cex w16sdtdh w16sdtfl w16du wp14">
   <w:p>
     <w:pPr>
@@ -1870,7 +1623,6 @@
       </w:rPr>
       <w:tab/>
     </w:r>
-    <w:bookmarkStart w:id="0" w:name="OLE_LINK2"/>
     <w:r>
       <w:rPr>
         <w:b/>
@@ -1878,8 +1630,18 @@
         <w:noProof/>
         <w:sz w:val="22"/>
       </w:rPr>
-      <w:t xml:space="preserve">     </w:t>
-    </w:r>
+      <w:tab/>
+    </w:r>
+    <w:r>
+      <w:rPr>
+        <w:b/>
+        <w:bCs/>
+        <w:noProof/>
+        <w:sz w:val="22"/>
+      </w:rPr>
+      <w:t xml:space="preserve">        </w:t>
+    </w:r>
+    <w:bookmarkStart w:id="0" w:name="OLE_LINK2"/>
     <w:r>
       <w:rPr>
         <w:b/>
@@ -1896,7 +1658,16 @@
         <w:sz w:val="30"/>
         <w:szCs w:val="32"/>
       </w:rPr>
-      <w:t xml:space="preserve">#: </w:t>
+      <w:t>#:</w:t>
+    </w:r>
+    <w:r>
+      <w:rPr>
+        <w:b/>
+        <w:bCs/>
+        <w:sz w:val="30"/>
+        <w:szCs w:val="32"/>
+      </w:rPr>
+      <w:t xml:space="preserve"> </w:t>
     </w:r>
     <w:bookmarkEnd w:id="0"/>
     <w:r>
@@ -1906,27 +1677,7 @@
         <w:sz w:val="30"/>
         <w:szCs w:val="30"/>
       </w:rPr>
-      <w:t>{{</w:t>
-    </w:r>
-    <w:proofErr w:type="spellStart"/>
-    <w:r>
-      <w:rPr>
-        <w:b/>
-        <w:bCs/>
-        <w:sz w:val="30"/>
-        <w:szCs w:val="30"/>
-      </w:rPr>
-      <w:t>InvoiceId</w:t>
-    </w:r>
-    <w:proofErr w:type="spellEnd"/>
-    <w:r>
-      <w:rPr>
-        <w:b/>
-        <w:bCs/>
-        <w:sz w:val="30"/>
-        <w:szCs w:val="30"/>
-      </w:rPr>
-      <w:t>}}</w:t>
+      <w:t>{{InvoiceId}}</w:t>
     </w:r>
     <w:r>
       <w:rPr>
@@ -1954,7 +1705,43 @@
         <w:noProof/>
         <w:sz w:val="22"/>
       </w:rPr>
-      <w:t xml:space="preserve">                          </w:t>
+      <w:t xml:space="preserve"> </w:t>
+    </w:r>
+    <w:r>
+      <w:rPr>
+        <w:i/>
+        <w:iCs/>
+        <w:noProof/>
+        <w:sz w:val="22"/>
+      </w:rPr>
+      <w:t xml:space="preserve">                                             </w:t>
+    </w:r>
+    <w:r>
+      <w:rPr>
+        <w:i/>
+        <w:iCs/>
+        <w:noProof/>
+        <w:sz w:val="22"/>
+      </w:rPr>
+      <w:t xml:space="preserve">  </w:t>
+    </w:r>
+    <w:r>
+      <w:rPr>
+        <w:i/>
+        <w:iCs/>
+        <w:noProof/>
+        <w:sz w:val="22"/>
+      </w:rPr>
+      <w:t xml:space="preserve">   </w:t>
+    </w:r>
+    <w:r>
+      <w:rPr>
+        <w:i/>
+        <w:iCs/>
+        <w:noProof/>
+        <w:sz w:val="22"/>
+      </w:rPr>
+      <w:t xml:space="preserve">  </w:t>
     </w:r>
     <w:r>
       <w:rPr>
@@ -1983,25 +1770,7 @@
         <w:szCs w:val="20"/>
         <w14:ligatures w14:val="none"/>
       </w:rPr>
-      <w:t>{{</w:t>
-    </w:r>
-    <w:proofErr w:type="spellStart"/>
-    <w:r>
-      <w:rPr>
-        <w:kern w:val="0"/>
-        <w:szCs w:val="20"/>
-        <w14:ligatures w14:val="none"/>
-      </w:rPr>
-      <w:t>InvoiceCreatedDate</w:t>
-    </w:r>
-    <w:proofErr w:type="spellEnd"/>
-    <w:r>
-      <w:rPr>
-        <w:kern w:val="0"/>
-        <w:szCs w:val="20"/>
-        <w14:ligatures w14:val="none"/>
-      </w:rPr>
-      <w:t>}}</w:t>
+      <w:t>{{InvoiceCreatedDate}}</w:t>
     </w:r>
     <w:r>
       <w:rPr>
@@ -2065,6 +1834,16 @@
         <w:noProof/>
         <w:sz w:val="22"/>
       </w:rPr>
+    </w:pPr>
+  </w:p>
+</w:hdr>
+</file>
+
+<file path=word/header3.xml><?xml version="1.0" encoding="utf-8"?>
+<w:hdr xmlns:wpc="http://schemas.microsoft.com/office/word/2010/wordprocessingCanvas" xmlns:cx="http://schemas.microsoft.com/office/drawing/2014/chartex" xmlns:cx1="http://schemas.microsoft.com/office/drawing/2015/9/8/chartex" xmlns:cx2="http://schemas.microsoft.com/office/drawing/2015/10/21/chartex" xmlns:cx3="http://schemas.microsoft.com/office/drawing/2016/5/9/chartex" xmlns:cx4="http://schemas.microsoft.com/office/drawing/2016/5/10/chartex" xmlns:cx5="http://schemas.microsoft.com/office/drawing/2016/5/11/chartex" xmlns:cx6="http://schemas.microsoft.com/office/drawing/2016/5/12/chartex" xmlns:cx7="http://schemas.microsoft.com/office/drawing/2016/5/13/chartex" xmlns:cx8="http://schemas.microsoft.com/office/drawing/2016/5/14/chartex" xmlns:mc="http://schemas.openxmlformats.org/markup-compatibility/2006" xmlns:aink="http://schemas.microsoft.com/office/drawing/2016/ink" xmlns:am3d="http://schemas.microsoft.com/office/drawing/2017/model3d" xmlns:o="urn:schemas-microsoft-com:office:office" xmlns:oel="http://schemas.microsoft.com/office/2019/extlst" xmlns:r="http://schemas.openxmlformats.org/officeDocument/2006/relationships" xmlns:m="http://schemas.openxmlformats.org/officeDocument/2006/math" xmlns:v="urn:schemas-microsoft-com:vml" xmlns:wp14="http://schemas.microsoft.com/office/word/2010/wordprocessingDrawing" xmlns:wp="http://schemas.openxmlformats.org/drawingml/2006/wordprocessingDrawing" xmlns:w10="urn:schemas-microsoft-com:office:word" xmlns:w="http://schemas.openxmlformats.org/wordprocessingml/2006/main" xmlns:w14="http://schemas.microsoft.com/office/word/2010/wordml" xmlns:w15="http://schemas.microsoft.com/office/word/2012/wordml" xmlns:w16cex="http://schemas.microsoft.com/office/word/2018/wordml/cex" xmlns:w16cid="http://schemas.microsoft.com/office/word/2016/wordml/cid" xmlns:w16="http://schemas.microsoft.com/office/word/2018/wordml" xmlns:w16du="http://schemas.microsoft.com/office/word/2023/wordml/word16du" xmlns:w16sdtdh="http://schemas.microsoft.com/office/word/2020/wordml/sdtdatahash" xmlns:w16sdtfl="http://schemas.microsoft.com/office/word/2024/wordml/sdtformatlock" xmlns:w16se="http://schemas.microsoft.com/office/word/2015/wordml/symex" xmlns:wpg="http://schemas.microsoft.com/office/word/2010/wordprocessingGroup" xmlns:wpi="http://schemas.microsoft.com/office/word/2010/wordprocessingInk" xmlns:wne="http://schemas.microsoft.com/office/word/2006/wordml" xmlns:wps="http://schemas.microsoft.com/office/word/2010/wordprocessingShape" mc:Ignorable="w14 w15 w16se w16cid w16 w16cex w16sdtdh w16sdtfl w16du wp14">
+  <w:p>
+    <w:pPr>
+      <w:pStyle w:val="Header"/>
     </w:pPr>
   </w:p>
 </w:hdr>

</xml_diff>